<commit_message>
UD3: 4 diagramas Excalidraw (máscara, subnetting, ARP, transición) + regenerar 3 SVGs rotos; boletines Packet Tracer U02/U03 con sidebar; UD3 amplía con 17-ipv8 y 18-cierre; DOCX/EPUB actualizados; planaseguir.txt
</commit_message>
<xml_diff>
--- a/docx/01-introduccion/boletin-U01-avanzado-resuelto.docx
+++ b/docx/01-introduccion/boletin-U01-avanzado-resuelto.docx
@@ -15,6 +15,9 @@
             <w:pStyle w:val="TOCHeading"/>
           </w:pPr>
           <w:r>
+            <w:rPr>
+              <w:lang w:val="es-ES"/>
+            </w:rPr>
             <w:t xml:space="preserve">Table of Contents</w:t>
           </w:r>
         </w:p>
@@ -34,6 +37,9 @@
         <w:pStyle w:val="Heading1"/>
       </w:pPr>
       <w:r>
+        <w:rPr>
+          <w:lang w:val="es-ES"/>
+        </w:rPr>
         <w:t xml:space="preserve">Boletín UD1 — Avanzado (Resuelto)</w:t>
       </w:r>
     </w:p>
@@ -44,6 +50,9 @@
         <w:pStyle w:val="Heading1"/>
       </w:pPr>
       <w:r>
+        <w:rPr>
+          <w:lang w:val="es-ES"/>
+        </w:rPr>
         <w:t xml:space="preserve">💪 Boletín UD1 — Avanzado (Resuelto)</w:t>
       </w:r>
     </w:p>
@@ -60,12 +69,21 @@
         <w:pStyle w:val="Heading2"/>
       </w:pPr>
       <w:r>
+        <w:rPr>
+          <w:lang w:val="es-ES"/>
+        </w:rPr>
         <w:t xml:space="preserve">1. Diagnóstico completo:</w:t>
       </w:r>
       <w:r>
-        <w:t xml:space="preserve"> </w:t>
-      </w:r>
-      <w:r>
+        <w:rPr>
+          <w:lang w:val="es-ES"/>
+        </w:rPr>
+        <w:t xml:space="preserve"> </w:t>
+      </w:r>
+      <w:r>
+        <w:rPr>
+          <w:lang w:val="es-ES"/>
+        </w:rPr>
         <w:t xml:space="preserve">“No tengo Internet”</w:t>
       </w:r>
     </w:p>
@@ -74,6 +92,9 @@
         <w:pStyle w:val="FirstParagraph"/>
       </w:pPr>
       <w:r>
+        <w:rPr>
+          <w:lang w:val="es-ES"/>
+        </w:rPr>
         <w:t xml:space="preserve">Pasos en orden, de lo más físico a lo más lógico:</w:t>
       </w:r>
     </w:p>
@@ -89,13 +110,20 @@
         <w:rPr>
           <w:b/>
           <w:bCs/>
+          <w:lang w:val="es-ES"/>
         </w:rPr>
         <w:t xml:space="preserve">Peldaño 0 — Luces:</w:t>
       </w:r>
       <w:r>
-        <w:t xml:space="preserve"> </w:t>
-      </w:r>
-      <w:r>
+        <w:rPr>
+          <w:lang w:val="es-ES"/>
+        </w:rPr>
+        <w:t xml:space="preserve"> </w:t>
+      </w:r>
+      <w:r>
+        <w:rPr>
+          <w:lang w:val="es-ES"/>
+        </w:rPr>
         <w:t xml:space="preserve">miro si la lucecita del puerto de red del PC y del switch están encendidas. Si alguna está apagada → problema físico (cable suelto o puerto apagado).</w:t>
       </w:r>
     </w:p>
@@ -111,19 +139,27 @@
         <w:rPr>
           <w:b/>
           <w:bCs/>
+          <w:lang w:val="es-ES"/>
         </w:rPr>
         <w:t xml:space="preserve">Peldaño 1 — Loopback:</w:t>
       </w:r>
       <w:r>
+        <w:rPr>
+          <w:lang w:val="es-ES"/>
+        </w:rPr>
         <w:t xml:space="preserve"> </w:t>
       </w:r>
       <w:r>
         <w:rPr>
           <w:rStyle w:val="VerbatimChar"/>
+          <w:lang w:val="es-ES"/>
         </w:rPr>
         <w:t xml:space="preserve">ping 127.0.0.1</w:t>
       </w:r>
       <w:r>
+        <w:rPr>
+          <w:lang w:val="es-ES"/>
+        </w:rPr>
         <w:t xml:space="preserve">. Si responde → la tarjeta de red del PC funciona. Si no → problema en la pila TCP/IP del equipo.</w:t>
       </w:r>
     </w:p>
@@ -139,22 +175,33 @@
         <w:rPr>
           <w:b/>
           <w:bCs/>
+          <w:lang w:val="es-ES"/>
         </w:rPr>
         <w:t xml:space="preserve">Peldaño 2 — Gateway:</w:t>
       </w:r>
       <w:r>
+        <w:rPr>
+          <w:lang w:val="es-ES"/>
+        </w:rPr>
         <w:t xml:space="preserve"> </w:t>
       </w:r>
       <w:r>
         <w:rPr>
           <w:rStyle w:val="VerbatimChar"/>
+          <w:lang w:val="es-ES"/>
         </w:rPr>
         <w:t xml:space="preserve">ping 192.168.1.1</w:t>
       </w:r>
       <w:r>
-        <w:t xml:space="preserve"> </w:t>
-      </w:r>
-      <w:r>
+        <w:rPr>
+          <w:lang w:val="es-ES"/>
+        </w:rPr>
+        <w:t xml:space="preserve"> </w:t>
+      </w:r>
+      <w:r>
+        <w:rPr>
+          <w:lang w:val="es-ES"/>
+        </w:rPr>
         <w:t xml:space="preserve">(o la IP del router). Si responde → la red local está bien. Si no → problema de cable, switch o configuración IP.</w:t>
       </w:r>
     </w:p>
@@ -170,19 +217,27 @@
         <w:rPr>
           <w:b/>
           <w:bCs/>
+          <w:lang w:val="es-ES"/>
         </w:rPr>
         <w:t xml:space="preserve">Peldaño 3 — Internet:</w:t>
       </w:r>
       <w:r>
+        <w:rPr>
+          <w:lang w:val="es-ES"/>
+        </w:rPr>
         <w:t xml:space="preserve"> </w:t>
       </w:r>
       <w:r>
         <w:rPr>
           <w:rStyle w:val="VerbatimChar"/>
+          <w:lang w:val="es-ES"/>
         </w:rPr>
         <w:t xml:space="preserve">ping 8.8.8.8</w:t>
       </w:r>
       <w:r>
+        <w:rPr>
+          <w:lang w:val="es-ES"/>
+        </w:rPr>
         <w:t xml:space="preserve">. Si responde → el router saca a Internet. Si no → problema en el router o en el operador.</w:t>
       </w:r>
     </w:p>
@@ -198,19 +253,27 @@
         <w:rPr>
           <w:b/>
           <w:bCs/>
+          <w:lang w:val="es-ES"/>
         </w:rPr>
         <w:t xml:space="preserve">Peldaño 4 — DNS:</w:t>
       </w:r>
       <w:r>
+        <w:rPr>
+          <w:lang w:val="es-ES"/>
+        </w:rPr>
         <w:t xml:space="preserve"> </w:t>
       </w:r>
       <w:r>
         <w:rPr>
           <w:rStyle w:val="VerbatimChar"/>
+          <w:lang w:val="es-ES"/>
         </w:rPr>
         <w:t xml:space="preserve">ping www.google.com</w:t>
       </w:r>
       <w:r>
+        <w:rPr>
+          <w:lang w:val="es-ES"/>
+        </w:rPr>
         <w:t xml:space="preserve">. Si responde → todo funciona. Si no → el DNS está caído (la conexión funciona, pero no se traducen nombres).</w:t>
       </w:r>
     </w:p>
@@ -219,19 +282,29 @@
         <w:pStyle w:val="FirstParagraph"/>
       </w:pPr>
       <w:r>
+        <w:rPr>
+          <w:lang w:val="es-ES"/>
+        </w:rPr>
         <w:t xml:space="preserve">Deducción: en cuanto un peldaño falla,</w:t>
       </w:r>
       <w:r>
+        <w:rPr>
+          <w:lang w:val="es-ES"/>
+        </w:rPr>
         <w:t xml:space="preserve"> </w:t>
       </w:r>
       <w:r>
         <w:rPr>
           <w:b/>
           <w:bCs/>
+          <w:lang w:val="es-ES"/>
         </w:rPr>
         <w:t xml:space="preserve">ahí está el problema</w:t>
       </w:r>
       <w:r>
+        <w:rPr>
+          <w:lang w:val="es-ES"/>
+        </w:rPr>
         <w:t xml:space="preserve">. No necesitas mirar los de arriba.</w:t>
       </w:r>
     </w:p>
@@ -242,6 +315,9 @@
         <w:pStyle w:val="Heading2"/>
       </w:pPr>
       <w:r>
+        <w:rPr>
+          <w:lang w:val="es-ES"/>
+        </w:rPr>
         <w:t xml:space="preserve">2. La historia de un paquete</w:t>
       </w:r>
     </w:p>
@@ -257,22 +333,33 @@
         <w:rPr>
           <w:b/>
           <w:bCs/>
+          <w:lang w:val="es-ES"/>
         </w:rPr>
         <w:t xml:space="preserve">Capa de enlace (Ethernet):</w:t>
       </w:r>
       <w:r>
-        <w:t xml:space="preserve"> </w:t>
-      </w:r>
-      <w:r>
+        <w:rPr>
+          <w:lang w:val="es-ES"/>
+        </w:rPr>
+        <w:t xml:space="preserve"> </w:t>
+      </w:r>
+      <w:r>
+        <w:rPr>
+          <w:lang w:val="es-ES"/>
+        </w:rPr>
         <w:t xml:space="preserve">el PC encapsula el paquete en una trama Ethernet. Necesita la MAC del gateway (la obtiene con ARP si no la tiene). La trama viaja por el cable hasta el switch, que la reenvía al </w:t>
       </w:r>
       <w:r>
         <w:rPr>
           <w:rFonts w:hint="eastAsia"/>
+          <w:lang w:val="es-ES"/>
         </w:rPr>
         <w:t xml:space="preserve">router根据la</w:t>
       </w:r>
       <w:r>
+        <w:rPr>
+          <w:lang w:val="es-ES"/>
+        </w:rPr>
         <w:t xml:space="preserve"> MAC destino.</w:t>
       </w:r>
     </w:p>
@@ -288,22 +375,33 @@
         <w:rPr>
           <w:b/>
           <w:bCs/>
+          <w:lang w:val="es-ES"/>
         </w:rPr>
         <w:t xml:space="preserve">Capa de red (IP):</w:t>
       </w:r>
       <w:r>
-        <w:t xml:space="preserve"> </w:t>
-      </w:r>
-      <w:r>
+        <w:rPr>
+          <w:lang w:val="es-ES"/>
+        </w:rPr>
+        <w:t xml:space="preserve"> </w:t>
+      </w:r>
+      <w:r>
+        <w:rPr>
+          <w:lang w:val="es-ES"/>
+        </w:rPr>
         <w:t xml:space="preserve">el router lee el sobre IP, ve que el destino (</w:t>
       </w:r>
       <w:r>
         <w:rPr>
           <w:rStyle w:val="VerbatimChar"/>
+          <w:lang w:val="es-ES"/>
         </w:rPr>
         <w:t xml:space="preserve">142.250.185.78</w:t>
       </w:r>
       <w:r>
+        <w:rPr>
+          <w:lang w:val="es-ES"/>
+        </w:rPr>
         <w:t xml:space="preserve">) no está en su subred, y consulta su tabla de rutas para decidir por dónde enviarlo. El paquete salta de router en router hasta llegar a la red de Google.</w:t>
       </w:r>
     </w:p>
@@ -319,13 +417,20 @@
         <w:rPr>
           <w:b/>
           <w:bCs/>
+          <w:lang w:val="es-ES"/>
         </w:rPr>
         <w:t xml:space="preserve">Capa de transporte (TCP):</w:t>
       </w:r>
       <w:r>
-        <w:t xml:space="preserve"> </w:t>
-      </w:r>
-      <w:r>
+        <w:rPr>
+          <w:lang w:val="es-ES"/>
+        </w:rPr>
+        <w:t xml:space="preserve"> </w:t>
+      </w:r>
+      <w:r>
+        <w:rPr>
+          <w:lang w:val="es-ES"/>
+        </w:rPr>
         <w:t xml:space="preserve">TCP se asegura de que el paquete llega completo y en orden. Si se pierde uno, lo reenvía. Abre una conexión (handshake) antes de empezar.</w:t>
       </w:r>
     </w:p>
@@ -341,13 +446,20 @@
         <w:rPr>
           <w:b/>
           <w:bCs/>
+          <w:lang w:val="es-ES"/>
         </w:rPr>
         <w:t xml:space="preserve">Capa de aplicación (HTTP):</w:t>
       </w:r>
       <w:r>
-        <w:t xml:space="preserve"> </w:t>
-      </w:r>
-      <w:r>
+        <w:rPr>
+          <w:lang w:val="es-ES"/>
+        </w:rPr>
+        <w:t xml:space="preserve"> </w:t>
+      </w:r>
+      <w:r>
+        <w:rPr>
+          <w:lang w:val="es-ES"/>
+        </w:rPr>
         <w:t xml:space="preserve">el navegador envía una petición HTTP GET al servidor de Google. El servidor responde con el HTML de la página, que viaja de vuelta en múltiples paquetes.</w:t>
       </w:r>
     </w:p>
@@ -358,6 +470,9 @@
         <w:pStyle w:val="Heading2"/>
       </w:pPr>
       <w:r>
+        <w:rPr>
+          <w:lang w:val="es-ES"/>
+        </w:rPr>
         <w:t xml:space="preserve">3. ARP, el protocolo olvidado</w:t>
       </w:r>
     </w:p>
@@ -370,21 +485,34 @@
         </w:numPr>
       </w:pPr>
       <w:r>
+        <w:rPr>
+          <w:lang w:val="es-ES"/>
+        </w:rPr>
         <w:t xml:space="preserve">Tu PC quiere hacer ping a</w:t>
       </w:r>
       <w:r>
+        <w:rPr>
+          <w:lang w:val="es-ES"/>
+        </w:rPr>
         <w:t xml:space="preserve"> </w:t>
       </w:r>
       <w:r>
         <w:rPr>
           <w:rStyle w:val="VerbatimChar"/>
+          <w:lang w:val="es-ES"/>
         </w:rPr>
         <w:t xml:space="preserve">192.168.1.1</w:t>
       </w:r>
       <w:r>
-        <w:t xml:space="preserve"> </w:t>
-      </w:r>
-      <w:r>
+        <w:rPr>
+          <w:lang w:val="es-ES"/>
+        </w:rPr>
+        <w:t xml:space="preserve"> </w:t>
+      </w:r>
+      <w:r>
+        <w:rPr>
+          <w:lang w:val="es-ES"/>
+        </w:rPr>
         <w:t xml:space="preserve">pero no tiene la MAC del gateway en su tabla ARP.</w:t>
       </w:r>
     </w:p>
@@ -397,15 +525,27 @@
         </w:numPr>
       </w:pPr>
       <w:r>
+        <w:rPr>
+          <w:lang w:val="es-ES"/>
+        </w:rPr>
         <w:t xml:space="preserve">La capa de enlace no puede construir la trama sin la MAC destino. Se</w:t>
       </w:r>
       <w:r>
-        <w:t xml:space="preserve"> </w:t>
-      </w:r>
-      <w:r>
+        <w:rPr>
+          <w:lang w:val="es-ES"/>
+        </w:rPr>
+        <w:t xml:space="preserve"> </w:t>
+      </w:r>
+      <w:r>
+        <w:rPr>
+          <w:lang w:val="es-ES"/>
+        </w:rPr>
         <w:t xml:space="preserve">“bloquea”</w:t>
       </w:r>
       <w:r>
+        <w:rPr>
+          <w:lang w:val="es-ES"/>
+        </w:rPr>
         <w:t xml:space="preserve">.</w:t>
       </w:r>
     </w:p>
@@ -418,38 +558,61 @@
         </w:numPr>
       </w:pPr>
       <w:r>
+        <w:rPr>
+          <w:lang w:val="es-ES"/>
+        </w:rPr>
         <w:t xml:space="preserve">Tu PC envía un paquete</w:t>
       </w:r>
       <w:r>
+        <w:rPr>
+          <w:lang w:val="es-ES"/>
+        </w:rPr>
         <w:t xml:space="preserve"> </w:t>
       </w:r>
       <w:r>
         <w:rPr>
           <w:b/>
           <w:bCs/>
+          <w:lang w:val="es-ES"/>
         </w:rPr>
         <w:t xml:space="preserve">ARP Request</w:t>
       </w:r>
       <w:r>
-        <w:t xml:space="preserve"> </w:t>
-      </w:r>
-      <w:r>
+        <w:rPr>
+          <w:lang w:val="es-ES"/>
+        </w:rPr>
+        <w:t xml:space="preserve"> </w:t>
+      </w:r>
+      <w:r>
+        <w:rPr>
+          <w:lang w:val="es-ES"/>
+        </w:rPr>
         <w:t xml:space="preserve">en broadcast:</w:t>
       </w:r>
       <w:r>
+        <w:rPr>
+          <w:lang w:val="es-ES"/>
+        </w:rPr>
         <w:t xml:space="preserve"> </w:t>
       </w:r>
       <w:r>
         <w:rPr>
           <w:i/>
           <w:iCs/>
+          <w:lang w:val="es-ES"/>
         </w:rPr>
         <w:t xml:space="preserve">“¿Quién tiene la IP 192.168.1.1?”</w:t>
       </w:r>
       <w:r>
-        <w:t xml:space="preserve"> </w:t>
-      </w:r>
-      <w:r>
+        <w:rPr>
+          <w:lang w:val="es-ES"/>
+        </w:rPr>
+        <w:t xml:space="preserve"> </w:t>
+      </w:r>
+      <w:r>
+        <w:rPr>
+          <w:lang w:val="es-ES"/>
+        </w:rPr>
         <w:t xml:space="preserve">— lo reciben todos los equipos de la subred.</w:t>
       </w:r>
     </w:p>
@@ -462,35 +625,55 @@
         </w:numPr>
       </w:pPr>
       <w:r>
+        <w:rPr>
+          <w:lang w:val="es-ES"/>
+        </w:rPr>
         <w:t xml:space="preserve">El router reconoce su IP y responde con un</w:t>
       </w:r>
       <w:r>
+        <w:rPr>
+          <w:lang w:val="es-ES"/>
+        </w:rPr>
         <w:t xml:space="preserve"> </w:t>
       </w:r>
       <w:r>
         <w:rPr>
           <w:b/>
           <w:bCs/>
+          <w:lang w:val="es-ES"/>
         </w:rPr>
         <w:t xml:space="preserve">ARP Reply</w:t>
       </w:r>
       <w:r>
-        <w:t xml:space="preserve"> </w:t>
-      </w:r>
-      <w:r>
+        <w:rPr>
+          <w:lang w:val="es-ES"/>
+        </w:rPr>
+        <w:t xml:space="preserve"> </w:t>
+      </w:r>
+      <w:r>
+        <w:rPr>
+          <w:lang w:val="es-ES"/>
+        </w:rPr>
         <w:t xml:space="preserve">en unicast:</w:t>
       </w:r>
       <w:r>
+        <w:rPr>
+          <w:lang w:val="es-ES"/>
+        </w:rPr>
         <w:t xml:space="preserve"> </w:t>
       </w:r>
       <w:r>
         <w:rPr>
           <w:i/>
           <w:iCs/>
+          <w:lang w:val="es-ES"/>
         </w:rPr>
         <w:t xml:space="preserve">“Yo, y mi MAC es aa:bb:cc:dd:ee:ff”</w:t>
       </w:r>
       <w:r>
+        <w:rPr>
+          <w:lang w:val="es-ES"/>
+        </w:rPr>
         <w:t xml:space="preserve">.</w:t>
       </w:r>
     </w:p>
@@ -503,6 +686,9 @@
         </w:numPr>
       </w:pPr>
       <w:r>
+        <w:rPr>
+          <w:lang w:val="es-ES"/>
+        </w:rPr>
         <w:t xml:space="preserve">Tu PC guarda la MAC en su tabla ARP y ahora sí puede construir la trama Ethernet con la MAC del gateway.</w:t>
       </w:r>
     </w:p>
@@ -515,6 +701,9 @@
         </w:numPr>
       </w:pPr>
       <w:r>
+        <w:rPr>
+          <w:lang w:val="es-ES"/>
+        </w:rPr>
         <w:t xml:space="preserve">El paquete de ping sale por la tarjeta de red hacia el router.</w:t>
       </w:r>
     </w:p>
@@ -523,6 +712,9 @@
         <w:pStyle w:val="FirstParagraph"/>
       </w:pPr>
       <w:r>
+        <w:rPr>
+          <w:lang w:val="es-ES"/>
+        </w:rPr>
         <w:t xml:space="preserve">Sin ARP, la capa 2 (Ethernet) no puede funcionar porque no sabe a quién enviar la trama.</w:t>
       </w:r>
     </w:p>
@@ -533,6 +725,9 @@
         <w:pStyle w:val="Heading2"/>
       </w:pPr>
       <w:r>
+        <w:rPr>
+          <w:lang w:val="es-ES"/>
+        </w:rPr>
         <w:t xml:space="preserve">4. Argumenta contra Conrad</w:t>
       </w:r>
     </w:p>
@@ -548,13 +743,20 @@
         <w:rPr>
           <w:b/>
           <w:bCs/>
+          <w:lang w:val="es-ES"/>
         </w:rPr>
         <w:t xml:space="preserve">Si reinicias todo, pierdes la información del fallo.</w:t>
       </w:r>
       <w:r>
-        <w:t xml:space="preserve"> </w:t>
-      </w:r>
-      <w:r>
+        <w:rPr>
+          <w:lang w:val="es-ES"/>
+        </w:rPr>
+        <w:t xml:space="preserve"> </w:t>
+      </w:r>
+      <w:r>
+        <w:rPr>
+          <w:lang w:val="es-ES"/>
+        </w:rPr>
         <w:t xml:space="preserve">El momento en que se produce el error es el mejor momento para capturar datos: logs, estado de las interfaces, tablas ARP. Si reinicias, todo se borra y el problema vuelve a aparecer sin pistas.</w:t>
       </w:r>
     </w:p>
@@ -570,25 +772,44 @@
         <w:rPr>
           <w:b/>
           <w:bCs/>
+          <w:lang w:val="es-ES"/>
         </w:rPr>
         <w:t xml:space="preserve">El reinicio es una solución temporal, no una solución real.</w:t>
       </w:r>
       <w:r>
-        <w:t xml:space="preserve"> </w:t>
-      </w:r>
-      <w:r>
+        <w:rPr>
+          <w:lang w:val="es-ES"/>
+        </w:rPr>
+        <w:t xml:space="preserve"> </w:t>
+      </w:r>
+      <w:r>
+        <w:rPr>
+          <w:lang w:val="es-ES"/>
+        </w:rPr>
         <w:t xml:space="preserve">Si el problema era un cable suelto, el reinicio</w:t>
       </w:r>
       <w:r>
-        <w:t xml:space="preserve"> </w:t>
-      </w:r>
-      <w:r>
+        <w:rPr>
+          <w:lang w:val="es-ES"/>
+        </w:rPr>
+        <w:t xml:space="preserve"> </w:t>
+      </w:r>
+      <w:r>
+        <w:rPr>
+          <w:lang w:val="es-ES"/>
+        </w:rPr>
         <w:t xml:space="preserve">“lo arregla”</w:t>
       </w:r>
       <w:r>
-        <w:t xml:space="preserve"> </w:t>
-      </w:r>
-      <w:r>
+        <w:rPr>
+          <w:lang w:val="es-ES"/>
+        </w:rPr>
+        <w:t xml:space="preserve"> </w:t>
+      </w:r>
+      <w:r>
+        <w:rPr>
+          <w:lang w:val="es-ES"/>
+        </w:rPr>
         <w:t xml:space="preserve">por casualidad (al volver a arrancar, se reestablece algo), pero la causa raíz sigue ahí y volverá a pasar.</w:t>
       </w:r>
     </w:p>
@@ -604,22 +825,38 @@
         <w:rPr>
           <w:b/>
           <w:bCs/>
+          <w:lang w:val="es-ES"/>
         </w:rPr>
         <w:t xml:space="preserve">El usuario necesita saber qué pasó.</w:t>
       </w:r>
       <w:r>
-        <w:t xml:space="preserve"> </w:t>
-      </w:r>
-      <w:r>
+        <w:rPr>
+          <w:lang w:val="es-ES"/>
+        </w:rPr>
+        <w:t xml:space="preserve"> </w:t>
+      </w:r>
+      <w:r>
+        <w:rPr>
+          <w:lang w:val="es-ES"/>
+        </w:rPr>
         <w:t xml:space="preserve">Si un profesor te llama y tú solo reinicias, la próxima vez lo hará él solo sin diagnosticar. Si le explicas</w:t>
       </w:r>
       <w:r>
-        <w:t xml:space="preserve"> </w:t>
-      </w:r>
-      <w:r>
+        <w:rPr>
+          <w:lang w:val="es-ES"/>
+        </w:rPr>
+        <w:t xml:space="preserve"> </w:t>
+      </w:r>
+      <w:r>
+        <w:rPr>
+          <w:lang w:val="es-ES"/>
+        </w:rPr>
         <w:t xml:space="preserve">“el cable estaba suelto”</w:t>
       </w:r>
       <w:r>
+        <w:rPr>
+          <w:lang w:val="es-ES"/>
+        </w:rPr>
         <w:t xml:space="preserve">, aprende y no te vuelve a llamar por lo mismo.</w:t>
       </w:r>
     </w:p>
@@ -630,6 +867,9 @@
         <w:pStyle w:val="Heading2"/>
       </w:pPr>
       <w:r>
+        <w:rPr>
+          <w:lang w:val="es-ES"/>
+        </w:rPr>
         <w:t xml:space="preserve">5. Diseña la red del aula</w:t>
       </w:r>
     </w:p>
@@ -641,13 +881,20 @@
         <w:rPr>
           <w:b/>
           <w:bCs/>
+          <w:lang w:val="es-ES"/>
         </w:rPr>
         <w:t xml:space="preserve">Topología:</w:t>
       </w:r>
       <w:r>
-        <w:t xml:space="preserve"> </w:t>
-      </w:r>
-      <w:r>
+        <w:rPr>
+          <w:lang w:val="es-ES"/>
+        </w:rPr>
+        <w:t xml:space="preserve"> </w:t>
+      </w:r>
+      <w:r>
+        <w:rPr>
+          <w:lang w:val="es-ES"/>
+        </w:rPr>
         <w:t xml:space="preserve">estrella (todos los PC conectados a un switch central).</w:t>
       </w:r>
     </w:p>
@@ -659,73 +906,122 @@
         <w:rPr>
           <w:b/>
           <w:bCs/>
+          <w:lang w:val="es-ES"/>
         </w:rPr>
         <w:t xml:space="preserve">Dispositivos necesarios:</w:t>
       </w:r>
       <w:r>
-        <w:t xml:space="preserve"> </w:t>
-      </w:r>
-      <w:r>
+        <w:rPr>
+          <w:lang w:val="es-ES"/>
+        </w:rPr>
+        <w:t xml:space="preserve"> </w:t>
+      </w:r>
+      <w:r>
+        <w:rPr>
+          <w:lang w:val="es-ES"/>
+        </w:rPr>
         <w:t xml:space="preserve">-</w:t>
       </w:r>
       <w:r>
+        <w:rPr>
+          <w:lang w:val="es-ES"/>
+        </w:rPr>
         <w:t xml:space="preserve"> </w:t>
       </w:r>
       <w:r>
         <w:rPr>
           <w:b/>
           <w:bCs/>
+          <w:lang w:val="es-ES"/>
         </w:rPr>
         <w:t xml:space="preserve">1 switch de 48 puertos</w:t>
       </w:r>
       <w:r>
-        <w:t xml:space="preserve"> </w:t>
-      </w:r>
-      <w:r>
+        <w:rPr>
+          <w:lang w:val="es-ES"/>
+        </w:rPr>
+        <w:t xml:space="preserve"> </w:t>
+      </w:r>
+      <w:r>
+        <w:rPr>
+          <w:lang w:val="es-ES"/>
+        </w:rPr>
         <w:t xml:space="preserve">(con 30 PC + 1 impresora = 31 puertos, sobran 17 para crecimiento). Un switch de 24 puertos no alcanza; necesitarías dos, lo que complica la instalación.</w:t>
       </w:r>
       <w:r>
-        <w:t xml:space="preserve"> </w:t>
-      </w:r>
-      <w:r>
+        <w:rPr>
+          <w:lang w:val="es-ES"/>
+        </w:rPr>
+        <w:t xml:space="preserve"> </w:t>
+      </w:r>
+      <w:r>
+        <w:rPr>
+          <w:lang w:val="es-ES"/>
+        </w:rPr>
         <w:t xml:space="preserve">-</w:t>
       </w:r>
       <w:r>
+        <w:rPr>
+          <w:lang w:val="es-ES"/>
+        </w:rPr>
         <w:t xml:space="preserve"> </w:t>
       </w:r>
       <w:r>
         <w:rPr>
           <w:b/>
           <w:bCs/>
+          <w:lang w:val="es-ES"/>
         </w:rPr>
         <w:t xml:space="preserve">1 router</w:t>
       </w:r>
       <w:r>
-        <w:t xml:space="preserve"> </w:t>
-      </w:r>
-      <w:r>
+        <w:rPr>
+          <w:lang w:val="es-ES"/>
+        </w:rPr>
+        <w:t xml:space="preserve"> </w:t>
+      </w:r>
+      <w:r>
+        <w:rPr>
+          <w:lang w:val="es-ES"/>
+        </w:rPr>
         <w:t xml:space="preserve">conectado a un puerto del switch para la salida a Internet.</w:t>
       </w:r>
       <w:r>
-        <w:t xml:space="preserve"> </w:t>
-      </w:r>
-      <w:r>
+        <w:rPr>
+          <w:lang w:val="es-ES"/>
+        </w:rPr>
+        <w:t xml:space="preserve"> </w:t>
+      </w:r>
+      <w:r>
+        <w:rPr>
+          <w:lang w:val="es-ES"/>
+        </w:rPr>
         <w:t xml:space="preserve">-</w:t>
       </w:r>
       <w:r>
+        <w:rPr>
+          <w:lang w:val="es-ES"/>
+        </w:rPr>
         <w:t xml:space="preserve"> </w:t>
       </w:r>
       <w:r>
         <w:rPr>
           <w:b/>
           <w:bCs/>
+          <w:lang w:val="es-ES"/>
         </w:rPr>
         <w:t xml:space="preserve">Cable UTP Cat6</w:t>
       </w:r>
       <w:r>
-        <w:t xml:space="preserve"> </w:t>
-      </w:r>
-      <w:r>
+        <w:rPr>
+          <w:lang w:val="es-ES"/>
+        </w:rPr>
+        <w:t xml:space="preserve"> </w:t>
+      </w:r>
+      <w:r>
+        <w:rPr>
+          <w:lang w:val="es-ES"/>
+        </w:rPr>
         <w:t xml:space="preserve">desde cada PC hasta el switch.</w:t>
       </w:r>
     </w:p>
@@ -737,31 +1033,56 @@
         <w:rPr>
           <w:b/>
           <w:bCs/>
+          <w:lang w:val="es-ES"/>
         </w:rPr>
         <w:t xml:space="preserve">Justificación:</w:t>
       </w:r>
       <w:r>
-        <w:t xml:space="preserve"> </w:t>
-      </w:r>
-      <w:r>
+        <w:rPr>
+          <w:lang w:val="es-ES"/>
+        </w:rPr>
+        <w:t xml:space="preserve"> </w:t>
+      </w:r>
+      <w:r>
+        <w:rPr>
+          <w:lang w:val="es-ES"/>
+        </w:rPr>
         <w:t xml:space="preserve">- El switch conecta todos los PC entre sí (capa 2).</w:t>
       </w:r>
       <w:r>
-        <w:t xml:space="preserve"> </w:t>
-      </w:r>
-      <w:r>
+        <w:rPr>
+          <w:lang w:val="es-ES"/>
+        </w:rPr>
+        <w:t xml:space="preserve"> </w:t>
+      </w:r>
+      <w:r>
+        <w:rPr>
+          <w:lang w:val="es-ES"/>
+        </w:rPr>
         <w:t xml:space="preserve">- El router une el aula con Internet (capa 3).</w:t>
       </w:r>
       <w:r>
-        <w:t xml:space="preserve"> </w:t>
-      </w:r>
-      <w:r>
+        <w:rPr>
+          <w:lang w:val="es-ES"/>
+        </w:rPr>
+        <w:t xml:space="preserve"> </w:t>
+      </w:r>
+      <w:r>
+        <w:rPr>
+          <w:lang w:val="es-ES"/>
+        </w:rPr>
         <w:t xml:space="preserve">- La impresora se conecta al switch y todos la alcanzan.</w:t>
       </w:r>
       <w:r>
-        <w:t xml:space="preserve"> </w:t>
-      </w:r>
-      <w:r>
+        <w:rPr>
+          <w:lang w:val="es-ES"/>
+        </w:rPr>
+        <w:t xml:space="preserve"> </w:t>
+      </w:r>
+      <w:r>
+        <w:rPr>
+          <w:lang w:val="es-ES"/>
+        </w:rPr>
         <w:t xml:space="preserve">- Con un solo switch de 48 puertos, la topología es simple, fácil de mantener y con margen para crecer.</w:t>
       </w:r>
     </w:p>
@@ -772,6 +1093,9 @@
         <w:pStyle w:val="Heading2"/>
       </w:pPr>
       <w:r>
+        <w:rPr>
+          <w:lang w:val="es-ES"/>
+        </w:rPr>
         <w:t xml:space="preserve">6. Mente binaria</w:t>
       </w:r>
     </w:p>
@@ -784,19 +1108,29 @@
         </w:numPr>
       </w:pPr>
       <w:r>
+        <w:rPr>
+          <w:lang w:val="es-ES"/>
+        </w:rPr>
         <w:t xml:space="preserve">4 bytes × 8 bits/byte =</w:t>
       </w:r>
       <w:r>
+        <w:rPr>
+          <w:lang w:val="es-ES"/>
+        </w:rPr>
         <w:t xml:space="preserve"> </w:t>
       </w:r>
       <w:r>
         <w:rPr>
           <w:b/>
           <w:bCs/>
+          <w:lang w:val="es-ES"/>
         </w:rPr>
         <w:t xml:space="preserve">32 bits</w:t>
       </w:r>
       <w:r>
+        <w:rPr>
+          <w:lang w:val="es-ES"/>
+        </w:rPr>
         <w:t xml:space="preserve">.</w:t>
       </w:r>
     </w:p>
@@ -809,19 +1143,29 @@
         </w:numPr>
       </w:pPr>
       <w:r>
+        <w:rPr>
+          <w:lang w:val="es-ES"/>
+        </w:rPr>
         <w:t xml:space="preserve">320 bits ÷ 8 bits/byte =</w:t>
       </w:r>
       <w:r>
+        <w:rPr>
+          <w:lang w:val="es-ES"/>
+        </w:rPr>
         <w:t xml:space="preserve"> </w:t>
       </w:r>
       <w:r>
         <w:rPr>
           <w:b/>
           <w:bCs/>
+          <w:lang w:val="es-ES"/>
         </w:rPr>
         <w:t xml:space="preserve">40 bytes</w:t>
       </w:r>
       <w:r>
+        <w:rPr>
+          <w:lang w:val="es-ES"/>
+        </w:rPr>
         <w:t xml:space="preserve">.</w:t>
       </w:r>
     </w:p>
@@ -834,19 +1178,29 @@
         </w:numPr>
       </w:pPr>
       <w:r>
+        <w:rPr>
+          <w:lang w:val="es-ES"/>
+        </w:rPr>
         <w:t xml:space="preserve">4 letras = 4 bytes; 4 × 8 =</w:t>
       </w:r>
       <w:r>
+        <w:rPr>
+          <w:lang w:val="es-ES"/>
+        </w:rPr>
         <w:t xml:space="preserve"> </w:t>
       </w:r>
       <w:r>
         <w:rPr>
           <w:b/>
           <w:bCs/>
+          <w:lang w:val="es-ES"/>
         </w:rPr>
         <w:t xml:space="preserve">32 bits</w:t>
       </w:r>
       <w:r>
+        <w:rPr>
+          <w:lang w:val="es-ES"/>
+        </w:rPr>
         <w:t xml:space="preserve">.</w:t>
       </w:r>
     </w:p>
@@ -857,6 +1211,9 @@
         <w:pStyle w:val="Heading2"/>
       </w:pPr>
       <w:r>
+        <w:rPr>
+          <w:lang w:val="es-ES"/>
+        </w:rPr>
         <w:t xml:space="preserve">7. El mapa del curso</w:t>
       </w:r>
     </w:p>
@@ -872,13 +1229,20 @@
         <w:rPr>
           <w:b/>
           <w:bCs/>
+          <w:lang w:val="es-ES"/>
         </w:rPr>
         <w:t xml:space="preserve">Sin saber qué es una red, no sabrías para qué configuras cada aparato.</w:t>
       </w:r>
       <w:r>
-        <w:t xml:space="preserve"> </w:t>
-      </w:r>
-      <w:r>
+        <w:rPr>
+          <w:lang w:val="es-ES"/>
+        </w:rPr>
+        <w:t xml:space="preserve"> </w:t>
+      </w:r>
+      <w:r>
+        <w:rPr>
+          <w:lang w:val="es-ES"/>
+        </w:rPr>
         <w:t xml:space="preserve">Si no conoces las 4 piezas (dispositivos finales, de interconexión, medio, protocolos), configurar un switch o un router sería como girar una llave sin saber qué puerta abre.</w:t>
       </w:r>
     </w:p>
@@ -894,13 +1258,20 @@
         <w:rPr>
           <w:b/>
           <w:bCs/>
+          <w:lang w:val="es-ES"/>
         </w:rPr>
         <w:t xml:space="preserve">El método de diagnóstico en capas lo usarás en cada laboratorio del curso.</w:t>
       </w:r>
       <w:r>
-        <w:t xml:space="preserve"> </w:t>
-      </w:r>
-      <w:r>
+        <w:rPr>
+          <w:lang w:val="es-ES"/>
+        </w:rPr>
+        <w:t xml:space="preserve"> </w:t>
+      </w:r>
+      <w:r>
+        <w:rPr>
+          <w:lang w:val="es-ES"/>
+        </w:rPr>
         <w:t xml:space="preserve">Desde la UD1 hasta la UD1, cada vez que algo falle, volverás a la escalera del ping. Aprenderlo primero te da una herramienta que acompaña todo el curso.</w:t>
       </w:r>
     </w:p>
@@ -911,6 +1282,9 @@
         <w:pStyle w:val="Heading2"/>
       </w:pPr>
       <w:r>
+        <w:rPr>
+          <w:lang w:val="es-ES"/>
+        </w:rPr>
         <w:t xml:space="preserve">8. El entorno de trabajo: Preparación del taller virtual</w:t>
       </w:r>
     </w:p>
@@ -925,13 +1299,20 @@
         <w:rPr>
           <w:b/>
           <w:bCs/>
+          <w:lang w:val="es-ES"/>
         </w:rPr>
         <w:t xml:space="preserve">Por qué usar un simulador:</w:t>
       </w:r>
       <w:r>
-        <w:t xml:space="preserve"> </w:t>
-      </w:r>
-      <w:r>
+        <w:rPr>
+          <w:lang w:val="es-ES"/>
+        </w:rPr>
+        <w:t xml:space="preserve"> </w:t>
+      </w:r>
+      <w:r>
+        <w:rPr>
+          <w:lang w:val="es-ES"/>
+        </w:rPr>
         <w:t xml:space="preserve">Packet Tracer es el entorno virtual gratuito para estudiantes que nos permite arrastrar dispositivos, simular tráfico y probar configuraciones complejas sin el riesgo de apagar una red real, romper hardware costoso o interrumpir el trabajo de otros usuarios. Es la herramienta indispensable para aprender aplicando la regla de oro: primero hazlo, luego entiéndelo.</w:t>
       </w:r>
     </w:p>
@@ -946,13 +1327,20 @@
         <w:rPr>
           <w:b/>
           <w:bCs/>
+          <w:lang w:val="es-ES"/>
         </w:rPr>
         <w:t xml:space="preserve">Protocolo ante incidencias de instalación:</w:t>
       </w:r>
       <w:r>
-        <w:t xml:space="preserve"> </w:t>
-      </w:r>
-      <w:r>
+        <w:rPr>
+          <w:lang w:val="es-ES"/>
+        </w:rPr>
+        <w:t xml:space="preserve"> </w:t>
+      </w:r>
+      <w:r>
+        <w:rPr>
+          <w:lang w:val="es-ES"/>
+        </w:rPr>
         <w:t xml:space="preserve">Si el simulador no arranca o da problemas al iniciar sesión con la cuenta de la Cisco Networking Academy, el administrador no recurre al azar ni formatea el equipo. El procedimiento consiste en: verificar los requisitos del sistema operativo, comprobar la conexión a Internet que valida las credenciales y, en caso de persistir el error, documentar el mensaje exacto de la excepción y compartirlo de forma estructurada en el Foro de la Unidad de la plataforma para solucionarlo de manera colaborativa y asíncrona.</w:t>
       </w:r>
     </w:p>

</xml_diff>

<commit_message>
UD5: nuevo punto 7 DHCP por VLAN (pools, relay, Wireshark DORA), puentes en UD4, laboratorio con variante DHCP y ejercicio 9 en boletin avanzado
</commit_message>
<xml_diff>
--- a/docx/01-introduccion/boletin-U01-avanzado-resuelto.docx
+++ b/docx/01-introduccion/boletin-U01-avanzado-resuelto.docx
@@ -15,9 +15,6 @@
             <w:pStyle w:val="TOCHeading"/>
           </w:pPr>
           <w:r>
-            <w:rPr>
-              <w:lang w:val="es-ES"/>
-            </w:rPr>
             <w:t xml:space="preserve">Table of Contents</w:t>
           </w:r>
         </w:p>
@@ -37,9 +34,6 @@
         <w:pStyle w:val="Heading1"/>
       </w:pPr>
       <w:r>
-        <w:rPr>
-          <w:lang w:val="es-ES"/>
-        </w:rPr>
         <w:t xml:space="preserve">Boletín UD1 — Avanzado (Resuelto)</w:t>
       </w:r>
     </w:p>
@@ -50,9 +44,6 @@
         <w:pStyle w:val="Heading1"/>
       </w:pPr>
       <w:r>
-        <w:rPr>
-          <w:lang w:val="es-ES"/>
-        </w:rPr>
         <w:t xml:space="preserve">💪 Boletín UD1 — Avanzado (Resuelto)</w:t>
       </w:r>
     </w:p>
@@ -69,21 +60,12 @@
         <w:pStyle w:val="Heading2"/>
       </w:pPr>
       <w:r>
-        <w:rPr>
-          <w:lang w:val="es-ES"/>
-        </w:rPr>
         <w:t xml:space="preserve">1. Diagnóstico completo:</w:t>
       </w:r>
       <w:r>
-        <w:rPr>
-          <w:lang w:val="es-ES"/>
-        </w:rPr>
-        <w:t xml:space="preserve"> </w:t>
-      </w:r>
-      <w:r>
-        <w:rPr>
-          <w:lang w:val="es-ES"/>
-        </w:rPr>
+        <w:t xml:space="preserve"> </w:t>
+      </w:r>
+      <w:r>
         <w:t xml:space="preserve">“No tengo Internet”</w:t>
       </w:r>
     </w:p>
@@ -92,9 +74,6 @@
         <w:pStyle w:val="FirstParagraph"/>
       </w:pPr>
       <w:r>
-        <w:rPr>
-          <w:lang w:val="es-ES"/>
-        </w:rPr>
         <w:t xml:space="preserve">Pasos en orden, de lo más físico a lo más lógico:</w:t>
       </w:r>
     </w:p>
@@ -110,20 +89,13 @@
         <w:rPr>
           <w:b/>
           <w:bCs/>
-          <w:lang w:val="es-ES"/>
         </w:rPr>
         <w:t xml:space="preserve">Peldaño 0 — Luces:</w:t>
       </w:r>
       <w:r>
-        <w:rPr>
-          <w:lang w:val="es-ES"/>
-        </w:rPr>
-        <w:t xml:space="preserve"> </w:t>
-      </w:r>
-      <w:r>
-        <w:rPr>
-          <w:lang w:val="es-ES"/>
-        </w:rPr>
+        <w:t xml:space="preserve"> </w:t>
+      </w:r>
+      <w:r>
         <w:t xml:space="preserve">miro si la lucecita del puerto de red del PC y del switch están encendidas. Si alguna está apagada → problema físico (cable suelto o puerto apagado).</w:t>
       </w:r>
     </w:p>
@@ -139,27 +111,19 @@
         <w:rPr>
           <w:b/>
           <w:bCs/>
-          <w:lang w:val="es-ES"/>
         </w:rPr>
         <w:t xml:space="preserve">Peldaño 1 — Loopback:</w:t>
       </w:r>
       <w:r>
-        <w:rPr>
-          <w:lang w:val="es-ES"/>
-        </w:rPr>
         <w:t xml:space="preserve"> </w:t>
       </w:r>
       <w:r>
         <w:rPr>
           <w:rStyle w:val="VerbatimChar"/>
-          <w:lang w:val="es-ES"/>
         </w:rPr>
         <w:t xml:space="preserve">ping 127.0.0.1</w:t>
       </w:r>
       <w:r>
-        <w:rPr>
-          <w:lang w:val="es-ES"/>
-        </w:rPr>
         <w:t xml:space="preserve">. Si responde → la tarjeta de red del PC funciona. Si no → problema en la pila TCP/IP del equipo.</w:t>
       </w:r>
     </w:p>
@@ -175,33 +139,22 @@
         <w:rPr>
           <w:b/>
           <w:bCs/>
-          <w:lang w:val="es-ES"/>
         </w:rPr>
         <w:t xml:space="preserve">Peldaño 2 — Gateway:</w:t>
       </w:r>
       <w:r>
-        <w:rPr>
-          <w:lang w:val="es-ES"/>
-        </w:rPr>
         <w:t xml:space="preserve"> </w:t>
       </w:r>
       <w:r>
         <w:rPr>
           <w:rStyle w:val="VerbatimChar"/>
-          <w:lang w:val="es-ES"/>
         </w:rPr>
         <w:t xml:space="preserve">ping 192.168.1.1</w:t>
       </w:r>
       <w:r>
-        <w:rPr>
-          <w:lang w:val="es-ES"/>
-        </w:rPr>
-        <w:t xml:space="preserve"> </w:t>
-      </w:r>
-      <w:r>
-        <w:rPr>
-          <w:lang w:val="es-ES"/>
-        </w:rPr>
+        <w:t xml:space="preserve"> </w:t>
+      </w:r>
+      <w:r>
         <w:t xml:space="preserve">(o la IP del router). Si responde → la red local está bien. Si no → problema de cable, switch o configuración IP.</w:t>
       </w:r>
     </w:p>
@@ -217,27 +170,19 @@
         <w:rPr>
           <w:b/>
           <w:bCs/>
-          <w:lang w:val="es-ES"/>
         </w:rPr>
         <w:t xml:space="preserve">Peldaño 3 — Internet:</w:t>
       </w:r>
       <w:r>
-        <w:rPr>
-          <w:lang w:val="es-ES"/>
-        </w:rPr>
         <w:t xml:space="preserve"> </w:t>
       </w:r>
       <w:r>
         <w:rPr>
           <w:rStyle w:val="VerbatimChar"/>
-          <w:lang w:val="es-ES"/>
         </w:rPr>
         <w:t xml:space="preserve">ping 8.8.8.8</w:t>
       </w:r>
       <w:r>
-        <w:rPr>
-          <w:lang w:val="es-ES"/>
-        </w:rPr>
         <w:t xml:space="preserve">. Si responde → el router saca a Internet. Si no → problema en el router o en el operador.</w:t>
       </w:r>
     </w:p>
@@ -253,27 +198,19 @@
         <w:rPr>
           <w:b/>
           <w:bCs/>
-          <w:lang w:val="es-ES"/>
         </w:rPr>
         <w:t xml:space="preserve">Peldaño 4 — DNS:</w:t>
       </w:r>
       <w:r>
-        <w:rPr>
-          <w:lang w:val="es-ES"/>
-        </w:rPr>
         <w:t xml:space="preserve"> </w:t>
       </w:r>
       <w:r>
         <w:rPr>
           <w:rStyle w:val="VerbatimChar"/>
-          <w:lang w:val="es-ES"/>
         </w:rPr>
         <w:t xml:space="preserve">ping www.google.com</w:t>
       </w:r>
       <w:r>
-        <w:rPr>
-          <w:lang w:val="es-ES"/>
-        </w:rPr>
         <w:t xml:space="preserve">. Si responde → todo funciona. Si no → el DNS está caído (la conexión funciona, pero no se traducen nombres).</w:t>
       </w:r>
     </w:p>
@@ -282,29 +219,19 @@
         <w:pStyle w:val="FirstParagraph"/>
       </w:pPr>
       <w:r>
-        <w:rPr>
-          <w:lang w:val="es-ES"/>
-        </w:rPr>
         <w:t xml:space="preserve">Deducción: en cuanto un peldaño falla,</w:t>
       </w:r>
       <w:r>
-        <w:rPr>
-          <w:lang w:val="es-ES"/>
-        </w:rPr>
-        <w:t xml:space="preserve"> </w:t>
-      </w:r>
-      <w:r>
-        <w:rPr>
-          <w:b/>
-          <w:bCs/>
-          <w:lang w:val="es-ES"/>
+        <w:t xml:space="preserve"> </w:t>
+      </w:r>
+      <w:r>
+        <w:rPr>
+          <w:b/>
+          <w:bCs/>
         </w:rPr>
         <w:t xml:space="preserve">ahí está el problema</w:t>
       </w:r>
       <w:r>
-        <w:rPr>
-          <w:lang w:val="es-ES"/>
-        </w:rPr>
         <w:t xml:space="preserve">. No necesitas mirar los de arriba.</w:t>
       </w:r>
     </w:p>
@@ -315,9 +242,6 @@
         <w:pStyle w:val="Heading2"/>
       </w:pPr>
       <w:r>
-        <w:rPr>
-          <w:lang w:val="es-ES"/>
-        </w:rPr>
         <w:t xml:space="preserve">2. La historia de un paquete</w:t>
       </w:r>
     </w:p>
@@ -333,33 +257,22 @@
         <w:rPr>
           <w:b/>
           <w:bCs/>
-          <w:lang w:val="es-ES"/>
         </w:rPr>
         <w:t xml:space="preserve">Capa de enlace (Ethernet):</w:t>
       </w:r>
       <w:r>
-        <w:rPr>
-          <w:lang w:val="es-ES"/>
-        </w:rPr>
-        <w:t xml:space="preserve"> </w:t>
-      </w:r>
-      <w:r>
-        <w:rPr>
-          <w:lang w:val="es-ES"/>
-        </w:rPr>
+        <w:t xml:space="preserve"> </w:t>
+      </w:r>
+      <w:r>
         <w:t xml:space="preserve">el PC encapsula el paquete en una trama Ethernet. Necesita la MAC del gateway (la obtiene con ARP si no la tiene). La trama viaja por el cable hasta el switch, que la reenvía al </w:t>
       </w:r>
       <w:r>
         <w:rPr>
           <w:rFonts w:hint="eastAsia"/>
-          <w:lang w:val="es-ES"/>
         </w:rPr>
         <w:t xml:space="preserve">router根据la</w:t>
       </w:r>
       <w:r>
-        <w:rPr>
-          <w:lang w:val="es-ES"/>
-        </w:rPr>
         <w:t xml:space="preserve"> MAC destino.</w:t>
       </w:r>
     </w:p>
@@ -375,33 +288,22 @@
         <w:rPr>
           <w:b/>
           <w:bCs/>
-          <w:lang w:val="es-ES"/>
         </w:rPr>
         <w:t xml:space="preserve">Capa de red (IP):</w:t>
       </w:r>
       <w:r>
-        <w:rPr>
-          <w:lang w:val="es-ES"/>
-        </w:rPr>
-        <w:t xml:space="preserve"> </w:t>
-      </w:r>
-      <w:r>
-        <w:rPr>
-          <w:lang w:val="es-ES"/>
-        </w:rPr>
+        <w:t xml:space="preserve"> </w:t>
+      </w:r>
+      <w:r>
         <w:t xml:space="preserve">el router lee el sobre IP, ve que el destino (</w:t>
       </w:r>
       <w:r>
         <w:rPr>
           <w:rStyle w:val="VerbatimChar"/>
-          <w:lang w:val="es-ES"/>
         </w:rPr>
         <w:t xml:space="preserve">142.250.185.78</w:t>
       </w:r>
       <w:r>
-        <w:rPr>
-          <w:lang w:val="es-ES"/>
-        </w:rPr>
         <w:t xml:space="preserve">) no está en su subred, y consulta su tabla de rutas para decidir por dónde enviarlo. El paquete salta de router en router hasta llegar a la red de Google.</w:t>
       </w:r>
     </w:p>
@@ -417,20 +319,13 @@
         <w:rPr>
           <w:b/>
           <w:bCs/>
-          <w:lang w:val="es-ES"/>
         </w:rPr>
         <w:t xml:space="preserve">Capa de transporte (TCP):</w:t>
       </w:r>
       <w:r>
-        <w:rPr>
-          <w:lang w:val="es-ES"/>
-        </w:rPr>
-        <w:t xml:space="preserve"> </w:t>
-      </w:r>
-      <w:r>
-        <w:rPr>
-          <w:lang w:val="es-ES"/>
-        </w:rPr>
+        <w:t xml:space="preserve"> </w:t>
+      </w:r>
+      <w:r>
         <w:t xml:space="preserve">TCP se asegura de que el paquete llega completo y en orden. Si se pierde uno, lo reenvía. Abre una conexión (handshake) antes de empezar.</w:t>
       </w:r>
     </w:p>
@@ -446,20 +341,13 @@
         <w:rPr>
           <w:b/>
           <w:bCs/>
-          <w:lang w:val="es-ES"/>
         </w:rPr>
         <w:t xml:space="preserve">Capa de aplicación (HTTP):</w:t>
       </w:r>
       <w:r>
-        <w:rPr>
-          <w:lang w:val="es-ES"/>
-        </w:rPr>
-        <w:t xml:space="preserve"> </w:t>
-      </w:r>
-      <w:r>
-        <w:rPr>
-          <w:lang w:val="es-ES"/>
-        </w:rPr>
+        <w:t xml:space="preserve"> </w:t>
+      </w:r>
+      <w:r>
         <w:t xml:space="preserve">el navegador envía una petición HTTP GET al servidor de Google. El servidor responde con el HTML de la página, que viaja de vuelta en múltiples paquetes.</w:t>
       </w:r>
     </w:p>
@@ -470,9 +358,6 @@
         <w:pStyle w:val="Heading2"/>
       </w:pPr>
       <w:r>
-        <w:rPr>
-          <w:lang w:val="es-ES"/>
-        </w:rPr>
         <w:t xml:space="preserve">3. ARP, el protocolo olvidado</w:t>
       </w:r>
     </w:p>
@@ -485,34 +370,21 @@
         </w:numPr>
       </w:pPr>
       <w:r>
-        <w:rPr>
-          <w:lang w:val="es-ES"/>
-        </w:rPr>
         <w:t xml:space="preserve">Tu PC quiere hacer ping a</w:t>
       </w:r>
       <w:r>
-        <w:rPr>
-          <w:lang w:val="es-ES"/>
-        </w:rPr>
         <w:t xml:space="preserve"> </w:t>
       </w:r>
       <w:r>
         <w:rPr>
           <w:rStyle w:val="VerbatimChar"/>
-          <w:lang w:val="es-ES"/>
         </w:rPr>
         <w:t xml:space="preserve">192.168.1.1</w:t>
       </w:r>
       <w:r>
-        <w:rPr>
-          <w:lang w:val="es-ES"/>
-        </w:rPr>
-        <w:t xml:space="preserve"> </w:t>
-      </w:r>
-      <w:r>
-        <w:rPr>
-          <w:lang w:val="es-ES"/>
-        </w:rPr>
+        <w:t xml:space="preserve"> </w:t>
+      </w:r>
+      <w:r>
         <w:t xml:space="preserve">pero no tiene la MAC del gateway en su tabla ARP.</w:t>
       </w:r>
     </w:p>
@@ -525,27 +397,15 @@
         </w:numPr>
       </w:pPr>
       <w:r>
-        <w:rPr>
-          <w:lang w:val="es-ES"/>
-        </w:rPr>
         <w:t xml:space="preserve">La capa de enlace no puede construir la trama sin la MAC destino. Se</w:t>
       </w:r>
       <w:r>
-        <w:rPr>
-          <w:lang w:val="es-ES"/>
-        </w:rPr>
-        <w:t xml:space="preserve"> </w:t>
-      </w:r>
-      <w:r>
-        <w:rPr>
-          <w:lang w:val="es-ES"/>
-        </w:rPr>
+        <w:t xml:space="preserve"> </w:t>
+      </w:r>
+      <w:r>
         <w:t xml:space="preserve">“bloquea”</w:t>
       </w:r>
       <w:r>
-        <w:rPr>
-          <w:lang w:val="es-ES"/>
-        </w:rPr>
         <w:t xml:space="preserve">.</w:t>
       </w:r>
     </w:p>
@@ -558,61 +418,38 @@
         </w:numPr>
       </w:pPr>
       <w:r>
-        <w:rPr>
-          <w:lang w:val="es-ES"/>
-        </w:rPr>
         <w:t xml:space="preserve">Tu PC envía un paquete</w:t>
       </w:r>
       <w:r>
-        <w:rPr>
-          <w:lang w:val="es-ES"/>
-        </w:rPr>
-        <w:t xml:space="preserve"> </w:t>
-      </w:r>
-      <w:r>
-        <w:rPr>
-          <w:b/>
-          <w:bCs/>
-          <w:lang w:val="es-ES"/>
+        <w:t xml:space="preserve"> </w:t>
+      </w:r>
+      <w:r>
+        <w:rPr>
+          <w:b/>
+          <w:bCs/>
         </w:rPr>
         <w:t xml:space="preserve">ARP Request</w:t>
       </w:r>
       <w:r>
-        <w:rPr>
-          <w:lang w:val="es-ES"/>
-        </w:rPr>
-        <w:t xml:space="preserve"> </w:t>
-      </w:r>
-      <w:r>
-        <w:rPr>
-          <w:lang w:val="es-ES"/>
-        </w:rPr>
+        <w:t xml:space="preserve"> </w:t>
+      </w:r>
+      <w:r>
         <w:t xml:space="preserve">en broadcast:</w:t>
       </w:r>
       <w:r>
-        <w:rPr>
-          <w:lang w:val="es-ES"/>
-        </w:rPr>
         <w:t xml:space="preserve"> </w:t>
       </w:r>
       <w:r>
         <w:rPr>
           <w:i/>
           <w:iCs/>
-          <w:lang w:val="es-ES"/>
         </w:rPr>
         <w:t xml:space="preserve">“¿Quién tiene la IP 192.168.1.1?”</w:t>
       </w:r>
       <w:r>
-        <w:rPr>
-          <w:lang w:val="es-ES"/>
-        </w:rPr>
-        <w:t xml:space="preserve"> </w:t>
-      </w:r>
-      <w:r>
-        <w:rPr>
-          <w:lang w:val="es-ES"/>
-        </w:rPr>
+        <w:t xml:space="preserve"> </w:t>
+      </w:r>
+      <w:r>
         <w:t xml:space="preserve">— lo reciben todos los equipos de la subred.</w:t>
       </w:r>
     </w:p>
@@ -625,55 +462,35 @@
         </w:numPr>
       </w:pPr>
       <w:r>
-        <w:rPr>
-          <w:lang w:val="es-ES"/>
-        </w:rPr>
         <w:t xml:space="preserve">El router reconoce su IP y responde con un</w:t>
       </w:r>
       <w:r>
-        <w:rPr>
-          <w:lang w:val="es-ES"/>
-        </w:rPr>
-        <w:t xml:space="preserve"> </w:t>
-      </w:r>
-      <w:r>
-        <w:rPr>
-          <w:b/>
-          <w:bCs/>
-          <w:lang w:val="es-ES"/>
+        <w:t xml:space="preserve"> </w:t>
+      </w:r>
+      <w:r>
+        <w:rPr>
+          <w:b/>
+          <w:bCs/>
         </w:rPr>
         <w:t xml:space="preserve">ARP Reply</w:t>
       </w:r>
       <w:r>
-        <w:rPr>
-          <w:lang w:val="es-ES"/>
-        </w:rPr>
-        <w:t xml:space="preserve"> </w:t>
-      </w:r>
-      <w:r>
-        <w:rPr>
-          <w:lang w:val="es-ES"/>
-        </w:rPr>
+        <w:t xml:space="preserve"> </w:t>
+      </w:r>
+      <w:r>
         <w:t xml:space="preserve">en unicast:</w:t>
       </w:r>
       <w:r>
-        <w:rPr>
-          <w:lang w:val="es-ES"/>
-        </w:rPr>
         <w:t xml:space="preserve"> </w:t>
       </w:r>
       <w:r>
         <w:rPr>
           <w:i/>
           <w:iCs/>
-          <w:lang w:val="es-ES"/>
         </w:rPr>
         <w:t xml:space="preserve">“Yo, y mi MAC es aa:bb:cc:dd:ee:ff”</w:t>
       </w:r>
       <w:r>
-        <w:rPr>
-          <w:lang w:val="es-ES"/>
-        </w:rPr>
         <w:t xml:space="preserve">.</w:t>
       </w:r>
     </w:p>
@@ -686,9 +503,6 @@
         </w:numPr>
       </w:pPr>
       <w:r>
-        <w:rPr>
-          <w:lang w:val="es-ES"/>
-        </w:rPr>
         <w:t xml:space="preserve">Tu PC guarda la MAC en su tabla ARP y ahora sí puede construir la trama Ethernet con la MAC del gateway.</w:t>
       </w:r>
     </w:p>
@@ -701,9 +515,6 @@
         </w:numPr>
       </w:pPr>
       <w:r>
-        <w:rPr>
-          <w:lang w:val="es-ES"/>
-        </w:rPr>
         <w:t xml:space="preserve">El paquete de ping sale por la tarjeta de red hacia el router.</w:t>
       </w:r>
     </w:p>
@@ -712,9 +523,6 @@
         <w:pStyle w:val="FirstParagraph"/>
       </w:pPr>
       <w:r>
-        <w:rPr>
-          <w:lang w:val="es-ES"/>
-        </w:rPr>
         <w:t xml:space="preserve">Sin ARP, la capa 2 (Ethernet) no puede funcionar porque no sabe a quién enviar la trama.</w:t>
       </w:r>
     </w:p>
@@ -725,9 +533,6 @@
         <w:pStyle w:val="Heading2"/>
       </w:pPr>
       <w:r>
-        <w:rPr>
-          <w:lang w:val="es-ES"/>
-        </w:rPr>
         <w:t xml:space="preserve">4. Argumenta contra Conrad</w:t>
       </w:r>
     </w:p>
@@ -743,20 +548,13 @@
         <w:rPr>
           <w:b/>
           <w:bCs/>
-          <w:lang w:val="es-ES"/>
         </w:rPr>
         <w:t xml:space="preserve">Si reinicias todo, pierdes la información del fallo.</w:t>
       </w:r>
       <w:r>
-        <w:rPr>
-          <w:lang w:val="es-ES"/>
-        </w:rPr>
-        <w:t xml:space="preserve"> </w:t>
-      </w:r>
-      <w:r>
-        <w:rPr>
-          <w:lang w:val="es-ES"/>
-        </w:rPr>
+        <w:t xml:space="preserve"> </w:t>
+      </w:r>
+      <w:r>
         <w:t xml:space="preserve">El momento en que se produce el error es el mejor momento para capturar datos: logs, estado de las interfaces, tablas ARP. Si reinicias, todo se borra y el problema vuelve a aparecer sin pistas.</w:t>
       </w:r>
     </w:p>
@@ -772,44 +570,25 @@
         <w:rPr>
           <w:b/>
           <w:bCs/>
-          <w:lang w:val="es-ES"/>
         </w:rPr>
         <w:t xml:space="preserve">El reinicio es una solución temporal, no una solución real.</w:t>
       </w:r>
       <w:r>
-        <w:rPr>
-          <w:lang w:val="es-ES"/>
-        </w:rPr>
-        <w:t xml:space="preserve"> </w:t>
-      </w:r>
-      <w:r>
-        <w:rPr>
-          <w:lang w:val="es-ES"/>
-        </w:rPr>
+        <w:t xml:space="preserve"> </w:t>
+      </w:r>
+      <w:r>
         <w:t xml:space="preserve">Si el problema era un cable suelto, el reinicio</w:t>
       </w:r>
       <w:r>
-        <w:rPr>
-          <w:lang w:val="es-ES"/>
-        </w:rPr>
-        <w:t xml:space="preserve"> </w:t>
-      </w:r>
-      <w:r>
-        <w:rPr>
-          <w:lang w:val="es-ES"/>
-        </w:rPr>
+        <w:t xml:space="preserve"> </w:t>
+      </w:r>
+      <w:r>
         <w:t xml:space="preserve">“lo arregla”</w:t>
       </w:r>
       <w:r>
-        <w:rPr>
-          <w:lang w:val="es-ES"/>
-        </w:rPr>
-        <w:t xml:space="preserve"> </w:t>
-      </w:r>
-      <w:r>
-        <w:rPr>
-          <w:lang w:val="es-ES"/>
-        </w:rPr>
+        <w:t xml:space="preserve"> </w:t>
+      </w:r>
+      <w:r>
         <w:t xml:space="preserve">por casualidad (al volver a arrancar, se reestablece algo), pero la causa raíz sigue ahí y volverá a pasar.</w:t>
       </w:r>
     </w:p>
@@ -825,38 +604,22 @@
         <w:rPr>
           <w:b/>
           <w:bCs/>
-          <w:lang w:val="es-ES"/>
         </w:rPr>
         <w:t xml:space="preserve">El usuario necesita saber qué pasó.</w:t>
       </w:r>
       <w:r>
-        <w:rPr>
-          <w:lang w:val="es-ES"/>
-        </w:rPr>
-        <w:t xml:space="preserve"> </w:t>
-      </w:r>
-      <w:r>
-        <w:rPr>
-          <w:lang w:val="es-ES"/>
-        </w:rPr>
+        <w:t xml:space="preserve"> </w:t>
+      </w:r>
+      <w:r>
         <w:t xml:space="preserve">Si un profesor te llama y tú solo reinicias, la próxima vez lo hará él solo sin diagnosticar. Si le explicas</w:t>
       </w:r>
       <w:r>
-        <w:rPr>
-          <w:lang w:val="es-ES"/>
-        </w:rPr>
-        <w:t xml:space="preserve"> </w:t>
-      </w:r>
-      <w:r>
-        <w:rPr>
-          <w:lang w:val="es-ES"/>
-        </w:rPr>
+        <w:t xml:space="preserve"> </w:t>
+      </w:r>
+      <w:r>
         <w:t xml:space="preserve">“el cable estaba suelto”</w:t>
       </w:r>
       <w:r>
-        <w:rPr>
-          <w:lang w:val="es-ES"/>
-        </w:rPr>
         <w:t xml:space="preserve">, aprende y no te vuelve a llamar por lo mismo.</w:t>
       </w:r>
     </w:p>
@@ -867,9 +630,6 @@
         <w:pStyle w:val="Heading2"/>
       </w:pPr>
       <w:r>
-        <w:rPr>
-          <w:lang w:val="es-ES"/>
-        </w:rPr>
         <w:t xml:space="preserve">5. Diseña la red del aula</w:t>
       </w:r>
     </w:p>
@@ -881,20 +641,13 @@
         <w:rPr>
           <w:b/>
           <w:bCs/>
-          <w:lang w:val="es-ES"/>
         </w:rPr>
         <w:t xml:space="preserve">Topología:</w:t>
       </w:r>
       <w:r>
-        <w:rPr>
-          <w:lang w:val="es-ES"/>
-        </w:rPr>
-        <w:t xml:space="preserve"> </w:t>
-      </w:r>
-      <w:r>
-        <w:rPr>
-          <w:lang w:val="es-ES"/>
-        </w:rPr>
+        <w:t xml:space="preserve"> </w:t>
+      </w:r>
+      <w:r>
         <w:t xml:space="preserve">estrella (todos los PC conectados a un switch central).</w:t>
       </w:r>
     </w:p>
@@ -906,122 +659,73 @@
         <w:rPr>
           <w:b/>
           <w:bCs/>
-          <w:lang w:val="es-ES"/>
         </w:rPr>
         <w:t xml:space="preserve">Dispositivos necesarios:</w:t>
       </w:r>
       <w:r>
-        <w:rPr>
-          <w:lang w:val="es-ES"/>
-        </w:rPr>
-        <w:t xml:space="preserve"> </w:t>
-      </w:r>
-      <w:r>
-        <w:rPr>
-          <w:lang w:val="es-ES"/>
-        </w:rPr>
+        <w:t xml:space="preserve"> </w:t>
+      </w:r>
+      <w:r>
         <w:t xml:space="preserve">-</w:t>
       </w:r>
       <w:r>
-        <w:rPr>
-          <w:lang w:val="es-ES"/>
-        </w:rPr>
-        <w:t xml:space="preserve"> </w:t>
-      </w:r>
-      <w:r>
-        <w:rPr>
-          <w:b/>
-          <w:bCs/>
-          <w:lang w:val="es-ES"/>
+        <w:t xml:space="preserve"> </w:t>
+      </w:r>
+      <w:r>
+        <w:rPr>
+          <w:b/>
+          <w:bCs/>
         </w:rPr>
         <w:t xml:space="preserve">1 switch de 48 puertos</w:t>
       </w:r>
       <w:r>
-        <w:rPr>
-          <w:lang w:val="es-ES"/>
-        </w:rPr>
-        <w:t xml:space="preserve"> </w:t>
-      </w:r>
-      <w:r>
-        <w:rPr>
-          <w:lang w:val="es-ES"/>
-        </w:rPr>
+        <w:t xml:space="preserve"> </w:t>
+      </w:r>
+      <w:r>
         <w:t xml:space="preserve">(con 30 PC + 1 impresora = 31 puertos, sobran 17 para crecimiento). Un switch de 24 puertos no alcanza; necesitarías dos, lo que complica la instalación.</w:t>
       </w:r>
       <w:r>
-        <w:rPr>
-          <w:lang w:val="es-ES"/>
-        </w:rPr>
-        <w:t xml:space="preserve"> </w:t>
-      </w:r>
-      <w:r>
-        <w:rPr>
-          <w:lang w:val="es-ES"/>
-        </w:rPr>
+        <w:t xml:space="preserve"> </w:t>
+      </w:r>
+      <w:r>
         <w:t xml:space="preserve">-</w:t>
       </w:r>
       <w:r>
-        <w:rPr>
-          <w:lang w:val="es-ES"/>
-        </w:rPr>
-        <w:t xml:space="preserve"> </w:t>
-      </w:r>
-      <w:r>
-        <w:rPr>
-          <w:b/>
-          <w:bCs/>
-          <w:lang w:val="es-ES"/>
+        <w:t xml:space="preserve"> </w:t>
+      </w:r>
+      <w:r>
+        <w:rPr>
+          <w:b/>
+          <w:bCs/>
         </w:rPr>
         <w:t xml:space="preserve">1 router</w:t>
       </w:r>
       <w:r>
-        <w:rPr>
-          <w:lang w:val="es-ES"/>
-        </w:rPr>
-        <w:t xml:space="preserve"> </w:t>
-      </w:r>
-      <w:r>
-        <w:rPr>
-          <w:lang w:val="es-ES"/>
-        </w:rPr>
+        <w:t xml:space="preserve"> </w:t>
+      </w:r>
+      <w:r>
         <w:t xml:space="preserve">conectado a un puerto del switch para la salida a Internet.</w:t>
       </w:r>
       <w:r>
-        <w:rPr>
-          <w:lang w:val="es-ES"/>
-        </w:rPr>
-        <w:t xml:space="preserve"> </w:t>
-      </w:r>
-      <w:r>
-        <w:rPr>
-          <w:lang w:val="es-ES"/>
-        </w:rPr>
+        <w:t xml:space="preserve"> </w:t>
+      </w:r>
+      <w:r>
         <w:t xml:space="preserve">-</w:t>
       </w:r>
       <w:r>
-        <w:rPr>
-          <w:lang w:val="es-ES"/>
-        </w:rPr>
-        <w:t xml:space="preserve"> </w:t>
-      </w:r>
-      <w:r>
-        <w:rPr>
-          <w:b/>
-          <w:bCs/>
-          <w:lang w:val="es-ES"/>
+        <w:t xml:space="preserve"> </w:t>
+      </w:r>
+      <w:r>
+        <w:rPr>
+          <w:b/>
+          <w:bCs/>
         </w:rPr>
         <w:t xml:space="preserve">Cable UTP Cat6</w:t>
       </w:r>
       <w:r>
-        <w:rPr>
-          <w:lang w:val="es-ES"/>
-        </w:rPr>
-        <w:t xml:space="preserve"> </w:t>
-      </w:r>
-      <w:r>
-        <w:rPr>
-          <w:lang w:val="es-ES"/>
-        </w:rPr>
+        <w:t xml:space="preserve"> </w:t>
+      </w:r>
+      <w:r>
         <w:t xml:space="preserve">desde cada PC hasta el switch.</w:t>
       </w:r>
     </w:p>
@@ -1033,56 +737,31 @@
         <w:rPr>
           <w:b/>
           <w:bCs/>
-          <w:lang w:val="es-ES"/>
         </w:rPr>
         <w:t xml:space="preserve">Justificación:</w:t>
       </w:r>
       <w:r>
-        <w:rPr>
-          <w:lang w:val="es-ES"/>
-        </w:rPr>
-        <w:t xml:space="preserve"> </w:t>
-      </w:r>
-      <w:r>
-        <w:rPr>
-          <w:lang w:val="es-ES"/>
-        </w:rPr>
+        <w:t xml:space="preserve"> </w:t>
+      </w:r>
+      <w:r>
         <w:t xml:space="preserve">- El switch conecta todos los PC entre sí (capa 2).</w:t>
       </w:r>
       <w:r>
-        <w:rPr>
-          <w:lang w:val="es-ES"/>
-        </w:rPr>
-        <w:t xml:space="preserve"> </w:t>
-      </w:r>
-      <w:r>
-        <w:rPr>
-          <w:lang w:val="es-ES"/>
-        </w:rPr>
+        <w:t xml:space="preserve"> </w:t>
+      </w:r>
+      <w:r>
         <w:t xml:space="preserve">- El router une el aula con Internet (capa 3).</w:t>
       </w:r>
       <w:r>
-        <w:rPr>
-          <w:lang w:val="es-ES"/>
-        </w:rPr>
-        <w:t xml:space="preserve"> </w:t>
-      </w:r>
-      <w:r>
-        <w:rPr>
-          <w:lang w:val="es-ES"/>
-        </w:rPr>
+        <w:t xml:space="preserve"> </w:t>
+      </w:r>
+      <w:r>
         <w:t xml:space="preserve">- La impresora se conecta al switch y todos la alcanzan.</w:t>
       </w:r>
       <w:r>
-        <w:rPr>
-          <w:lang w:val="es-ES"/>
-        </w:rPr>
-        <w:t xml:space="preserve"> </w:t>
-      </w:r>
-      <w:r>
-        <w:rPr>
-          <w:lang w:val="es-ES"/>
-        </w:rPr>
+        <w:t xml:space="preserve"> </w:t>
+      </w:r>
+      <w:r>
         <w:t xml:space="preserve">- Con un solo switch de 48 puertos, la topología es simple, fácil de mantener y con margen para crecer.</w:t>
       </w:r>
     </w:p>
@@ -1093,9 +772,6 @@
         <w:pStyle w:val="Heading2"/>
       </w:pPr>
       <w:r>
-        <w:rPr>
-          <w:lang w:val="es-ES"/>
-        </w:rPr>
         <w:t xml:space="preserve">6. Mente binaria</w:t>
       </w:r>
     </w:p>
@@ -1108,29 +784,19 @@
         </w:numPr>
       </w:pPr>
       <w:r>
-        <w:rPr>
-          <w:lang w:val="es-ES"/>
-        </w:rPr>
         <w:t xml:space="preserve">4 bytes × 8 bits/byte =</w:t>
       </w:r>
       <w:r>
-        <w:rPr>
-          <w:lang w:val="es-ES"/>
-        </w:rPr>
-        <w:t xml:space="preserve"> </w:t>
-      </w:r>
-      <w:r>
-        <w:rPr>
-          <w:b/>
-          <w:bCs/>
-          <w:lang w:val="es-ES"/>
+        <w:t xml:space="preserve"> </w:t>
+      </w:r>
+      <w:r>
+        <w:rPr>
+          <w:b/>
+          <w:bCs/>
         </w:rPr>
         <w:t xml:space="preserve">32 bits</w:t>
       </w:r>
       <w:r>
-        <w:rPr>
-          <w:lang w:val="es-ES"/>
-        </w:rPr>
         <w:t xml:space="preserve">.</w:t>
       </w:r>
     </w:p>
@@ -1143,29 +809,19 @@
         </w:numPr>
       </w:pPr>
       <w:r>
-        <w:rPr>
-          <w:lang w:val="es-ES"/>
-        </w:rPr>
         <w:t xml:space="preserve">320 bits ÷ 8 bits/byte =</w:t>
       </w:r>
       <w:r>
-        <w:rPr>
-          <w:lang w:val="es-ES"/>
-        </w:rPr>
-        <w:t xml:space="preserve"> </w:t>
-      </w:r>
-      <w:r>
-        <w:rPr>
-          <w:b/>
-          <w:bCs/>
-          <w:lang w:val="es-ES"/>
+        <w:t xml:space="preserve"> </w:t>
+      </w:r>
+      <w:r>
+        <w:rPr>
+          <w:b/>
+          <w:bCs/>
         </w:rPr>
         <w:t xml:space="preserve">40 bytes</w:t>
       </w:r>
       <w:r>
-        <w:rPr>
-          <w:lang w:val="es-ES"/>
-        </w:rPr>
         <w:t xml:space="preserve">.</w:t>
       </w:r>
     </w:p>
@@ -1178,29 +834,19 @@
         </w:numPr>
       </w:pPr>
       <w:r>
-        <w:rPr>
-          <w:lang w:val="es-ES"/>
-        </w:rPr>
         <w:t xml:space="preserve">4 letras = 4 bytes; 4 × 8 =</w:t>
       </w:r>
       <w:r>
-        <w:rPr>
-          <w:lang w:val="es-ES"/>
-        </w:rPr>
-        <w:t xml:space="preserve"> </w:t>
-      </w:r>
-      <w:r>
-        <w:rPr>
-          <w:b/>
-          <w:bCs/>
-          <w:lang w:val="es-ES"/>
+        <w:t xml:space="preserve"> </w:t>
+      </w:r>
+      <w:r>
+        <w:rPr>
+          <w:b/>
+          <w:bCs/>
         </w:rPr>
         <w:t xml:space="preserve">32 bits</w:t>
       </w:r>
       <w:r>
-        <w:rPr>
-          <w:lang w:val="es-ES"/>
-        </w:rPr>
         <w:t xml:space="preserve">.</w:t>
       </w:r>
     </w:p>
@@ -1211,9 +857,6 @@
         <w:pStyle w:val="Heading2"/>
       </w:pPr>
       <w:r>
-        <w:rPr>
-          <w:lang w:val="es-ES"/>
-        </w:rPr>
         <w:t xml:space="preserve">7. El mapa del curso</w:t>
       </w:r>
     </w:p>
@@ -1229,20 +872,13 @@
         <w:rPr>
           <w:b/>
           <w:bCs/>
-          <w:lang w:val="es-ES"/>
         </w:rPr>
         <w:t xml:space="preserve">Sin saber qué es una red, no sabrías para qué configuras cada aparato.</w:t>
       </w:r>
       <w:r>
-        <w:rPr>
-          <w:lang w:val="es-ES"/>
-        </w:rPr>
-        <w:t xml:space="preserve"> </w:t>
-      </w:r>
-      <w:r>
-        <w:rPr>
-          <w:lang w:val="es-ES"/>
-        </w:rPr>
+        <w:t xml:space="preserve"> </w:t>
+      </w:r>
+      <w:r>
         <w:t xml:space="preserve">Si no conoces las 4 piezas (dispositivos finales, de interconexión, medio, protocolos), configurar un switch o un router sería como girar una llave sin saber qué puerta abre.</w:t>
       </w:r>
     </w:p>
@@ -1258,20 +894,13 @@
         <w:rPr>
           <w:b/>
           <w:bCs/>
-          <w:lang w:val="es-ES"/>
         </w:rPr>
         <w:t xml:space="preserve">El método de diagnóstico en capas lo usarás en cada laboratorio del curso.</w:t>
       </w:r>
       <w:r>
-        <w:rPr>
-          <w:lang w:val="es-ES"/>
-        </w:rPr>
-        <w:t xml:space="preserve"> </w:t>
-      </w:r>
-      <w:r>
-        <w:rPr>
-          <w:lang w:val="es-ES"/>
-        </w:rPr>
+        <w:t xml:space="preserve"> </w:t>
+      </w:r>
+      <w:r>
         <w:t xml:space="preserve">Desde la UD1 hasta la UD1, cada vez que algo falle, volverás a la escalera del ping. Aprenderlo primero te da una herramienta que acompaña todo el curso.</w:t>
       </w:r>
     </w:p>
@@ -1282,9 +911,6 @@
         <w:pStyle w:val="Heading2"/>
       </w:pPr>
       <w:r>
-        <w:rPr>
-          <w:lang w:val="es-ES"/>
-        </w:rPr>
         <w:t xml:space="preserve">8. El entorno de trabajo: Preparación del taller virtual</w:t>
       </w:r>
     </w:p>
@@ -1299,20 +925,13 @@
         <w:rPr>
           <w:b/>
           <w:bCs/>
-          <w:lang w:val="es-ES"/>
         </w:rPr>
         <w:t xml:space="preserve">Por qué usar un simulador:</w:t>
       </w:r>
       <w:r>
-        <w:rPr>
-          <w:lang w:val="es-ES"/>
-        </w:rPr>
-        <w:t xml:space="preserve"> </w:t>
-      </w:r>
-      <w:r>
-        <w:rPr>
-          <w:lang w:val="es-ES"/>
-        </w:rPr>
+        <w:t xml:space="preserve"> </w:t>
+      </w:r>
+      <w:r>
         <w:t xml:space="preserve">Packet Tracer es el entorno virtual gratuito para estudiantes que nos permite arrastrar dispositivos, simular tráfico y probar configuraciones complejas sin el riesgo de apagar una red real, romper hardware costoso o interrumpir el trabajo de otros usuarios. Es la herramienta indispensable para aprender aplicando la regla de oro: primero hazlo, luego entiéndelo.</w:t>
       </w:r>
     </w:p>
@@ -1327,20 +946,13 @@
         <w:rPr>
           <w:b/>
           <w:bCs/>
-          <w:lang w:val="es-ES"/>
         </w:rPr>
         <w:t xml:space="preserve">Protocolo ante incidencias de instalación:</w:t>
       </w:r>
       <w:r>
-        <w:rPr>
-          <w:lang w:val="es-ES"/>
-        </w:rPr>
-        <w:t xml:space="preserve"> </w:t>
-      </w:r>
-      <w:r>
-        <w:rPr>
-          <w:lang w:val="es-ES"/>
-        </w:rPr>
+        <w:t xml:space="preserve"> </w:t>
+      </w:r>
+      <w:r>
         <w:t xml:space="preserve">Si el simulador no arranca o da problemas al iniciar sesión con la cuenta de la Cisco Networking Academy, el administrador no recurre al azar ni formatea el equipo. El procedimiento consiste en: verificar los requisitos del sistema operativo, comprobar la conexión a Internet que valida las credenciales y, en caso de persistir el error, documentar el mensaje exacto de la excepción y compartirlo de forma estructurada en el Foro de la Unidad de la plataforma para solucionarlo de manera colaborativa y asíncrona.</w:t>
       </w:r>
     </w:p>

</xml_diff>

<commit_message>
Mueve Packet Tracer a capa de enlace, añade topologías y diagramas U02/U03
- Renombra los boletines Packet Tracer de medios a capa de enlace y los
  reescribe con enfoque capa 2 (repaso de cableado con cross-links)
- Nuevo punto 08 "Topologías de red" (punto a punto, bus, anillo, estrella,
  malla, híbrida) con 6 diagramas; el cierre pasa a 09
- Diagramas nuevos: estructura MAC y flujo de encapsulación en capa de enlace
- Actualiza sidebar, índices, AGENTS.md y README; regenera DOCX (73) y EPUB
</commit_message>
<xml_diff>
--- a/docx/01-introduccion/boletin-U01-avanzado-resuelto.docx
+++ b/docx/01-introduccion/boletin-U01-avanzado-resuelto.docx
@@ -28,7 +28,7 @@
         </w:p>
       </w:sdtContent>
     </w:sdt>
-    <w:bookmarkStart w:id="9" w:name="X4858feb35e1492c05c4211374ee048c1425a805"/>
+    <w:bookmarkStart w:id="20" w:name="X4858feb35e1492c05c4211374ee048c1425a805"/>
     <w:p>
       <w:pPr>
         <w:pStyle w:val="Heading1"/>
@@ -37,8 +37,8 @@
         <w:t xml:space="preserve">Boletín de Introducción — Avanzado (Resuelto)</w:t>
       </w:r>
     </w:p>
-    <w:bookmarkEnd w:id="9"/>
-    <w:bookmarkStart w:id="18" w:name="X68d80aaea901b11f50f84b58517a0e5cee3e834"/>
+    <w:bookmarkEnd w:id="20"/>
+    <w:bookmarkStart w:id="29" w:name="X68d80aaea901b11f50f84b58517a0e5cee3e834"/>
     <w:p>
       <w:pPr>
         <w:pStyle w:val="Heading1"/>
@@ -54,7 +54,7 @@
         </w:pict>
       </w:r>
     </w:p>
-    <w:bookmarkStart w:id="10" w:name="diagnóstico-completo-no-tengo-internet"/>
+    <w:bookmarkStart w:id="21" w:name="diagnóstico-completo-no-tengo-internet"/>
     <w:p>
       <w:pPr>
         <w:pStyle w:val="Heading2"/>
@@ -66,7 +66,13 @@
         <w:t xml:space="preserve"> </w:t>
       </w:r>
       <w:r>
-        <w:t xml:space="preserve">“No tengo Internet”</w:t>
+        <w:t xml:space="preserve">“</w:t>
+      </w:r>
+      <w:r>
+        <w:t xml:space="preserve">No tengo Internet</w:t>
+      </w:r>
+      <w:r>
+        <w:t xml:space="preserve">”</w:t>
       </w:r>
     </w:p>
     <w:p>
@@ -235,8 +241,8 @@
         <w:t xml:space="preserve">. No necesitas mirar los de arriba.</w:t>
       </w:r>
     </w:p>
-    <w:bookmarkEnd w:id="10"/>
-    <w:bookmarkStart w:id="11" w:name="la-historia-de-un-paquete"/>
+    <w:bookmarkEnd w:id="21"/>
+    <w:bookmarkStart w:id="22" w:name="la-historia-de-un-paquete"/>
     <w:p>
       <w:pPr>
         <w:pStyle w:val="Heading2"/>
@@ -342,8 +348,8 @@
         <w:t xml:space="preserve">el navegador envía una petición HTTP GET al servidor de Google. El servidor responde con el HTML de la página, que viaja de vuelta en múltiples paquetes.</w:t>
       </w:r>
     </w:p>
-    <w:bookmarkEnd w:id="11"/>
-    <w:bookmarkStart w:id="12" w:name="arp-el-protocolo-olvidado"/>
+    <w:bookmarkEnd w:id="22"/>
+    <w:bookmarkStart w:id="23" w:name="arp-el-protocolo-olvidado"/>
     <w:p>
       <w:pPr>
         <w:pStyle w:val="Heading2"/>
@@ -394,7 +400,13 @@
         <w:t xml:space="preserve"> </w:t>
       </w:r>
       <w:r>
-        <w:t xml:space="preserve">“bloquea”</w:t>
+        <w:t xml:space="preserve">“</w:t>
+      </w:r>
+      <w:r>
+        <w:t xml:space="preserve">bloquea</w:t>
+      </w:r>
+      <w:r>
+        <w:t xml:space="preserve">”</w:t>
       </w:r>
       <w:r>
         <w:t xml:space="preserve">.</w:t>
@@ -435,7 +447,21 @@
           <w:i/>
           <w:iCs/>
         </w:rPr>
-        <w:t xml:space="preserve">“¿Quién tiene la IP 192.168.1.1?”</w:t>
+        <w:t xml:space="preserve">“</w:t>
+      </w:r>
+      <w:r>
+        <w:rPr>
+          <w:i/>
+          <w:iCs/>
+        </w:rPr>
+        <w:t xml:space="preserve">¿Quién tiene la IP 192.168.1.1?</w:t>
+      </w:r>
+      <w:r>
+        <w:rPr>
+          <w:i/>
+          <w:iCs/>
+        </w:rPr>
+        <w:t xml:space="preserve">”</w:t>
       </w:r>
       <w:r>
         <w:t xml:space="preserve"> </w:t>
@@ -479,7 +505,21 @@
           <w:i/>
           <w:iCs/>
         </w:rPr>
-        <w:t xml:space="preserve">“Yo, y mi MAC es aa:bb:cc:dd:ee:ff”</w:t>
+        <w:t xml:space="preserve">“</w:t>
+      </w:r>
+      <w:r>
+        <w:rPr>
+          <w:i/>
+          <w:iCs/>
+        </w:rPr>
+        <w:t xml:space="preserve">Yo, y mi MAC es aa:bb:cc:dd:ee:ff</w:t>
+      </w:r>
+      <w:r>
+        <w:rPr>
+          <w:i/>
+          <w:iCs/>
+        </w:rPr>
+        <w:t xml:space="preserve">”</w:t>
       </w:r>
       <w:r>
         <w:t xml:space="preserve">.</w:t>
@@ -517,8 +557,8 @@
         <w:t xml:space="preserve">Sin ARP, la capa 2 (Ethernet) no puede funcionar porque no sabe a quién enviar la trama.</w:t>
       </w:r>
     </w:p>
-    <w:bookmarkEnd w:id="12"/>
-    <w:bookmarkStart w:id="13" w:name="argumenta-contra-conrad"/>
+    <w:bookmarkEnd w:id="23"/>
+    <w:bookmarkStart w:id="24" w:name="argumenta-contra-conrad"/>
     <w:p>
       <w:pPr>
         <w:pStyle w:val="Heading2"/>
@@ -574,7 +614,13 @@
         <w:t xml:space="preserve"> </w:t>
       </w:r>
       <w:r>
-        <w:t xml:space="preserve">“lo arregla”</w:t>
+        <w:t xml:space="preserve">“</w:t>
+      </w:r>
+      <w:r>
+        <w:t xml:space="preserve">lo arregla</w:t>
+      </w:r>
+      <w:r>
+        <w:t xml:space="preserve">”</w:t>
       </w:r>
       <w:r>
         <w:t xml:space="preserve"> </w:t>
@@ -608,14 +654,20 @@
         <w:t xml:space="preserve"> </w:t>
       </w:r>
       <w:r>
-        <w:t xml:space="preserve">“el cable estaba suelto”</w:t>
+        <w:t xml:space="preserve">“</w:t>
+      </w:r>
+      <w:r>
+        <w:t xml:space="preserve">el cable estaba suelto</w:t>
+      </w:r>
+      <w:r>
+        <w:t xml:space="preserve">”</w:t>
       </w:r>
       <w:r>
         <w:t xml:space="preserve">, aprende y no te vuelve a llamar por lo mismo.</w:t>
       </w:r>
     </w:p>
-    <w:bookmarkEnd w:id="13"/>
-    <w:bookmarkStart w:id="14" w:name="diseña-la-red-del-aula"/>
+    <w:bookmarkEnd w:id="24"/>
+    <w:bookmarkStart w:id="25" w:name="diseña-la-red-del-aula"/>
     <w:p>
       <w:pPr>
         <w:pStyle w:val="Heading2"/>
@@ -756,8 +808,8 @@
         <w:t xml:space="preserve">- Con un solo switch de 48 puertos, la topología es simple, fácil de mantener y con margen para crecer.</w:t>
       </w:r>
     </w:p>
-    <w:bookmarkEnd w:id="14"/>
-    <w:bookmarkStart w:id="15" w:name="mente-binaria"/>
+    <w:bookmarkEnd w:id="25"/>
+    <w:bookmarkStart w:id="26" w:name="mente-binaria"/>
     <w:p>
       <w:pPr>
         <w:pStyle w:val="Heading2"/>
@@ -851,8 +903,8 @@
         <w:t xml:space="preserve">, no KB (2.560 KB serían 2.621.440 bytes). Su número es correcto pero la etiqueta es falsa.</w:t>
       </w:r>
     </w:p>
-    <w:bookmarkEnd w:id="15"/>
-    <w:bookmarkStart w:id="16" w:name="el-mapa-del-curso"/>
+    <w:bookmarkEnd w:id="26"/>
+    <w:bookmarkStart w:id="27" w:name="el-mapa-del-curso"/>
     <w:p>
       <w:pPr>
         <w:pStyle w:val="Heading2"/>
@@ -905,8 +957,8 @@
         <w:t xml:space="preserve">Durante todo el curso, cada vez que algo falle, volverás a la escalera del ping. Aprenderlo primero te da una herramienta que acompaña todo el curso.</w:t>
       </w:r>
     </w:p>
-    <w:bookmarkEnd w:id="16"/>
-    <w:bookmarkStart w:id="17" w:name="Xc8e5910c22462a634687887ceb7faf0b5be8d57"/>
+    <w:bookmarkEnd w:id="27"/>
+    <w:bookmarkStart w:id="28" w:name="Xc8e5910c22462a634687887ceb7faf0b5be8d57"/>
     <w:p>
       <w:pPr>
         <w:pStyle w:val="Heading2"/>
@@ -957,13 +1009,9 @@
         <w:t xml:space="preserve">Si el simulador no arranca o da problemas al iniciar sesión con la cuenta de la Cisco Networking Academy, el administrador no recurre al azar ni formatea el equipo. El procedimiento consiste en: verificar los requisitos del sistema operativo, comprobar la conexión a Internet que valida las credenciales y, en caso de persistir el error, documentar el mensaje exacto de la excepción con captura de pantalla y los pasos que diste hasta el fallo, y pedir ayuda con todo eso delante (al profesor o en el foro del aula virtual), para que quien te ayude pueda reproducirlo sin preguntarte lo mismo dos veces.</w:t>
       </w:r>
     </w:p>
-    <w:bookmarkEnd w:id="17"/>
-    <w:bookmarkEnd w:id="18"/>
-    <w:sectPr>
-      <w:footnotePr>
-        <w:numRestart w:val="eachSect"/>
-      </w:footnotePr>
-    </w:sectPr>
+    <w:bookmarkEnd w:id="28"/>
+    <w:bookmarkEnd w:id="29"/>
+    <w:sectPr/>
   </w:body>
 </w:document>
 </file>
@@ -1001,7 +1049,7 @@
       <w:lvlText w:val=" "/>
       <w:lvlJc w:val="left"/>
       <w:pPr>
-        <w:ind w:left="720" w:hanging="360"/>
+        <w:ind w:left="720" w:hanging="480"/>
       </w:pPr>
     </w:lvl>
     <w:lvl w:ilvl="1">
@@ -1009,7 +1057,7 @@
       <w:lvlText w:val=" "/>
       <w:lvlJc w:val="left"/>
       <w:pPr>
-        <w:ind w:left="1440" w:hanging="360"/>
+        <w:ind w:left="1440" w:hanging="480"/>
       </w:pPr>
     </w:lvl>
     <w:lvl w:ilvl="2">
@@ -1017,7 +1065,7 @@
       <w:lvlText w:val=" "/>
       <w:lvlJc w:val="left"/>
       <w:pPr>
-        <w:ind w:left="2160" w:hanging="360"/>
+        <w:ind w:left="2160" w:hanging="480"/>
       </w:pPr>
     </w:lvl>
     <w:lvl w:ilvl="3">
@@ -1025,7 +1073,7 @@
       <w:lvlText w:val=" "/>
       <w:lvlJc w:val="left"/>
       <w:pPr>
-        <w:ind w:left="2880" w:hanging="360"/>
+        <w:ind w:left="2880" w:hanging="480"/>
       </w:pPr>
     </w:lvl>
     <w:lvl w:ilvl="4">
@@ -1033,7 +1081,7 @@
       <w:lvlText w:val=" "/>
       <w:lvlJc w:val="left"/>
       <w:pPr>
-        <w:ind w:left="3600" w:hanging="360"/>
+        <w:ind w:left="3600" w:hanging="480"/>
       </w:pPr>
     </w:lvl>
     <w:lvl w:ilvl="5">
@@ -1041,7 +1089,7 @@
       <w:lvlText w:val=" "/>
       <w:lvlJc w:val="left"/>
       <w:pPr>
-        <w:ind w:left="4320" w:hanging="360"/>
+        <w:ind w:left="4320" w:hanging="480"/>
       </w:pPr>
     </w:lvl>
     <w:lvl w:ilvl="6">
@@ -1049,7 +1097,7 @@
       <w:lvlText w:val=" "/>
       <w:lvlJc w:val="left"/>
       <w:pPr>
-        <w:ind w:left="5040" w:hanging="360"/>
+        <w:ind w:left="5040" w:hanging="480"/>
       </w:pPr>
     </w:lvl>
     <w:lvl w:ilvl="7">
@@ -1057,7 +1105,7 @@
       <w:lvlText w:val=" "/>
       <w:lvlJc w:val="left"/>
       <w:pPr>
-        <w:ind w:left="5760" w:hanging="360"/>
+        <w:ind w:left="5760" w:hanging="480"/>
       </w:pPr>
     </w:lvl>
     <w:lvl w:ilvl="8">
@@ -1065,7 +1113,7 @@
       <w:lvlText w:val=" "/>
       <w:lvlJc w:val="left"/>
       <w:pPr>
-        <w:ind w:left="6480" w:hanging="360"/>
+        <w:ind w:left="6480" w:hanging="480"/>
       </w:pPr>
     </w:lvl>
   </w:abstractNum>
@@ -1078,7 +1126,7 @@
       <w:lvlText w:val="%1."/>
       <w:lvlJc w:val="left"/>
       <w:pPr>
-        <w:ind w:left="720" w:hanging="360"/>
+        <w:ind w:left="720" w:hanging="480"/>
       </w:pPr>
     </w:lvl>
     <w:lvl w:ilvl="1">
@@ -1087,7 +1135,7 @@
       <w:lvlText w:val="%2."/>
       <w:lvlJc w:val="left"/>
       <w:pPr>
-        <w:ind w:left="1440" w:hanging="360"/>
+        <w:ind w:left="1440" w:hanging="480"/>
       </w:pPr>
     </w:lvl>
     <w:lvl w:ilvl="2">
@@ -1096,7 +1144,7 @@
       <w:lvlText w:val="%3."/>
       <w:lvlJc w:val="left"/>
       <w:pPr>
-        <w:ind w:left="2160" w:hanging="360"/>
+        <w:ind w:left="2160" w:hanging="480"/>
       </w:pPr>
     </w:lvl>
     <w:lvl w:ilvl="3">
@@ -1105,7 +1153,7 @@
       <w:lvlText w:val="%4."/>
       <w:lvlJc w:val="left"/>
       <w:pPr>
-        <w:ind w:left="2880" w:hanging="360"/>
+        <w:ind w:left="2880" w:hanging="480"/>
       </w:pPr>
     </w:lvl>
     <w:lvl w:ilvl="4">
@@ -1114,7 +1162,7 @@
       <w:lvlText w:val="%5."/>
       <w:lvlJc w:val="left"/>
       <w:pPr>
-        <w:ind w:left="3600" w:hanging="360"/>
+        <w:ind w:left="3600" w:hanging="480"/>
       </w:pPr>
     </w:lvl>
     <w:lvl w:ilvl="5">
@@ -1123,7 +1171,7 @@
       <w:lvlText w:val="%6."/>
       <w:lvlJc w:val="left"/>
       <w:pPr>
-        <w:ind w:left="4320" w:hanging="360"/>
+        <w:ind w:left="4320" w:hanging="480"/>
       </w:pPr>
     </w:lvl>
     <w:lvl w:ilvl="6">
@@ -1132,7 +1180,7 @@
       <w:lvlText w:val="%7."/>
       <w:lvlJc w:val="left"/>
       <w:pPr>
-        <w:ind w:left="5040" w:hanging="360"/>
+        <w:ind w:left="5040" w:hanging="480"/>
       </w:pPr>
     </w:lvl>
     <w:lvl w:ilvl="7">
@@ -1141,7 +1189,7 @@
       <w:lvlText w:val="%8."/>
       <w:lvlJc w:val="left"/>
       <w:pPr>
-        <w:ind w:left="5760" w:hanging="360"/>
+        <w:ind w:left="5760" w:hanging="480"/>
       </w:pPr>
     </w:lvl>
     <w:lvl w:ilvl="8">
@@ -1150,7 +1198,7 @@
       <w:lvlText w:val="%9."/>
       <w:lvlJc w:val="left"/>
       <w:pPr>
-        <w:ind w:left="6480" w:hanging="360"/>
+        <w:ind w:left="6480" w:hanging="480"/>
       </w:pPr>
     </w:lvl>
   </w:abstractNum>
@@ -1163,7 +1211,7 @@
       <w:lvlText w:val="%1)"/>
       <w:lvlJc w:val="left"/>
       <w:pPr>
-        <w:ind w:left="720" w:hanging="360"/>
+        <w:ind w:left="720" w:hanging="480"/>
       </w:pPr>
     </w:lvl>
     <w:lvl w:ilvl="1">
@@ -1172,7 +1220,7 @@
       <w:lvlText w:val="%2)"/>
       <w:lvlJc w:val="left"/>
       <w:pPr>
-        <w:ind w:left="1440" w:hanging="360"/>
+        <w:ind w:left="1440" w:hanging="480"/>
       </w:pPr>
     </w:lvl>
     <w:lvl w:ilvl="2">
@@ -1181,7 +1229,7 @@
       <w:lvlText w:val="%3)"/>
       <w:lvlJc w:val="left"/>
       <w:pPr>
-        <w:ind w:left="2160" w:hanging="360"/>
+        <w:ind w:left="2160" w:hanging="480"/>
       </w:pPr>
     </w:lvl>
     <w:lvl w:ilvl="3">
@@ -1190,7 +1238,7 @@
       <w:lvlText w:val="%4)"/>
       <w:lvlJc w:val="left"/>
       <w:pPr>
-        <w:ind w:left="2880" w:hanging="360"/>
+        <w:ind w:left="2880" w:hanging="480"/>
       </w:pPr>
     </w:lvl>
     <w:lvl w:ilvl="4">
@@ -1199,7 +1247,7 @@
       <w:lvlText w:val="%5)"/>
       <w:lvlJc w:val="left"/>
       <w:pPr>
-        <w:ind w:left="3600" w:hanging="360"/>
+        <w:ind w:left="3600" w:hanging="480"/>
       </w:pPr>
     </w:lvl>
     <w:lvl w:ilvl="5">
@@ -1208,7 +1256,7 @@
       <w:lvlText w:val="%6)"/>
       <w:lvlJc w:val="left"/>
       <w:pPr>
-        <w:ind w:left="4320" w:hanging="360"/>
+        <w:ind w:left="4320" w:hanging="480"/>
       </w:pPr>
     </w:lvl>
     <w:lvl w:ilvl="6">
@@ -1217,7 +1265,7 @@
       <w:lvlText w:val="%7)"/>
       <w:lvlJc w:val="left"/>
       <w:pPr>
-        <w:ind w:left="5040" w:hanging="360"/>
+        <w:ind w:left="5040" w:hanging="480"/>
       </w:pPr>
     </w:lvl>
     <w:lvl w:ilvl="7">
@@ -1226,7 +1274,7 @@
       <w:lvlText w:val="%8)"/>
       <w:lvlJc w:val="left"/>
       <w:pPr>
-        <w:ind w:left="5760" w:hanging="360"/>
+        <w:ind w:left="5760" w:hanging="480"/>
       </w:pPr>
     </w:lvl>
     <w:lvl w:ilvl="8">
@@ -1235,7 +1283,7 @@
       <w:lvlText w:val="%9)"/>
       <w:lvlJc w:val="left"/>
       <w:pPr>
-        <w:ind w:left="6480" w:hanging="360"/>
+        <w:ind w:left="6480" w:hanging="480"/>
       </w:pPr>
     </w:lvl>
   </w:abstractNum>
@@ -1460,10 +1508,10 @@
   <w:docDefaults>
     <w:rPrDefault>
       <w:rPr>
-        <w:rFonts w:asciiTheme="minorHAnsi" w:cstheme="minorBidi" w:eastAsiaTheme="minorEastAsia" w:hAnsiTheme="minorHAnsi"/>
+        <w:rFonts w:asciiTheme="minorHAnsi" w:cstheme="minorBidi" w:eastAsiaTheme="minorHAnsi" w:hAnsiTheme="minorHAnsi"/>
         <w:sz w:val="24"/>
         <w:szCs w:val="24"/>
-        <w:lang w:bidi="ar-SA" w:eastAsia="zh-CN" w:val="es-ES"/>
+        <w:lang w:bidi="ar-SA" w:eastAsia="en-US" w:val="es-ES"/>
       </w:rPr>
     </w:rPrDefault>
     <w:pPrDefault>
@@ -1504,94 +1552,57 @@
     <w:name w:val="Title"/>
     <w:basedOn w:val="Normal"/>
     <w:next w:val="BodyText"/>
-    <w:link w:val="TitleChar"/>
-    <w:uiPriority w:val="10"/>
     <w:qFormat/>
-    <w:rsid w:val="00A10FD9"/>
     <w:pPr>
-      <w:spacing w:after="80" w:line="240" w:lineRule="auto"/>
-      <w:contextualSpacing/>
+      <w:keepNext/>
+      <w:keepLines/>
+      <w:spacing w:after="240" w:before="480"/>
       <w:jc w:val="center"/>
     </w:pPr>
     <w:rPr>
       <w:rFonts w:asciiTheme="majorHAnsi" w:cstheme="majorBidi" w:eastAsiaTheme="majorEastAsia" w:hAnsiTheme="majorHAnsi"/>
-      <w:sz w:val="56"/>
-      <w:szCs w:val="56"/>
-    </w:rPr>
-  </w:style>
-  <w:style w:customStyle="1" w:styleId="TitleChar" w:type="character">
-    <w:name w:val="Title Char"/>
-    <w:basedOn w:val="DefaultParagraphFont"/>
-    <w:link w:val="Title"/>
-    <w:uiPriority w:val="10"/>
-    <w:rsid w:val="00A10FD9"/>
-    <w:rPr>
-      <w:rFonts w:asciiTheme="majorHAnsi" w:cstheme="majorBidi" w:eastAsiaTheme="majorEastAsia" w:hAnsiTheme="majorHAnsi"/>
-      <w:sz w:val="56"/>
-      <w:szCs w:val="56"/>
+      <w:b/>
+      <w:bCs/>
+      <w:color w:themeColor="accent1" w:themeShade="B5" w:val="345A8A"/>
+      <w:sz w:val="36"/>
+      <w:szCs w:val="36"/>
     </w:rPr>
   </w:style>
   <w:style w:styleId="Subtitle" w:type="paragraph">
     <w:name w:val="Subtitle"/>
-    <w:basedOn w:val="Title"/>
-    <w:next w:val="BodyText"/>
-    <w:link w:val="SubtitleChar"/>
-    <w:uiPriority w:val="11"/>
-    <w:qFormat/>
-    <w:rsid w:val="00A10FD9"/>
-    <w:pPr>
-      <w:numPr>
-        <w:ilvl w:val="1"/>
-      </w:numPr>
-    </w:pPr>
-    <w:rPr>
-      <w:rFonts w:cstheme="majorBidi" w:eastAsiaTheme="majorEastAsia"/>
-      <w:spacing w:val="15"/>
-      <w:sz w:val="28"/>
-      <w:szCs w:val="28"/>
-    </w:rPr>
-  </w:style>
-  <w:style w:customStyle="1" w:styleId="SubtitleChar" w:type="character">
-    <w:name w:val="Subtitle Char"/>
-    <w:basedOn w:val="DefaultParagraphFont"/>
-    <w:link w:val="Subtitle"/>
-    <w:uiPriority w:val="11"/>
-    <w:rsid w:val="00A10FD9"/>
-    <w:rPr>
-      <w:rFonts w:cstheme="majorBidi" w:eastAsiaTheme="majorEastAsia"/>
-      <w:color w:themeColor="text1" w:themeTint="A6" w:val="595959"/>
-      <w:spacing w:val="15"/>
-      <w:sz w:val="28"/>
-      <w:szCs w:val="28"/>
-    </w:rPr>
-  </w:style>
-  <w:style w:customStyle="1" w:styleId="Author" w:type="paragraph">
-    <w:name w:val="Author"/>
     <w:basedOn w:val="Title"/>
     <w:next w:val="BodyText"/>
     <w:qFormat/>
     <w:pPr>
       <w:keepNext/>
       <w:keepLines/>
+      <w:spacing w:after="240" w:before="240"/>
+      <w:jc w:val="center"/>
     </w:pPr>
     <w:rPr>
-      <w:sz w:val="24"/>
-      <w:szCs w:val="24"/>
-    </w:rPr>
-  </w:style>
-  <w:style w:styleId="Date" w:type="paragraph">
-    <w:name w:val="Date"/>
-    <w:basedOn w:val="Title"/>
+      <w:sz w:val="30"/>
+      <w:szCs w:val="30"/>
+    </w:rPr>
+  </w:style>
+  <w:style w:customStyle="1" w:styleId="Author" w:type="paragraph">
+    <w:name w:val="Author"/>
     <w:next w:val="BodyText"/>
     <w:qFormat/>
     <w:pPr>
       <w:keepNext/>
       <w:keepLines/>
+      <w:jc w:val="center"/>
     </w:pPr>
-    <w:rPr>
-      <w:sz w:val="24"/>
-      <w:szCs w:val="24"/>
-    </w:rPr>
+  </w:style>
+  <w:style w:styleId="Date" w:type="paragraph">
+    <w:name w:val="Date"/>
+    <w:next w:val="BodyText"/>
+    <w:qFormat/>
+    <w:pPr>
+      <w:keepNext/>
+      <w:keepLines/>
+      <w:jc w:val="center"/>
+    </w:pPr>
   </w:style>
   <w:style w:customStyle="1" w:styleId="AbstractTitle" w:type="paragraph">
     <w:name w:val="Abstract Title"/>
@@ -1606,6 +1617,7 @@
     </w:pPr>
     <w:rPr>
       <w:b/>
+      <w:color w:val="345A8A"/>
       <w:sz w:val="20"/>
       <w:szCs w:val="20"/>
     </w:rPr>
@@ -1634,321 +1646,191 @@
     <w:rPr/>
   </w:style>
   <w:style w:styleId="Heading1" w:type="paragraph">
-    <w:name w:val="heading 1"/>
+    <w:name w:val="Heading 1"/>
     <w:basedOn w:val="Normal"/>
     <w:next w:val="BodyText"/>
-    <w:link w:val="Heading1Char"/>
     <w:uiPriority w:val="9"/>
     <w:qFormat/>
-    <w:rsid w:val="00A10FD9"/>
     <w:pPr>
       <w:keepNext/>
       <w:keepLines/>
-      <w:spacing w:after="80" w:before="360"/>
+      <w:spacing w:after="0" w:before="480"/>
       <w:outlineLvl w:val="0"/>
     </w:pPr>
     <w:rPr>
       <w:rFonts w:asciiTheme="majorHAnsi" w:cstheme="majorBidi" w:eastAsiaTheme="majorEastAsia" w:hAnsiTheme="majorHAnsi"/>
-      <w:color w:themeColor="accent1" w:themeShade="BF" w:val="0F4761"/>
-      <w:sz w:val="40"/>
-      <w:szCs w:val="40"/>
+      <w:b/>
+      <w:bCs/>
+      <w:color w:themeColor="accent1" w:val="4F81BD"/>
+      <w:sz w:val="32"/>
+      <w:szCs w:val="32"/>
     </w:rPr>
   </w:style>
   <w:style w:styleId="Heading2" w:type="paragraph">
-    <w:name w:val="heading 2"/>
+    <w:name w:val="Heading 2"/>
     <w:basedOn w:val="Normal"/>
     <w:next w:val="BodyText"/>
-    <w:link w:val="Heading2Char"/>
     <w:uiPriority w:val="9"/>
-    <w:semiHidden/>
     <w:unhideWhenUsed/>
     <w:qFormat/>
-    <w:rsid w:val="00A10FD9"/>
     <w:pPr>
       <w:keepNext/>
       <w:keepLines/>
-      <w:spacing w:after="80" w:before="160"/>
+      <w:spacing w:after="0" w:before="200"/>
       <w:outlineLvl w:val="1"/>
     </w:pPr>
     <w:rPr>
       <w:rFonts w:asciiTheme="majorHAnsi" w:cstheme="majorBidi" w:eastAsiaTheme="majorEastAsia" w:hAnsiTheme="majorHAnsi"/>
-      <w:color w:themeColor="accent1" w:themeShade="BF" w:val="0F4761"/>
-      <w:sz w:val="32"/>
-      <w:szCs w:val="32"/>
+      <w:b/>
+      <w:bCs/>
+      <w:color w:themeColor="accent1" w:val="4F81BD"/>
+      <w:sz w:val="28"/>
+      <w:szCs w:val="28"/>
     </w:rPr>
   </w:style>
   <w:style w:styleId="Heading3" w:type="paragraph">
-    <w:name w:val="heading 3"/>
+    <w:name w:val="Heading 3"/>
     <w:basedOn w:val="Normal"/>
     <w:next w:val="BodyText"/>
-    <w:link w:val="Heading3Char"/>
     <w:uiPriority w:val="9"/>
-    <w:semiHidden/>
     <w:unhideWhenUsed/>
     <w:qFormat/>
-    <w:rsid w:val="00A10FD9"/>
     <w:pPr>
       <w:keepNext/>
       <w:keepLines/>
-      <w:spacing w:after="80" w:before="160"/>
+      <w:spacing w:after="0" w:before="200"/>
       <w:outlineLvl w:val="2"/>
     </w:pPr>
     <w:rPr>
-      <w:rFonts w:cstheme="majorBidi" w:eastAsiaTheme="majorEastAsia"/>
-      <w:color w:themeColor="accent1" w:themeShade="BF" w:val="0F4761"/>
-      <w:sz w:val="28"/>
-      <w:szCs w:val="28"/>
+      <w:rFonts w:asciiTheme="majorHAnsi" w:cstheme="majorBidi" w:eastAsiaTheme="majorEastAsia" w:hAnsiTheme="majorHAnsi"/>
+      <w:b/>
+      <w:bCs/>
+      <w:color w:themeColor="accent1" w:val="4F81BD"/>
+      <w:sz w:val="24"/>
+      <w:szCs w:val="24"/>
     </w:rPr>
   </w:style>
   <w:style w:styleId="Heading4" w:type="paragraph">
-    <w:name w:val="heading 4"/>
+    <w:name w:val="Heading 4"/>
     <w:basedOn w:val="Normal"/>
     <w:next w:val="BodyText"/>
-    <w:link w:val="Heading4Char"/>
     <w:uiPriority w:val="9"/>
-    <w:semiHidden/>
     <w:unhideWhenUsed/>
     <w:qFormat/>
-    <w:rsid w:val="00A10FD9"/>
     <w:pPr>
       <w:keepNext/>
       <w:keepLines/>
-      <w:spacing w:after="40" w:before="80"/>
+      <w:spacing w:after="0" w:before="200"/>
       <w:outlineLvl w:val="3"/>
     </w:pPr>
     <w:rPr>
-      <w:rFonts w:cstheme="majorBidi" w:eastAsiaTheme="majorEastAsia"/>
+      <w:rFonts w:asciiTheme="majorHAnsi" w:cstheme="majorBidi" w:eastAsiaTheme="majorEastAsia" w:hAnsiTheme="majorHAnsi"/>
+      <w:bCs/>
       <w:i/>
-      <w:iCs/>
-      <w:color w:themeColor="accent1" w:themeShade="BF" w:val="0F4761"/>
+      <w:color w:themeColor="accent1" w:val="4F81BD"/>
+      <w:sz w:val="24"/>
+      <w:szCs w:val="24"/>
     </w:rPr>
   </w:style>
   <w:style w:styleId="Heading5" w:type="paragraph">
-    <w:name w:val="heading 5"/>
+    <w:name w:val="Heading 5"/>
     <w:basedOn w:val="Normal"/>
     <w:next w:val="BodyText"/>
-    <w:link w:val="Heading5Char"/>
     <w:uiPriority w:val="9"/>
-    <w:semiHidden/>
     <w:unhideWhenUsed/>
     <w:qFormat/>
-    <w:rsid w:val="00A10FD9"/>
     <w:pPr>
       <w:keepNext/>
       <w:keepLines/>
-      <w:spacing w:after="40" w:before="80"/>
+      <w:spacing w:after="0" w:before="200"/>
       <w:outlineLvl w:val="4"/>
     </w:pPr>
     <w:rPr>
-      <w:rFonts w:cstheme="majorBidi" w:eastAsiaTheme="majorEastAsia"/>
-      <w:color w:themeColor="accent1" w:themeShade="BF" w:val="0F4761"/>
+      <w:rFonts w:asciiTheme="majorHAnsi" w:cstheme="majorBidi" w:eastAsiaTheme="majorEastAsia" w:hAnsiTheme="majorHAnsi"/>
+      <w:iCs/>
+      <w:color w:themeColor="accent1" w:val="4F81BD"/>
+      <w:sz w:val="24"/>
+      <w:szCs w:val="24"/>
     </w:rPr>
   </w:style>
   <w:style w:styleId="Heading6" w:type="paragraph">
-    <w:name w:val="heading 6"/>
+    <w:name w:val="Heading 6"/>
     <w:basedOn w:val="Normal"/>
     <w:next w:val="BodyText"/>
-    <w:link w:val="Heading6Char"/>
     <w:uiPriority w:val="9"/>
-    <w:semiHidden/>
     <w:unhideWhenUsed/>
     <w:qFormat/>
-    <w:rsid w:val="00A10FD9"/>
     <w:pPr>
       <w:keepNext/>
       <w:keepLines/>
-      <w:spacing w:after="0" w:before="40"/>
+      <w:spacing w:after="0" w:before="200"/>
       <w:outlineLvl w:val="5"/>
     </w:pPr>
     <w:rPr>
-      <w:rFonts w:cstheme="majorBidi" w:eastAsiaTheme="majorEastAsia"/>
-      <w:i/>
-      <w:iCs/>
-      <w:color w:themeColor="text1" w:themeTint="A6" w:val="595959"/>
+      <w:rFonts w:asciiTheme="majorHAnsi" w:cstheme="majorBidi" w:eastAsiaTheme="majorEastAsia" w:hAnsiTheme="majorHAnsi"/>
+      <w:color w:themeColor="accent1" w:val="4F81BD"/>
+      <w:sz w:val="24"/>
+      <w:szCs w:val="24"/>
     </w:rPr>
   </w:style>
   <w:style w:styleId="Heading7" w:type="paragraph">
-    <w:name w:val="heading 7"/>
+    <w:name w:val="Heading 7"/>
     <w:basedOn w:val="Normal"/>
     <w:next w:val="BodyText"/>
-    <w:link w:val="Heading7Char"/>
     <w:uiPriority w:val="9"/>
-    <w:semiHidden/>
     <w:unhideWhenUsed/>
     <w:qFormat/>
-    <w:rsid w:val="00A10FD9"/>
     <w:pPr>
       <w:keepNext/>
       <w:keepLines/>
-      <w:spacing w:after="0" w:before="40"/>
+      <w:spacing w:after="0" w:before="200"/>
       <w:outlineLvl w:val="6"/>
     </w:pPr>
     <w:rPr>
-      <w:rFonts w:cstheme="majorBidi" w:eastAsiaTheme="majorEastAsia"/>
-      <w:color w:themeColor="text1" w:themeTint="A6" w:val="595959"/>
+      <w:rFonts w:asciiTheme="majorHAnsi" w:cstheme="majorBidi" w:eastAsiaTheme="majorEastAsia" w:hAnsiTheme="majorHAnsi"/>
+      <w:color w:themeColor="accent1" w:val="4F81BD"/>
+      <w:sz w:val="24"/>
+      <w:szCs w:val="24"/>
     </w:rPr>
   </w:style>
   <w:style w:styleId="Heading8" w:type="paragraph">
-    <w:name w:val="heading 8"/>
+    <w:name w:val="Heading 8"/>
     <w:basedOn w:val="Normal"/>
     <w:next w:val="BodyText"/>
-    <w:link w:val="Heading8Char"/>
     <w:uiPriority w:val="9"/>
-    <w:semiHidden/>
     <w:unhideWhenUsed/>
     <w:qFormat/>
-    <w:rsid w:val="00A10FD9"/>
     <w:pPr>
       <w:keepNext/>
       <w:keepLines/>
-      <w:spacing w:after="0"/>
+      <w:spacing w:after="0" w:before="200"/>
       <w:outlineLvl w:val="7"/>
     </w:pPr>
     <w:rPr>
-      <w:rFonts w:cstheme="majorBidi" w:eastAsiaTheme="majorEastAsia"/>
-      <w:i/>
-      <w:iCs/>
-      <w:color w:themeColor="text1" w:themeTint="D8" w:val="272727"/>
+      <w:rFonts w:asciiTheme="majorHAnsi" w:cstheme="majorBidi" w:eastAsiaTheme="majorEastAsia" w:hAnsiTheme="majorHAnsi"/>
+      <w:color w:themeColor="accent1" w:val="4F81BD"/>
+      <w:sz w:val="24"/>
+      <w:szCs w:val="24"/>
     </w:rPr>
   </w:style>
   <w:style w:styleId="Heading9" w:type="paragraph">
-    <w:name w:val="heading 9"/>
+    <w:name w:val="Heading 9"/>
     <w:basedOn w:val="Normal"/>
     <w:next w:val="BodyText"/>
-    <w:link w:val="Heading9Char"/>
     <w:uiPriority w:val="9"/>
-    <w:semiHidden/>
     <w:unhideWhenUsed/>
     <w:qFormat/>
-    <w:rsid w:val="00A10FD9"/>
     <w:pPr>
       <w:keepNext/>
       <w:keepLines/>
-      <w:spacing w:after="0"/>
+      <w:spacing w:after="0" w:before="200"/>
       <w:outlineLvl w:val="8"/>
     </w:pPr>
     <w:rPr>
-      <w:rFonts w:cstheme="majorBidi" w:eastAsiaTheme="majorEastAsia"/>
-      <w:color w:themeColor="text1" w:themeTint="D8" w:val="272727"/>
-    </w:rPr>
-  </w:style>
-  <w:style w:customStyle="1" w:styleId="Heading1Char" w:type="character">
-    <w:name w:val="Heading 1 Char"/>
-    <w:basedOn w:val="DefaultParagraphFont"/>
-    <w:link w:val="Heading1"/>
-    <w:uiPriority w:val="9"/>
-    <w:rsid w:val="00A10FD9"/>
-    <w:rPr>
       <w:rFonts w:asciiTheme="majorHAnsi" w:cstheme="majorBidi" w:eastAsiaTheme="majorEastAsia" w:hAnsiTheme="majorHAnsi"/>
-      <w:color w:themeColor="accent1" w:themeShade="BF" w:val="0F4761"/>
-      <w:sz w:val="40"/>
-      <w:szCs w:val="40"/>
-    </w:rPr>
-  </w:style>
-  <w:style w:customStyle="1" w:styleId="Heading2Char" w:type="character">
-    <w:name w:val="Heading 2 Char"/>
-    <w:basedOn w:val="DefaultParagraphFont"/>
-    <w:link w:val="Heading2"/>
-    <w:uiPriority w:val="9"/>
-    <w:semiHidden/>
-    <w:rsid w:val="00A10FD9"/>
-    <w:rPr>
-      <w:rFonts w:asciiTheme="majorHAnsi" w:cstheme="majorBidi" w:eastAsiaTheme="majorEastAsia" w:hAnsiTheme="majorHAnsi"/>
-      <w:color w:themeColor="accent1" w:themeShade="BF" w:val="0F4761"/>
-      <w:sz w:val="32"/>
-      <w:szCs w:val="32"/>
-    </w:rPr>
-  </w:style>
-  <w:style w:customStyle="1" w:styleId="Heading3Char" w:type="character">
-    <w:name w:val="Heading 3 Char"/>
-    <w:basedOn w:val="DefaultParagraphFont"/>
-    <w:link w:val="Heading3"/>
-    <w:uiPriority w:val="9"/>
-    <w:semiHidden/>
-    <w:rsid w:val="00A10FD9"/>
-    <w:rPr>
-      <w:rFonts w:cstheme="majorBidi" w:eastAsiaTheme="majorEastAsia"/>
-      <w:color w:themeColor="accent1" w:themeShade="BF" w:val="0F4761"/>
-      <w:sz w:val="28"/>
-      <w:szCs w:val="28"/>
-    </w:rPr>
-  </w:style>
-  <w:style w:customStyle="1" w:styleId="Heading4Char" w:type="character">
-    <w:name w:val="Heading 4 Char"/>
-    <w:basedOn w:val="DefaultParagraphFont"/>
-    <w:link w:val="Heading4"/>
-    <w:uiPriority w:val="9"/>
-    <w:semiHidden/>
-    <w:rsid w:val="00A10FD9"/>
-    <w:rPr>
-      <w:rFonts w:cstheme="majorBidi" w:eastAsiaTheme="majorEastAsia"/>
-      <w:i/>
-      <w:iCs/>
-      <w:color w:themeColor="accent1" w:themeShade="BF" w:val="0F4761"/>
-    </w:rPr>
-  </w:style>
-  <w:style w:customStyle="1" w:styleId="Heading5Char" w:type="character">
-    <w:name w:val="Heading 5 Char"/>
-    <w:basedOn w:val="DefaultParagraphFont"/>
-    <w:link w:val="Heading5"/>
-    <w:uiPriority w:val="9"/>
-    <w:semiHidden/>
-    <w:rsid w:val="00A10FD9"/>
-    <w:rPr>
-      <w:rFonts w:cstheme="majorBidi" w:eastAsiaTheme="majorEastAsia"/>
-      <w:color w:themeColor="accent1" w:themeShade="BF" w:val="0F4761"/>
-    </w:rPr>
-  </w:style>
-  <w:style w:customStyle="1" w:styleId="Heading6Char" w:type="character">
-    <w:name w:val="Heading 6 Char"/>
-    <w:basedOn w:val="DefaultParagraphFont"/>
-    <w:link w:val="Heading6"/>
-    <w:uiPriority w:val="9"/>
-    <w:semiHidden/>
-    <w:rsid w:val="00A10FD9"/>
-    <w:rPr>
-      <w:rFonts w:cstheme="majorBidi" w:eastAsiaTheme="majorEastAsia"/>
-      <w:i/>
-      <w:iCs/>
-      <w:color w:themeColor="text1" w:themeTint="A6" w:val="595959"/>
-    </w:rPr>
-  </w:style>
-  <w:style w:customStyle="1" w:styleId="Heading7Char" w:type="character">
-    <w:name w:val="Heading 7 Char"/>
-    <w:basedOn w:val="DefaultParagraphFont"/>
-    <w:link w:val="Heading7"/>
-    <w:uiPriority w:val="9"/>
-    <w:semiHidden/>
-    <w:rsid w:val="00A10FD9"/>
-    <w:rPr>
-      <w:rFonts w:cstheme="majorBidi" w:eastAsiaTheme="majorEastAsia"/>
-      <w:color w:themeColor="text1" w:themeTint="A6" w:val="595959"/>
-    </w:rPr>
-  </w:style>
-  <w:style w:customStyle="1" w:styleId="Heading8Char" w:type="character">
-    <w:name w:val="Heading 8 Char"/>
-    <w:basedOn w:val="DefaultParagraphFont"/>
-    <w:link w:val="Heading8"/>
-    <w:uiPriority w:val="9"/>
-    <w:semiHidden/>
-    <w:rsid w:val="00A10FD9"/>
-    <w:rPr>
-      <w:rFonts w:cstheme="majorBidi" w:eastAsiaTheme="majorEastAsia"/>
-      <w:i/>
-      <w:iCs/>
-      <w:color w:themeColor="text1" w:themeTint="D8" w:val="272727"/>
-    </w:rPr>
-  </w:style>
-  <w:style w:customStyle="1" w:styleId="Heading9Char" w:type="character">
-    <w:name w:val="Heading 9 Char"/>
-    <w:basedOn w:val="DefaultParagraphFont"/>
-    <w:link w:val="Heading9"/>
-    <w:uiPriority w:val="9"/>
-    <w:semiHidden/>
-    <w:rsid w:val="00A10FD9"/>
-    <w:rPr>
-      <w:rFonts w:cstheme="majorBidi" w:eastAsiaTheme="majorEastAsia"/>
-      <w:color w:themeColor="text1" w:themeTint="D8" w:val="272727"/>
+      <w:color w:themeColor="accent1" w:val="4F81BD"/>
+      <w:sz w:val="24"/>
+      <w:szCs w:val="24"/>
     </w:rPr>
   </w:style>
   <w:style w:styleId="BlockText" w:type="paragraph">
@@ -1973,8 +1855,8 @@
   </w:style>
   <w:style w:styleId="FootnoteBlockText" w:type="paragraph">
     <w:name w:val="Footnote Block Text"/>
-    <w:basedOn w:val="FootnoteText"/>
-    <w:next w:val="FootnoteText"/>
+    <w:basedOn w:val="Footnote Text"/>
+    <w:next w:val="Footnote Text"/>
     <w:uiPriority w:val="9"/>
     <w:unhideWhenUsed/>
     <w:qFormat/>
@@ -2004,6 +1886,13 @@
       </w:tblCellMar>
     </w:tblPr>
     <w:tblStylePr w:type="firstRow">
+      <w:tblPr>
+        <w:jc w:val="left"/>
+        <w:tblInd w:type="dxa" w:w="0"/>
+      </w:tblPr>
+      <w:trPr>
+        <w:jc w:val="left"/>
+      </w:trPr>
       <w:tcPr>
         <w:tcBorders>
           <w:bottom w:val="single"/>
@@ -2359,44 +2248,44 @@
         <a:sysClr val="window" lastClr="FFFFFF"/>
       </a:lt1>
       <a:dk2>
-        <a:srgbClr val="0E2841"/>
+        <a:srgbClr val="1F497D"/>
       </a:dk2>
       <a:lt2>
-        <a:srgbClr val="E8E8E8"/>
+        <a:srgbClr val="EEECE1"/>
       </a:lt2>
       <a:accent1>
-        <a:srgbClr val="156082"/>
+        <a:srgbClr val="4F81BD"/>
       </a:accent1>
       <a:accent2>
-        <a:srgbClr val="E97132"/>
+        <a:srgbClr val="C0504D"/>
       </a:accent2>
       <a:accent3>
-        <a:srgbClr val="196B24"/>
+        <a:srgbClr val="9BBB59"/>
       </a:accent3>
       <a:accent4>
-        <a:srgbClr val="0F9ED5"/>
+        <a:srgbClr val="8064A2"/>
       </a:accent4>
       <a:accent5>
-        <a:srgbClr val="A02B93"/>
+        <a:srgbClr val="4BACC6"/>
       </a:accent5>
       <a:accent6>
-        <a:srgbClr val="4EA72E"/>
+        <a:srgbClr val="F79646"/>
       </a:accent6>
       <a:hlink>
-        <a:srgbClr val="467886"/>
+        <a:srgbClr val="0000FF"/>
       </a:hlink>
       <a:folHlink>
-        <a:srgbClr val="96607D"/>
+        <a:srgbClr val="800080"/>
       </a:folHlink>
     </a:clrScheme>
     <a:fontScheme name="Office">
       <a:majorFont>
-        <a:latin typeface="Aptos Display" panose="02110004020202020204"/>
+        <a:latin typeface="Calibri"/>
         <a:ea typeface=""/>
         <a:cs typeface=""/>
-        <a:font script="Jpan" typeface="游ゴシック Light"/>
+        <a:font script="Jpan" typeface="ＭＳ ゴシック"/>
         <a:font script="Hang" typeface="맑은 고딕"/>
-        <a:font script="Hans" typeface="等线 Light"/>
+        <a:font script="Hans" typeface="宋体"/>
         <a:font script="Hant" typeface="新細明體"/>
         <a:font script="Arab" typeface="Times New Roman"/>
         <a:font script="Hebr" typeface="Times New Roman"/>
@@ -2423,32 +2312,14 @@
         <a:font script="Mong" typeface="Mongolian Baiti"/>
         <a:font script="Viet" typeface="Times New Roman"/>
         <a:font script="Uigh" typeface="Microsoft Uighur"/>
-        <a:font script="Geor" typeface="Sylfaen"/>
-        <a:font script="Armn" typeface="Arial"/>
-        <a:font script="Bugi" typeface="Leelawadee UI"/>
-        <a:font script="Bopo" typeface="Microsoft JhengHei"/>
-        <a:font script="Java" typeface="Javanese Text"/>
-        <a:font script="Lisu" typeface="Segoe UI"/>
-        <a:font script="Mymr" typeface="Myanmar Text"/>
-        <a:font script="Nkoo" typeface="Ebrima"/>
-        <a:font script="Olck" typeface="Nirmala UI"/>
-        <a:font script="Osma" typeface="Ebrima"/>
-        <a:font script="Phag" typeface="Phagspa"/>
-        <a:font script="Syrn" typeface="Estrangelo Edessa"/>
-        <a:font script="Syrj" typeface="Estrangelo Edessa"/>
-        <a:font script="Syre" typeface="Estrangelo Edessa"/>
-        <a:font script="Sora" typeface="Nirmala UI"/>
-        <a:font script="Tale" typeface="Microsoft Tai Le"/>
-        <a:font script="Talu" typeface="Microsoft New Tai Lue"/>
-        <a:font script="Tfng" typeface="Ebrima"/>
       </a:majorFont>
       <a:minorFont>
-        <a:latin typeface="Aptos" panose="02110004020202020204"/>
+        <a:latin typeface="Cambria"/>
         <a:ea typeface=""/>
         <a:cs typeface=""/>
-        <a:font script="Jpan" typeface="游明朝"/>
+        <a:font script="Jpan" typeface="ＭＳ 明朝"/>
         <a:font script="Hang" typeface="맑은 고딕"/>
-        <a:font script="Hans" typeface="等线"/>
+        <a:font script="Hans" typeface="宋体"/>
         <a:font script="Hant" typeface="新細明體"/>
         <a:font script="Arab" typeface="Arial"/>
         <a:font script="Hebr" typeface="Arial"/>
@@ -2475,24 +2346,6 @@
         <a:font script="Mong" typeface="Mongolian Baiti"/>
         <a:font script="Viet" typeface="Arial"/>
         <a:font script="Uigh" typeface="Microsoft Uighur"/>
-        <a:font script="Geor" typeface="Sylfaen"/>
-        <a:font script="Armn" typeface="Arial"/>
-        <a:font script="Bugi" typeface="Leelawadee UI"/>
-        <a:font script="Bopo" typeface="Microsoft JhengHei"/>
-        <a:font script="Java" typeface="Javanese Text"/>
-        <a:font script="Lisu" typeface="Segoe UI"/>
-        <a:font script="Mymr" typeface="Myanmar Text"/>
-        <a:font script="Nkoo" typeface="Ebrima"/>
-        <a:font script="Olck" typeface="Nirmala UI"/>
-        <a:font script="Osma" typeface="Ebrima"/>
-        <a:font script="Phag" typeface="Phagspa"/>
-        <a:font script="Syrn" typeface="Estrangelo Edessa"/>
-        <a:font script="Syrj" typeface="Estrangelo Edessa"/>
-        <a:font script="Syre" typeface="Estrangelo Edessa"/>
-        <a:font script="Sora" typeface="Nirmala UI"/>
-        <a:font script="Tale" typeface="Microsoft Tai Le"/>
-        <a:font script="Talu" typeface="Microsoft New Tai Lue"/>
-        <a:font script="Tfng" typeface="Ebrima"/>
       </a:minorFont>
     </a:fontScheme>
     <a:fmtScheme name="Office">
@@ -2504,141 +2357,200 @@
           <a:gsLst>
             <a:gs pos="0">
               <a:schemeClr val="phClr">
-                <a:lumMod val="110000"/>
-                <a:satMod val="105000"/>
-                <a:tint val="67000"/>
+                <a:tint val="50000"/>
+                <a:satMod val="300000"/>
               </a:schemeClr>
             </a:gs>
-            <a:gs pos="50000">
+            <a:gs pos="35000">
               <a:schemeClr val="phClr">
-                <a:lumMod val="105000"/>
-                <a:satMod val="103000"/>
-                <a:tint val="73000"/>
+                <a:tint val="37000"/>
+                <a:satMod val="300000"/>
               </a:schemeClr>
             </a:gs>
             <a:gs pos="100000">
               <a:schemeClr val="phClr">
-                <a:lumMod val="105000"/>
-                <a:satMod val="109000"/>
-                <a:tint val="81000"/>
+                <a:tint val="15000"/>
+                <a:satMod val="350000"/>
               </a:schemeClr>
             </a:gs>
           </a:gsLst>
-          <a:lin ang="5400000" scaled="0"/>
+          <a:lin ang="16200000" scaled="1"/>
         </a:gradFill>
         <a:gradFill rotWithShape="1">
           <a:gsLst>
             <a:gs pos="0">
               <a:schemeClr val="phClr">
-                <a:satMod val="103000"/>
-                <a:lumMod val="102000"/>
-                <a:tint val="94000"/>
-              </a:schemeClr>
-            </a:gs>
-            <a:gs pos="50000">
-              <a:schemeClr val="phClr">
-                <a:satMod val="110000"/>
-                <a:lumMod val="100000"/>
+                <a:tint val="100000"/>
                 <a:shade val="100000"/>
+                <a:satMod val="130000"/>
               </a:schemeClr>
             </a:gs>
             <a:gs pos="100000">
               <a:schemeClr val="phClr">
-                <a:lumMod val="99000"/>
-                <a:satMod val="120000"/>
-                <a:shade val="78000"/>
+                <a:tint val="50000"/>
+                <a:shade val="100000"/>
+                <a:satMod val="350000"/>
               </a:schemeClr>
             </a:gs>
           </a:gsLst>
-          <a:lin ang="5400000" scaled="0"/>
+          <a:lin ang="16200000" scaled="0"/>
         </a:gradFill>
       </a:fillStyleLst>
       <a:lnStyleLst>
-        <a:ln w="6350" cap="flat" cmpd="sng" algn="ctr">
+        <a:ln w="9525" cap="flat" cmpd="sng" algn="ctr">
+          <a:solidFill>
+            <a:schemeClr val="phClr">
+              <a:shade val="95000"/>
+              <a:satMod val="105000"/>
+            </a:schemeClr>
+          </a:solidFill>
+          <a:prstDash val="solid"/>
+        </a:ln>
+        <a:ln w="25400" cap="flat" cmpd="sng" algn="ctr">
           <a:solidFill>
             <a:schemeClr val="phClr"/>
           </a:solidFill>
           <a:prstDash val="solid"/>
-          <a:miter lim="800000"/>
         </a:ln>
-        <a:ln w="12700" cap="flat" cmpd="sng" algn="ctr">
+        <a:ln w="38100" cap="flat" cmpd="sng" algn="ctr">
           <a:solidFill>
             <a:schemeClr val="phClr"/>
           </a:solidFill>
           <a:prstDash val="solid"/>
-          <a:miter lim="800000"/>
-        </a:ln>
-        <a:ln w="19050" cap="flat" cmpd="sng" algn="ctr">
-          <a:solidFill>
-            <a:schemeClr val="phClr"/>
-          </a:solidFill>
-          <a:prstDash val="solid"/>
-          <a:miter lim="800000"/>
         </a:ln>
       </a:lnStyleLst>
       <a:effectStyleLst>
         <a:effectStyle>
-          <a:effectLst/>
-        </a:effectStyle>
-        <a:effectStyle>
-          <a:effectLst/>
+          <a:effectLst>
+            <a:outerShdw blurRad="40000" dist="20000" dir="5400000" rotWithShape="0">
+              <a:srgbClr val="000000">
+                <a:alpha val="38000"/>
+              </a:srgbClr>
+            </a:outerShdw>
+          </a:effectLst>
         </a:effectStyle>
         <a:effectStyle>
           <a:effectLst>
-            <a:outerShdw blurRad="57150" dist="19050" dir="5400000" algn="ctr" rotWithShape="0">
+            <a:outerShdw blurRad="40000" dist="23000" dir="5400000" rotWithShape="0">
               <a:srgbClr val="000000">
-                <a:alpha val="63000"/>
+                <a:alpha val="35000"/>
               </a:srgbClr>
             </a:outerShdw>
           </a:effectLst>
+        </a:effectStyle>
+        <a:effectStyle>
+          <a:effectLst>
+            <a:outerShdw blurRad="40000" dist="23000" dir="5400000" rotWithShape="0">
+              <a:srgbClr val="000000">
+                <a:alpha val="35000"/>
+              </a:srgbClr>
+            </a:outerShdw>
+          </a:effectLst>
+          <a:scene3d>
+            <a:camera prst="orthographicFront">
+              <a:rot lat="0" lon="0" rev="0"/>
+            </a:camera>
+            <a:lightRig rig="threePt" dir="t">
+              <a:rot lat="0" lon="0" rev="1200000"/>
+            </a:lightRig>
+          </a:scene3d>
+          <a:sp3d>
+            <a:bevelT w="63500" h="25400"/>
+          </a:sp3d>
         </a:effectStyle>
       </a:effectStyleLst>
       <a:bgFillStyleLst>
         <a:solidFill>
           <a:schemeClr val="phClr"/>
         </a:solidFill>
-        <a:solidFill>
-          <a:schemeClr val="phClr">
-            <a:tint val="95000"/>
-            <a:satMod val="170000"/>
-          </a:schemeClr>
-        </a:solidFill>
         <a:gradFill rotWithShape="1">
           <a:gsLst>
             <a:gs pos="0">
               <a:schemeClr val="phClr">
-                <a:tint val="93000"/>
-                <a:satMod val="150000"/>
-                <a:shade val="98000"/>
-                <a:lumMod val="102000"/>
+                <a:tint val="40000"/>
+                <a:satMod val="350000"/>
               </a:schemeClr>
             </a:gs>
-            <a:gs pos="50000">
+            <a:gs pos="40000">
               <a:schemeClr val="phClr">
-                <a:tint val="98000"/>
-                <a:satMod val="130000"/>
-                <a:shade val="90000"/>
-                <a:lumMod val="103000"/>
+                <a:tint val="45000"/>
+                <a:shade val="99000"/>
+                <a:satMod val="350000"/>
               </a:schemeClr>
             </a:gs>
             <a:gs pos="100000">
               <a:schemeClr val="phClr">
-                <a:shade val="63000"/>
-                <a:satMod val="120000"/>
+                <a:shade val="20000"/>
+                <a:satMod val="255000"/>
               </a:schemeClr>
             </a:gs>
           </a:gsLst>
-          <a:lin ang="5400000" scaled="0"/>
+          <a:path path="circle">
+            <a:fillToRect l="50000" t="-80000" r="50000" b="180000"/>
+          </a:path>
+        </a:gradFill>
+        <a:gradFill rotWithShape="1">
+          <a:gsLst>
+            <a:gs pos="0">
+              <a:schemeClr val="phClr">
+                <a:tint val="80000"/>
+                <a:satMod val="300000"/>
+              </a:schemeClr>
+            </a:gs>
+            <a:gs pos="100000">
+              <a:schemeClr val="phClr">
+                <a:shade val="30000"/>
+                <a:satMod val="200000"/>
+              </a:schemeClr>
+            </a:gs>
+          </a:gsLst>
+          <a:path path="circle">
+            <a:fillToRect l="50000" t="50000" r="50000" b="50000"/>
+          </a:path>
         </a:gradFill>
       </a:bgFillStyleLst>
     </a:fmtScheme>
   </a:themeElements>
-  <a:objectDefaults/>
+  <a:objectDefaults>
+    <a:spDef>
+      <a:spPr/>
+      <a:bodyPr/>
+      <a:lstStyle/>
+      <a:style>
+        <a:lnRef idx="1">
+          <a:schemeClr val="accent1"/>
+        </a:lnRef>
+        <a:fillRef idx="3">
+          <a:schemeClr val="accent1"/>
+        </a:fillRef>
+        <a:effectRef idx="2">
+          <a:schemeClr val="accent1"/>
+        </a:effectRef>
+        <a:fontRef idx="minor">
+          <a:schemeClr val="lt1"/>
+        </a:fontRef>
+      </a:style>
+    </a:spDef>
+    <a:lnDef>
+      <a:spPr/>
+      <a:bodyPr/>
+      <a:lstStyle/>
+      <a:style>
+        <a:lnRef idx="2">
+          <a:schemeClr val="accent1"/>
+        </a:lnRef>
+        <a:fillRef idx="0">
+          <a:schemeClr val="accent1"/>
+        </a:fillRef>
+        <a:effectRef idx="1">
+          <a:schemeClr val="accent1"/>
+        </a:effectRef>
+        <a:fontRef idx="minor">
+          <a:schemeClr val="tx1"/>
+        </a:fontRef>
+      </a:style>
+    </a:lnDef>
+  </a:objectDefaults>
   <a:extraClrSchemeLst/>
-  <a:extLst>
-    <a:ext uri="{05A4C25C-085E-4340-85A3-A5531E510DB2}">
-      <thm15:themeFamily xmlns:thm15="http://schemas.microsoft.com/office/thememl/2012/main" name="Office Theme" id="{2E142A2C-CD16-42D6-873A-C26D2A0506FA}" vid="{1BDDFF52-6CD6-40A5-AB3C-68EB2F1E4D0A}"/>
-    </a:ext>
-  </a:extLst>
 </a:theme>
 </file>
</xml_diff>

<commit_message>
UD09-13: añade 18 diagramas Excalidraw y sustituye los ASCII que replican
</commit_message>
<xml_diff>
--- a/docx/01-introduccion/boletin-U01-avanzado-resuelto.docx
+++ b/docx/01-introduccion/boletin-U01-avanzado-resuelto.docx
@@ -28,7 +28,7 @@
         </w:p>
       </w:sdtContent>
     </w:sdt>
-    <w:bookmarkStart w:id="20" w:name="X4858feb35e1492c05c4211374ee048c1425a805"/>
+    <w:bookmarkStart w:id="9" w:name="X4858feb35e1492c05c4211374ee048c1425a805"/>
     <w:p>
       <w:pPr>
         <w:pStyle w:val="Heading1"/>
@@ -37,8 +37,8 @@
         <w:t xml:space="preserve">Boletín de Introducción — Avanzado (Resuelto)</w:t>
       </w:r>
     </w:p>
-    <w:bookmarkEnd w:id="20"/>
-    <w:bookmarkStart w:id="29" w:name="X68d80aaea901b11f50f84b58517a0e5cee3e834"/>
+    <w:bookmarkEnd w:id="9"/>
+    <w:bookmarkStart w:id="18" w:name="X68d80aaea901b11f50f84b58517a0e5cee3e834"/>
     <w:p>
       <w:pPr>
         <w:pStyle w:val="Heading1"/>
@@ -54,7 +54,7 @@
         </w:pict>
       </w:r>
     </w:p>
-    <w:bookmarkStart w:id="21" w:name="diagnóstico-completo-no-tengo-internet"/>
+    <w:bookmarkStart w:id="10" w:name="diagnóstico-completo-no-tengo-internet"/>
     <w:p>
       <w:pPr>
         <w:pStyle w:val="Heading2"/>
@@ -66,13 +66,7 @@
         <w:t xml:space="preserve"> </w:t>
       </w:r>
       <w:r>
-        <w:t xml:space="preserve">“</w:t>
-      </w:r>
-      <w:r>
-        <w:t xml:space="preserve">No tengo Internet</w:t>
-      </w:r>
-      <w:r>
-        <w:t xml:space="preserve">”</w:t>
+        <w:t xml:space="preserve">“No tengo Internet”</w:t>
       </w:r>
     </w:p>
     <w:p>
@@ -241,8 +235,8 @@
         <w:t xml:space="preserve">. No necesitas mirar los de arriba.</w:t>
       </w:r>
     </w:p>
-    <w:bookmarkEnd w:id="21"/>
-    <w:bookmarkStart w:id="22" w:name="la-historia-de-un-paquete"/>
+    <w:bookmarkEnd w:id="10"/>
+    <w:bookmarkStart w:id="11" w:name="la-historia-de-un-paquete"/>
     <w:p>
       <w:pPr>
         <w:pStyle w:val="Heading2"/>
@@ -348,8 +342,8 @@
         <w:t xml:space="preserve">el navegador envía una petición HTTP GET al servidor de Google. El servidor responde con el HTML de la página, que viaja de vuelta en múltiples paquetes.</w:t>
       </w:r>
     </w:p>
-    <w:bookmarkEnd w:id="22"/>
-    <w:bookmarkStart w:id="23" w:name="arp-el-protocolo-olvidado"/>
+    <w:bookmarkEnd w:id="11"/>
+    <w:bookmarkStart w:id="12" w:name="arp-el-protocolo-olvidado"/>
     <w:p>
       <w:pPr>
         <w:pStyle w:val="Heading2"/>
@@ -400,13 +394,7 @@
         <w:t xml:space="preserve"> </w:t>
       </w:r>
       <w:r>
-        <w:t xml:space="preserve">“</w:t>
-      </w:r>
-      <w:r>
-        <w:t xml:space="preserve">bloquea</w:t>
-      </w:r>
-      <w:r>
-        <w:t xml:space="preserve">”</w:t>
+        <w:t xml:space="preserve">“bloquea”</w:t>
       </w:r>
       <w:r>
         <w:t xml:space="preserve">.</w:t>
@@ -447,21 +435,7 @@
           <w:i/>
           <w:iCs/>
         </w:rPr>
-        <w:t xml:space="preserve">“</w:t>
-      </w:r>
-      <w:r>
-        <w:rPr>
-          <w:i/>
-          <w:iCs/>
-        </w:rPr>
-        <w:t xml:space="preserve">¿Quién tiene la IP 192.168.1.1?</w:t>
-      </w:r>
-      <w:r>
-        <w:rPr>
-          <w:i/>
-          <w:iCs/>
-        </w:rPr>
-        <w:t xml:space="preserve">”</w:t>
+        <w:t xml:space="preserve">“¿Quién tiene la IP 192.168.1.1?”</w:t>
       </w:r>
       <w:r>
         <w:t xml:space="preserve"> </w:t>
@@ -505,21 +479,7 @@
           <w:i/>
           <w:iCs/>
         </w:rPr>
-        <w:t xml:space="preserve">“</w:t>
-      </w:r>
-      <w:r>
-        <w:rPr>
-          <w:i/>
-          <w:iCs/>
-        </w:rPr>
-        <w:t xml:space="preserve">Yo, y mi MAC es aa:bb:cc:dd:ee:ff</w:t>
-      </w:r>
-      <w:r>
-        <w:rPr>
-          <w:i/>
-          <w:iCs/>
-        </w:rPr>
-        <w:t xml:space="preserve">”</w:t>
+        <w:t xml:space="preserve">“Yo, y mi MAC es aa:bb:cc:dd:ee:ff”</w:t>
       </w:r>
       <w:r>
         <w:t xml:space="preserve">.</w:t>
@@ -557,8 +517,8 @@
         <w:t xml:space="preserve">Sin ARP, la capa 2 (Ethernet) no puede funcionar porque no sabe a quién enviar la trama.</w:t>
       </w:r>
     </w:p>
-    <w:bookmarkEnd w:id="23"/>
-    <w:bookmarkStart w:id="24" w:name="argumenta-contra-conrad"/>
+    <w:bookmarkEnd w:id="12"/>
+    <w:bookmarkStart w:id="13" w:name="argumenta-contra-conrad"/>
     <w:p>
       <w:pPr>
         <w:pStyle w:val="Heading2"/>
@@ -614,13 +574,7 @@
         <w:t xml:space="preserve"> </w:t>
       </w:r>
       <w:r>
-        <w:t xml:space="preserve">“</w:t>
-      </w:r>
-      <w:r>
-        <w:t xml:space="preserve">lo arregla</w:t>
-      </w:r>
-      <w:r>
-        <w:t xml:space="preserve">”</w:t>
+        <w:t xml:space="preserve">“lo arregla”</w:t>
       </w:r>
       <w:r>
         <w:t xml:space="preserve"> </w:t>
@@ -654,20 +608,14 @@
         <w:t xml:space="preserve"> </w:t>
       </w:r>
       <w:r>
-        <w:t xml:space="preserve">“</w:t>
-      </w:r>
-      <w:r>
-        <w:t xml:space="preserve">el cable estaba suelto</w:t>
-      </w:r>
-      <w:r>
-        <w:t xml:space="preserve">”</w:t>
+        <w:t xml:space="preserve">“el cable estaba suelto”</w:t>
       </w:r>
       <w:r>
         <w:t xml:space="preserve">, aprende y no te vuelve a llamar por lo mismo.</w:t>
       </w:r>
     </w:p>
-    <w:bookmarkEnd w:id="24"/>
-    <w:bookmarkStart w:id="25" w:name="diseña-la-red-del-aula"/>
+    <w:bookmarkEnd w:id="13"/>
+    <w:bookmarkStart w:id="14" w:name="diseña-la-red-del-aula"/>
     <w:p>
       <w:pPr>
         <w:pStyle w:val="Heading2"/>
@@ -808,8 +756,8 @@
         <w:t xml:space="preserve">- Con un solo switch de 48 puertos, la topología es simple, fácil de mantener y con margen para crecer.</w:t>
       </w:r>
     </w:p>
-    <w:bookmarkEnd w:id="25"/>
-    <w:bookmarkStart w:id="26" w:name="mente-binaria"/>
+    <w:bookmarkEnd w:id="14"/>
+    <w:bookmarkStart w:id="15" w:name="mente-binaria"/>
     <w:p>
       <w:pPr>
         <w:pStyle w:val="Heading2"/>
@@ -903,8 +851,8 @@
         <w:t xml:space="preserve">, no KB (2.560 KB serían 2.621.440 bytes). Su número es correcto pero la etiqueta es falsa.</w:t>
       </w:r>
     </w:p>
-    <w:bookmarkEnd w:id="26"/>
-    <w:bookmarkStart w:id="27" w:name="el-mapa-del-curso"/>
+    <w:bookmarkEnd w:id="15"/>
+    <w:bookmarkStart w:id="16" w:name="el-mapa-del-curso"/>
     <w:p>
       <w:pPr>
         <w:pStyle w:val="Heading2"/>
@@ -957,8 +905,8 @@
         <w:t xml:space="preserve">Durante todo el curso, cada vez que algo falle, volverás a la escalera del ping. Aprenderlo primero te da una herramienta que acompaña todo el curso.</w:t>
       </w:r>
     </w:p>
-    <w:bookmarkEnd w:id="27"/>
-    <w:bookmarkStart w:id="28" w:name="Xc8e5910c22462a634687887ceb7faf0b5be8d57"/>
+    <w:bookmarkEnd w:id="16"/>
+    <w:bookmarkStart w:id="17" w:name="Xc8e5910c22462a634687887ceb7faf0b5be8d57"/>
     <w:p>
       <w:pPr>
         <w:pStyle w:val="Heading2"/>
@@ -1009,9 +957,13 @@
         <w:t xml:space="preserve">Si el simulador no arranca o da problemas al iniciar sesión con la cuenta de la Cisco Networking Academy, el administrador no recurre al azar ni formatea el equipo. El procedimiento consiste en: verificar los requisitos del sistema operativo, comprobar la conexión a Internet que valida las credenciales y, en caso de persistir el error, documentar el mensaje exacto de la excepción con captura de pantalla y los pasos que diste hasta el fallo, y pedir ayuda con todo eso delante (al profesor o en el foro del aula virtual), para que quien te ayude pueda reproducirlo sin preguntarte lo mismo dos veces.</w:t>
       </w:r>
     </w:p>
-    <w:bookmarkEnd w:id="28"/>
-    <w:bookmarkEnd w:id="29"/>
-    <w:sectPr/>
+    <w:bookmarkEnd w:id="17"/>
+    <w:bookmarkEnd w:id="18"/>
+    <w:sectPr>
+      <w:footnotePr>
+        <w:numRestart w:val="eachSect"/>
+      </w:footnotePr>
+    </w:sectPr>
   </w:body>
 </w:document>
 </file>
@@ -1049,7 +1001,7 @@
       <w:lvlText w:val=" "/>
       <w:lvlJc w:val="left"/>
       <w:pPr>
-        <w:ind w:left="720" w:hanging="480"/>
+        <w:ind w:left="720" w:hanging="360"/>
       </w:pPr>
     </w:lvl>
     <w:lvl w:ilvl="1">
@@ -1057,7 +1009,7 @@
       <w:lvlText w:val=" "/>
       <w:lvlJc w:val="left"/>
       <w:pPr>
-        <w:ind w:left="1440" w:hanging="480"/>
+        <w:ind w:left="1440" w:hanging="360"/>
       </w:pPr>
     </w:lvl>
     <w:lvl w:ilvl="2">
@@ -1065,7 +1017,7 @@
       <w:lvlText w:val=" "/>
       <w:lvlJc w:val="left"/>
       <w:pPr>
-        <w:ind w:left="2160" w:hanging="480"/>
+        <w:ind w:left="2160" w:hanging="360"/>
       </w:pPr>
     </w:lvl>
     <w:lvl w:ilvl="3">
@@ -1073,7 +1025,7 @@
       <w:lvlText w:val=" "/>
       <w:lvlJc w:val="left"/>
       <w:pPr>
-        <w:ind w:left="2880" w:hanging="480"/>
+        <w:ind w:left="2880" w:hanging="360"/>
       </w:pPr>
     </w:lvl>
     <w:lvl w:ilvl="4">
@@ -1081,7 +1033,7 @@
       <w:lvlText w:val=" "/>
       <w:lvlJc w:val="left"/>
       <w:pPr>
-        <w:ind w:left="3600" w:hanging="480"/>
+        <w:ind w:left="3600" w:hanging="360"/>
       </w:pPr>
     </w:lvl>
     <w:lvl w:ilvl="5">
@@ -1089,7 +1041,7 @@
       <w:lvlText w:val=" "/>
       <w:lvlJc w:val="left"/>
       <w:pPr>
-        <w:ind w:left="4320" w:hanging="480"/>
+        <w:ind w:left="4320" w:hanging="360"/>
       </w:pPr>
     </w:lvl>
     <w:lvl w:ilvl="6">
@@ -1097,7 +1049,7 @@
       <w:lvlText w:val=" "/>
       <w:lvlJc w:val="left"/>
       <w:pPr>
-        <w:ind w:left="5040" w:hanging="480"/>
+        <w:ind w:left="5040" w:hanging="360"/>
       </w:pPr>
     </w:lvl>
     <w:lvl w:ilvl="7">
@@ -1105,7 +1057,7 @@
       <w:lvlText w:val=" "/>
       <w:lvlJc w:val="left"/>
       <w:pPr>
-        <w:ind w:left="5760" w:hanging="480"/>
+        <w:ind w:left="5760" w:hanging="360"/>
       </w:pPr>
     </w:lvl>
     <w:lvl w:ilvl="8">
@@ -1113,7 +1065,7 @@
       <w:lvlText w:val=" "/>
       <w:lvlJc w:val="left"/>
       <w:pPr>
-        <w:ind w:left="6480" w:hanging="480"/>
+        <w:ind w:left="6480" w:hanging="360"/>
       </w:pPr>
     </w:lvl>
   </w:abstractNum>
@@ -1126,7 +1078,7 @@
       <w:lvlText w:val="%1."/>
       <w:lvlJc w:val="left"/>
       <w:pPr>
-        <w:ind w:left="720" w:hanging="480"/>
+        <w:ind w:left="720" w:hanging="360"/>
       </w:pPr>
     </w:lvl>
     <w:lvl w:ilvl="1">
@@ -1135,7 +1087,7 @@
       <w:lvlText w:val="%2."/>
       <w:lvlJc w:val="left"/>
       <w:pPr>
-        <w:ind w:left="1440" w:hanging="480"/>
+        <w:ind w:left="1440" w:hanging="360"/>
       </w:pPr>
     </w:lvl>
     <w:lvl w:ilvl="2">
@@ -1144,7 +1096,7 @@
       <w:lvlText w:val="%3."/>
       <w:lvlJc w:val="left"/>
       <w:pPr>
-        <w:ind w:left="2160" w:hanging="480"/>
+        <w:ind w:left="2160" w:hanging="360"/>
       </w:pPr>
     </w:lvl>
     <w:lvl w:ilvl="3">
@@ -1153,7 +1105,7 @@
       <w:lvlText w:val="%4."/>
       <w:lvlJc w:val="left"/>
       <w:pPr>
-        <w:ind w:left="2880" w:hanging="480"/>
+        <w:ind w:left="2880" w:hanging="360"/>
       </w:pPr>
     </w:lvl>
     <w:lvl w:ilvl="4">
@@ -1162,7 +1114,7 @@
       <w:lvlText w:val="%5."/>
       <w:lvlJc w:val="left"/>
       <w:pPr>
-        <w:ind w:left="3600" w:hanging="480"/>
+        <w:ind w:left="3600" w:hanging="360"/>
       </w:pPr>
     </w:lvl>
     <w:lvl w:ilvl="5">
@@ -1171,7 +1123,7 @@
       <w:lvlText w:val="%6."/>
       <w:lvlJc w:val="left"/>
       <w:pPr>
-        <w:ind w:left="4320" w:hanging="480"/>
+        <w:ind w:left="4320" w:hanging="360"/>
       </w:pPr>
     </w:lvl>
     <w:lvl w:ilvl="6">
@@ -1180,7 +1132,7 @@
       <w:lvlText w:val="%7."/>
       <w:lvlJc w:val="left"/>
       <w:pPr>
-        <w:ind w:left="5040" w:hanging="480"/>
+        <w:ind w:left="5040" w:hanging="360"/>
       </w:pPr>
     </w:lvl>
     <w:lvl w:ilvl="7">
@@ -1189,7 +1141,7 @@
       <w:lvlText w:val="%8."/>
       <w:lvlJc w:val="left"/>
       <w:pPr>
-        <w:ind w:left="5760" w:hanging="480"/>
+        <w:ind w:left="5760" w:hanging="360"/>
       </w:pPr>
     </w:lvl>
     <w:lvl w:ilvl="8">
@@ -1198,7 +1150,7 @@
       <w:lvlText w:val="%9."/>
       <w:lvlJc w:val="left"/>
       <w:pPr>
-        <w:ind w:left="6480" w:hanging="480"/>
+        <w:ind w:left="6480" w:hanging="360"/>
       </w:pPr>
     </w:lvl>
   </w:abstractNum>
@@ -1211,7 +1163,7 @@
       <w:lvlText w:val="%1)"/>
       <w:lvlJc w:val="left"/>
       <w:pPr>
-        <w:ind w:left="720" w:hanging="480"/>
+        <w:ind w:left="720" w:hanging="360"/>
       </w:pPr>
     </w:lvl>
     <w:lvl w:ilvl="1">
@@ -1220,7 +1172,7 @@
       <w:lvlText w:val="%2)"/>
       <w:lvlJc w:val="left"/>
       <w:pPr>
-        <w:ind w:left="1440" w:hanging="480"/>
+        <w:ind w:left="1440" w:hanging="360"/>
       </w:pPr>
     </w:lvl>
     <w:lvl w:ilvl="2">
@@ -1229,7 +1181,7 @@
       <w:lvlText w:val="%3)"/>
       <w:lvlJc w:val="left"/>
       <w:pPr>
-        <w:ind w:left="2160" w:hanging="480"/>
+        <w:ind w:left="2160" w:hanging="360"/>
       </w:pPr>
     </w:lvl>
     <w:lvl w:ilvl="3">
@@ -1238,7 +1190,7 @@
       <w:lvlText w:val="%4)"/>
       <w:lvlJc w:val="left"/>
       <w:pPr>
-        <w:ind w:left="2880" w:hanging="480"/>
+        <w:ind w:left="2880" w:hanging="360"/>
       </w:pPr>
     </w:lvl>
     <w:lvl w:ilvl="4">
@@ -1247,7 +1199,7 @@
       <w:lvlText w:val="%5)"/>
       <w:lvlJc w:val="left"/>
       <w:pPr>
-        <w:ind w:left="3600" w:hanging="480"/>
+        <w:ind w:left="3600" w:hanging="360"/>
       </w:pPr>
     </w:lvl>
     <w:lvl w:ilvl="5">
@@ -1256,7 +1208,7 @@
       <w:lvlText w:val="%6)"/>
       <w:lvlJc w:val="left"/>
       <w:pPr>
-        <w:ind w:left="4320" w:hanging="480"/>
+        <w:ind w:left="4320" w:hanging="360"/>
       </w:pPr>
     </w:lvl>
     <w:lvl w:ilvl="6">
@@ -1265,7 +1217,7 @@
       <w:lvlText w:val="%7)"/>
       <w:lvlJc w:val="left"/>
       <w:pPr>
-        <w:ind w:left="5040" w:hanging="480"/>
+        <w:ind w:left="5040" w:hanging="360"/>
       </w:pPr>
     </w:lvl>
     <w:lvl w:ilvl="7">
@@ -1274,7 +1226,7 @@
       <w:lvlText w:val="%8)"/>
       <w:lvlJc w:val="left"/>
       <w:pPr>
-        <w:ind w:left="5760" w:hanging="480"/>
+        <w:ind w:left="5760" w:hanging="360"/>
       </w:pPr>
     </w:lvl>
     <w:lvl w:ilvl="8">
@@ -1283,7 +1235,7 @@
       <w:lvlText w:val="%9)"/>
       <w:lvlJc w:val="left"/>
       <w:pPr>
-        <w:ind w:left="6480" w:hanging="480"/>
+        <w:ind w:left="6480" w:hanging="360"/>
       </w:pPr>
     </w:lvl>
   </w:abstractNum>
@@ -1508,10 +1460,10 @@
   <w:docDefaults>
     <w:rPrDefault>
       <w:rPr>
-        <w:rFonts w:asciiTheme="minorHAnsi" w:cstheme="minorBidi" w:eastAsiaTheme="minorHAnsi" w:hAnsiTheme="minorHAnsi"/>
+        <w:rFonts w:asciiTheme="minorHAnsi" w:cstheme="minorBidi" w:eastAsiaTheme="minorEastAsia" w:hAnsiTheme="minorHAnsi"/>
         <w:sz w:val="24"/>
         <w:szCs w:val="24"/>
-        <w:lang w:bidi="ar-SA" w:eastAsia="en-US" w:val="es-ES"/>
+        <w:lang w:bidi="ar-SA" w:eastAsia="zh-CN" w:val="es-ES"/>
       </w:rPr>
     </w:rPrDefault>
     <w:pPrDefault>
@@ -1552,57 +1504,94 @@
     <w:name w:val="Title"/>
     <w:basedOn w:val="Normal"/>
     <w:next w:val="BodyText"/>
+    <w:link w:val="TitleChar"/>
+    <w:uiPriority w:val="10"/>
     <w:qFormat/>
+    <w:rsid w:val="00A10FD9"/>
     <w:pPr>
-      <w:keepNext/>
-      <w:keepLines/>
-      <w:spacing w:after="240" w:before="480"/>
+      <w:spacing w:after="80" w:line="240" w:lineRule="auto"/>
+      <w:contextualSpacing/>
       <w:jc w:val="center"/>
     </w:pPr>
     <w:rPr>
       <w:rFonts w:asciiTheme="majorHAnsi" w:cstheme="majorBidi" w:eastAsiaTheme="majorEastAsia" w:hAnsiTheme="majorHAnsi"/>
-      <w:b/>
-      <w:bCs/>
-      <w:color w:themeColor="accent1" w:themeShade="B5" w:val="345A8A"/>
-      <w:sz w:val="36"/>
-      <w:szCs w:val="36"/>
+      <w:sz w:val="56"/>
+      <w:szCs w:val="56"/>
+    </w:rPr>
+  </w:style>
+  <w:style w:customStyle="1" w:styleId="TitleChar" w:type="character">
+    <w:name w:val="Title Char"/>
+    <w:basedOn w:val="DefaultParagraphFont"/>
+    <w:link w:val="Title"/>
+    <w:uiPriority w:val="10"/>
+    <w:rsid w:val="00A10FD9"/>
+    <w:rPr>
+      <w:rFonts w:asciiTheme="majorHAnsi" w:cstheme="majorBidi" w:eastAsiaTheme="majorEastAsia" w:hAnsiTheme="majorHAnsi"/>
+      <w:sz w:val="56"/>
+      <w:szCs w:val="56"/>
     </w:rPr>
   </w:style>
   <w:style w:styleId="Subtitle" w:type="paragraph">
     <w:name w:val="Subtitle"/>
+    <w:basedOn w:val="Title"/>
+    <w:next w:val="BodyText"/>
+    <w:link w:val="SubtitleChar"/>
+    <w:uiPriority w:val="11"/>
+    <w:qFormat/>
+    <w:rsid w:val="00A10FD9"/>
+    <w:pPr>
+      <w:numPr>
+        <w:ilvl w:val="1"/>
+      </w:numPr>
+    </w:pPr>
+    <w:rPr>
+      <w:rFonts w:cstheme="majorBidi" w:eastAsiaTheme="majorEastAsia"/>
+      <w:spacing w:val="15"/>
+      <w:sz w:val="28"/>
+      <w:szCs w:val="28"/>
+    </w:rPr>
+  </w:style>
+  <w:style w:customStyle="1" w:styleId="SubtitleChar" w:type="character">
+    <w:name w:val="Subtitle Char"/>
+    <w:basedOn w:val="DefaultParagraphFont"/>
+    <w:link w:val="Subtitle"/>
+    <w:uiPriority w:val="11"/>
+    <w:rsid w:val="00A10FD9"/>
+    <w:rPr>
+      <w:rFonts w:cstheme="majorBidi" w:eastAsiaTheme="majorEastAsia"/>
+      <w:color w:themeColor="text1" w:themeTint="A6" w:val="595959"/>
+      <w:spacing w:val="15"/>
+      <w:sz w:val="28"/>
+      <w:szCs w:val="28"/>
+    </w:rPr>
+  </w:style>
+  <w:style w:customStyle="1" w:styleId="Author" w:type="paragraph">
+    <w:name w:val="Author"/>
     <w:basedOn w:val="Title"/>
     <w:next w:val="BodyText"/>
     <w:qFormat/>
     <w:pPr>
       <w:keepNext/>
       <w:keepLines/>
-      <w:spacing w:after="240" w:before="240"/>
-      <w:jc w:val="center"/>
     </w:pPr>
     <w:rPr>
-      <w:sz w:val="30"/>
-      <w:szCs w:val="30"/>
-    </w:rPr>
-  </w:style>
-  <w:style w:customStyle="1" w:styleId="Author" w:type="paragraph">
-    <w:name w:val="Author"/>
+      <w:sz w:val="24"/>
+      <w:szCs w:val="24"/>
+    </w:rPr>
+  </w:style>
+  <w:style w:styleId="Date" w:type="paragraph">
+    <w:name w:val="Date"/>
+    <w:basedOn w:val="Title"/>
     <w:next w:val="BodyText"/>
     <w:qFormat/>
     <w:pPr>
       <w:keepNext/>
       <w:keepLines/>
-      <w:jc w:val="center"/>
     </w:pPr>
-  </w:style>
-  <w:style w:styleId="Date" w:type="paragraph">
-    <w:name w:val="Date"/>
-    <w:next w:val="BodyText"/>
-    <w:qFormat/>
-    <w:pPr>
-      <w:keepNext/>
-      <w:keepLines/>
-      <w:jc w:val="center"/>
-    </w:pPr>
+    <w:rPr>
+      <w:sz w:val="24"/>
+      <w:szCs w:val="24"/>
+    </w:rPr>
   </w:style>
   <w:style w:customStyle="1" w:styleId="AbstractTitle" w:type="paragraph">
     <w:name w:val="Abstract Title"/>
@@ -1617,7 +1606,6 @@
     </w:pPr>
     <w:rPr>
       <w:b/>
-      <w:color w:val="345A8A"/>
       <w:sz w:val="20"/>
       <w:szCs w:val="20"/>
     </w:rPr>
@@ -1646,191 +1634,321 @@
     <w:rPr/>
   </w:style>
   <w:style w:styleId="Heading1" w:type="paragraph">
-    <w:name w:val="Heading 1"/>
+    <w:name w:val="heading 1"/>
     <w:basedOn w:val="Normal"/>
     <w:next w:val="BodyText"/>
+    <w:link w:val="Heading1Char"/>
     <w:uiPriority w:val="9"/>
     <w:qFormat/>
+    <w:rsid w:val="00A10FD9"/>
     <w:pPr>
       <w:keepNext/>
       <w:keepLines/>
-      <w:spacing w:after="0" w:before="480"/>
+      <w:spacing w:after="80" w:before="360"/>
       <w:outlineLvl w:val="0"/>
     </w:pPr>
     <w:rPr>
       <w:rFonts w:asciiTheme="majorHAnsi" w:cstheme="majorBidi" w:eastAsiaTheme="majorEastAsia" w:hAnsiTheme="majorHAnsi"/>
-      <w:b/>
-      <w:bCs/>
-      <w:color w:themeColor="accent1" w:val="4F81BD"/>
-      <w:sz w:val="32"/>
-      <w:szCs w:val="32"/>
+      <w:color w:themeColor="accent1" w:themeShade="BF" w:val="0F4761"/>
+      <w:sz w:val="40"/>
+      <w:szCs w:val="40"/>
     </w:rPr>
   </w:style>
   <w:style w:styleId="Heading2" w:type="paragraph">
-    <w:name w:val="Heading 2"/>
+    <w:name w:val="heading 2"/>
     <w:basedOn w:val="Normal"/>
     <w:next w:val="BodyText"/>
+    <w:link w:val="Heading2Char"/>
     <w:uiPriority w:val="9"/>
+    <w:semiHidden/>
     <w:unhideWhenUsed/>
     <w:qFormat/>
+    <w:rsid w:val="00A10FD9"/>
     <w:pPr>
       <w:keepNext/>
       <w:keepLines/>
-      <w:spacing w:after="0" w:before="200"/>
+      <w:spacing w:after="80" w:before="160"/>
       <w:outlineLvl w:val="1"/>
     </w:pPr>
     <w:rPr>
       <w:rFonts w:asciiTheme="majorHAnsi" w:cstheme="majorBidi" w:eastAsiaTheme="majorEastAsia" w:hAnsiTheme="majorHAnsi"/>
-      <w:b/>
-      <w:bCs/>
-      <w:color w:themeColor="accent1" w:val="4F81BD"/>
-      <w:sz w:val="28"/>
-      <w:szCs w:val="28"/>
+      <w:color w:themeColor="accent1" w:themeShade="BF" w:val="0F4761"/>
+      <w:sz w:val="32"/>
+      <w:szCs w:val="32"/>
     </w:rPr>
   </w:style>
   <w:style w:styleId="Heading3" w:type="paragraph">
-    <w:name w:val="Heading 3"/>
+    <w:name w:val="heading 3"/>
     <w:basedOn w:val="Normal"/>
     <w:next w:val="BodyText"/>
+    <w:link w:val="Heading3Char"/>
     <w:uiPriority w:val="9"/>
+    <w:semiHidden/>
     <w:unhideWhenUsed/>
     <w:qFormat/>
+    <w:rsid w:val="00A10FD9"/>
     <w:pPr>
       <w:keepNext/>
       <w:keepLines/>
-      <w:spacing w:after="0" w:before="200"/>
+      <w:spacing w:after="80" w:before="160"/>
       <w:outlineLvl w:val="2"/>
     </w:pPr>
     <w:rPr>
-      <w:rFonts w:asciiTheme="majorHAnsi" w:cstheme="majorBidi" w:eastAsiaTheme="majorEastAsia" w:hAnsiTheme="majorHAnsi"/>
-      <w:b/>
-      <w:bCs/>
-      <w:color w:themeColor="accent1" w:val="4F81BD"/>
-      <w:sz w:val="24"/>
-      <w:szCs w:val="24"/>
+      <w:rFonts w:cstheme="majorBidi" w:eastAsiaTheme="majorEastAsia"/>
+      <w:color w:themeColor="accent1" w:themeShade="BF" w:val="0F4761"/>
+      <w:sz w:val="28"/>
+      <w:szCs w:val="28"/>
     </w:rPr>
   </w:style>
   <w:style w:styleId="Heading4" w:type="paragraph">
-    <w:name w:val="Heading 4"/>
+    <w:name w:val="heading 4"/>
     <w:basedOn w:val="Normal"/>
     <w:next w:val="BodyText"/>
+    <w:link w:val="Heading4Char"/>
     <w:uiPriority w:val="9"/>
+    <w:semiHidden/>
     <w:unhideWhenUsed/>
     <w:qFormat/>
+    <w:rsid w:val="00A10FD9"/>
     <w:pPr>
       <w:keepNext/>
       <w:keepLines/>
-      <w:spacing w:after="0" w:before="200"/>
+      <w:spacing w:after="40" w:before="80"/>
       <w:outlineLvl w:val="3"/>
     </w:pPr>
     <w:rPr>
-      <w:rFonts w:asciiTheme="majorHAnsi" w:cstheme="majorBidi" w:eastAsiaTheme="majorEastAsia" w:hAnsiTheme="majorHAnsi"/>
-      <w:bCs/>
+      <w:rFonts w:cstheme="majorBidi" w:eastAsiaTheme="majorEastAsia"/>
       <w:i/>
-      <w:color w:themeColor="accent1" w:val="4F81BD"/>
-      <w:sz w:val="24"/>
-      <w:szCs w:val="24"/>
+      <w:iCs/>
+      <w:color w:themeColor="accent1" w:themeShade="BF" w:val="0F4761"/>
     </w:rPr>
   </w:style>
   <w:style w:styleId="Heading5" w:type="paragraph">
-    <w:name w:val="Heading 5"/>
+    <w:name w:val="heading 5"/>
     <w:basedOn w:val="Normal"/>
     <w:next w:val="BodyText"/>
+    <w:link w:val="Heading5Char"/>
     <w:uiPriority w:val="9"/>
+    <w:semiHidden/>
     <w:unhideWhenUsed/>
     <w:qFormat/>
+    <w:rsid w:val="00A10FD9"/>
     <w:pPr>
       <w:keepNext/>
       <w:keepLines/>
-      <w:spacing w:after="0" w:before="200"/>
+      <w:spacing w:after="40" w:before="80"/>
       <w:outlineLvl w:val="4"/>
     </w:pPr>
     <w:rPr>
-      <w:rFonts w:asciiTheme="majorHAnsi" w:cstheme="majorBidi" w:eastAsiaTheme="majorEastAsia" w:hAnsiTheme="majorHAnsi"/>
-      <w:iCs/>
-      <w:color w:themeColor="accent1" w:val="4F81BD"/>
-      <w:sz w:val="24"/>
-      <w:szCs w:val="24"/>
+      <w:rFonts w:cstheme="majorBidi" w:eastAsiaTheme="majorEastAsia"/>
+      <w:color w:themeColor="accent1" w:themeShade="BF" w:val="0F4761"/>
     </w:rPr>
   </w:style>
   <w:style w:styleId="Heading6" w:type="paragraph">
-    <w:name w:val="Heading 6"/>
+    <w:name w:val="heading 6"/>
     <w:basedOn w:val="Normal"/>
     <w:next w:val="BodyText"/>
+    <w:link w:val="Heading6Char"/>
     <w:uiPriority w:val="9"/>
+    <w:semiHidden/>
     <w:unhideWhenUsed/>
     <w:qFormat/>
+    <w:rsid w:val="00A10FD9"/>
     <w:pPr>
       <w:keepNext/>
       <w:keepLines/>
-      <w:spacing w:after="0" w:before="200"/>
+      <w:spacing w:after="0" w:before="40"/>
       <w:outlineLvl w:val="5"/>
     </w:pPr>
     <w:rPr>
-      <w:rFonts w:asciiTheme="majorHAnsi" w:cstheme="majorBidi" w:eastAsiaTheme="majorEastAsia" w:hAnsiTheme="majorHAnsi"/>
-      <w:color w:themeColor="accent1" w:val="4F81BD"/>
-      <w:sz w:val="24"/>
-      <w:szCs w:val="24"/>
+      <w:rFonts w:cstheme="majorBidi" w:eastAsiaTheme="majorEastAsia"/>
+      <w:i/>
+      <w:iCs/>
+      <w:color w:themeColor="text1" w:themeTint="A6" w:val="595959"/>
     </w:rPr>
   </w:style>
   <w:style w:styleId="Heading7" w:type="paragraph">
-    <w:name w:val="Heading 7"/>
+    <w:name w:val="heading 7"/>
     <w:basedOn w:val="Normal"/>
     <w:next w:val="BodyText"/>
+    <w:link w:val="Heading7Char"/>
     <w:uiPriority w:val="9"/>
+    <w:semiHidden/>
     <w:unhideWhenUsed/>
     <w:qFormat/>
+    <w:rsid w:val="00A10FD9"/>
     <w:pPr>
       <w:keepNext/>
       <w:keepLines/>
-      <w:spacing w:after="0" w:before="200"/>
+      <w:spacing w:after="0" w:before="40"/>
       <w:outlineLvl w:val="6"/>
     </w:pPr>
     <w:rPr>
-      <w:rFonts w:asciiTheme="majorHAnsi" w:cstheme="majorBidi" w:eastAsiaTheme="majorEastAsia" w:hAnsiTheme="majorHAnsi"/>
-      <w:color w:themeColor="accent1" w:val="4F81BD"/>
-      <w:sz w:val="24"/>
-      <w:szCs w:val="24"/>
+      <w:rFonts w:cstheme="majorBidi" w:eastAsiaTheme="majorEastAsia"/>
+      <w:color w:themeColor="text1" w:themeTint="A6" w:val="595959"/>
     </w:rPr>
   </w:style>
   <w:style w:styleId="Heading8" w:type="paragraph">
-    <w:name w:val="Heading 8"/>
+    <w:name w:val="heading 8"/>
     <w:basedOn w:val="Normal"/>
     <w:next w:val="BodyText"/>
+    <w:link w:val="Heading8Char"/>
     <w:uiPriority w:val="9"/>
+    <w:semiHidden/>
     <w:unhideWhenUsed/>
     <w:qFormat/>
+    <w:rsid w:val="00A10FD9"/>
     <w:pPr>
       <w:keepNext/>
       <w:keepLines/>
-      <w:spacing w:after="0" w:before="200"/>
+      <w:spacing w:after="0"/>
       <w:outlineLvl w:val="7"/>
     </w:pPr>
     <w:rPr>
-      <w:rFonts w:asciiTheme="majorHAnsi" w:cstheme="majorBidi" w:eastAsiaTheme="majorEastAsia" w:hAnsiTheme="majorHAnsi"/>
-      <w:color w:themeColor="accent1" w:val="4F81BD"/>
-      <w:sz w:val="24"/>
-      <w:szCs w:val="24"/>
+      <w:rFonts w:cstheme="majorBidi" w:eastAsiaTheme="majorEastAsia"/>
+      <w:i/>
+      <w:iCs/>
+      <w:color w:themeColor="text1" w:themeTint="D8" w:val="272727"/>
     </w:rPr>
   </w:style>
   <w:style w:styleId="Heading9" w:type="paragraph">
-    <w:name w:val="Heading 9"/>
+    <w:name w:val="heading 9"/>
     <w:basedOn w:val="Normal"/>
     <w:next w:val="BodyText"/>
+    <w:link w:val="Heading9Char"/>
     <w:uiPriority w:val="9"/>
+    <w:semiHidden/>
     <w:unhideWhenUsed/>
     <w:qFormat/>
+    <w:rsid w:val="00A10FD9"/>
     <w:pPr>
       <w:keepNext/>
       <w:keepLines/>
-      <w:spacing w:after="0" w:before="200"/>
+      <w:spacing w:after="0"/>
       <w:outlineLvl w:val="8"/>
     </w:pPr>
     <w:rPr>
+      <w:rFonts w:cstheme="majorBidi" w:eastAsiaTheme="majorEastAsia"/>
+      <w:color w:themeColor="text1" w:themeTint="D8" w:val="272727"/>
+    </w:rPr>
+  </w:style>
+  <w:style w:customStyle="1" w:styleId="Heading1Char" w:type="character">
+    <w:name w:val="Heading 1 Char"/>
+    <w:basedOn w:val="DefaultParagraphFont"/>
+    <w:link w:val="Heading1"/>
+    <w:uiPriority w:val="9"/>
+    <w:rsid w:val="00A10FD9"/>
+    <w:rPr>
       <w:rFonts w:asciiTheme="majorHAnsi" w:cstheme="majorBidi" w:eastAsiaTheme="majorEastAsia" w:hAnsiTheme="majorHAnsi"/>
-      <w:color w:themeColor="accent1" w:val="4F81BD"/>
-      <w:sz w:val="24"/>
-      <w:szCs w:val="24"/>
+      <w:color w:themeColor="accent1" w:themeShade="BF" w:val="0F4761"/>
+      <w:sz w:val="40"/>
+      <w:szCs w:val="40"/>
+    </w:rPr>
+  </w:style>
+  <w:style w:customStyle="1" w:styleId="Heading2Char" w:type="character">
+    <w:name w:val="Heading 2 Char"/>
+    <w:basedOn w:val="DefaultParagraphFont"/>
+    <w:link w:val="Heading2"/>
+    <w:uiPriority w:val="9"/>
+    <w:semiHidden/>
+    <w:rsid w:val="00A10FD9"/>
+    <w:rPr>
+      <w:rFonts w:asciiTheme="majorHAnsi" w:cstheme="majorBidi" w:eastAsiaTheme="majorEastAsia" w:hAnsiTheme="majorHAnsi"/>
+      <w:color w:themeColor="accent1" w:themeShade="BF" w:val="0F4761"/>
+      <w:sz w:val="32"/>
+      <w:szCs w:val="32"/>
+    </w:rPr>
+  </w:style>
+  <w:style w:customStyle="1" w:styleId="Heading3Char" w:type="character">
+    <w:name w:val="Heading 3 Char"/>
+    <w:basedOn w:val="DefaultParagraphFont"/>
+    <w:link w:val="Heading3"/>
+    <w:uiPriority w:val="9"/>
+    <w:semiHidden/>
+    <w:rsid w:val="00A10FD9"/>
+    <w:rPr>
+      <w:rFonts w:cstheme="majorBidi" w:eastAsiaTheme="majorEastAsia"/>
+      <w:color w:themeColor="accent1" w:themeShade="BF" w:val="0F4761"/>
+      <w:sz w:val="28"/>
+      <w:szCs w:val="28"/>
+    </w:rPr>
+  </w:style>
+  <w:style w:customStyle="1" w:styleId="Heading4Char" w:type="character">
+    <w:name w:val="Heading 4 Char"/>
+    <w:basedOn w:val="DefaultParagraphFont"/>
+    <w:link w:val="Heading4"/>
+    <w:uiPriority w:val="9"/>
+    <w:semiHidden/>
+    <w:rsid w:val="00A10FD9"/>
+    <w:rPr>
+      <w:rFonts w:cstheme="majorBidi" w:eastAsiaTheme="majorEastAsia"/>
+      <w:i/>
+      <w:iCs/>
+      <w:color w:themeColor="accent1" w:themeShade="BF" w:val="0F4761"/>
+    </w:rPr>
+  </w:style>
+  <w:style w:customStyle="1" w:styleId="Heading5Char" w:type="character">
+    <w:name w:val="Heading 5 Char"/>
+    <w:basedOn w:val="DefaultParagraphFont"/>
+    <w:link w:val="Heading5"/>
+    <w:uiPriority w:val="9"/>
+    <w:semiHidden/>
+    <w:rsid w:val="00A10FD9"/>
+    <w:rPr>
+      <w:rFonts w:cstheme="majorBidi" w:eastAsiaTheme="majorEastAsia"/>
+      <w:color w:themeColor="accent1" w:themeShade="BF" w:val="0F4761"/>
+    </w:rPr>
+  </w:style>
+  <w:style w:customStyle="1" w:styleId="Heading6Char" w:type="character">
+    <w:name w:val="Heading 6 Char"/>
+    <w:basedOn w:val="DefaultParagraphFont"/>
+    <w:link w:val="Heading6"/>
+    <w:uiPriority w:val="9"/>
+    <w:semiHidden/>
+    <w:rsid w:val="00A10FD9"/>
+    <w:rPr>
+      <w:rFonts w:cstheme="majorBidi" w:eastAsiaTheme="majorEastAsia"/>
+      <w:i/>
+      <w:iCs/>
+      <w:color w:themeColor="text1" w:themeTint="A6" w:val="595959"/>
+    </w:rPr>
+  </w:style>
+  <w:style w:customStyle="1" w:styleId="Heading7Char" w:type="character">
+    <w:name w:val="Heading 7 Char"/>
+    <w:basedOn w:val="DefaultParagraphFont"/>
+    <w:link w:val="Heading7"/>
+    <w:uiPriority w:val="9"/>
+    <w:semiHidden/>
+    <w:rsid w:val="00A10FD9"/>
+    <w:rPr>
+      <w:rFonts w:cstheme="majorBidi" w:eastAsiaTheme="majorEastAsia"/>
+      <w:color w:themeColor="text1" w:themeTint="A6" w:val="595959"/>
+    </w:rPr>
+  </w:style>
+  <w:style w:customStyle="1" w:styleId="Heading8Char" w:type="character">
+    <w:name w:val="Heading 8 Char"/>
+    <w:basedOn w:val="DefaultParagraphFont"/>
+    <w:link w:val="Heading8"/>
+    <w:uiPriority w:val="9"/>
+    <w:semiHidden/>
+    <w:rsid w:val="00A10FD9"/>
+    <w:rPr>
+      <w:rFonts w:cstheme="majorBidi" w:eastAsiaTheme="majorEastAsia"/>
+      <w:i/>
+      <w:iCs/>
+      <w:color w:themeColor="text1" w:themeTint="D8" w:val="272727"/>
+    </w:rPr>
+  </w:style>
+  <w:style w:customStyle="1" w:styleId="Heading9Char" w:type="character">
+    <w:name w:val="Heading 9 Char"/>
+    <w:basedOn w:val="DefaultParagraphFont"/>
+    <w:link w:val="Heading9"/>
+    <w:uiPriority w:val="9"/>
+    <w:semiHidden/>
+    <w:rsid w:val="00A10FD9"/>
+    <w:rPr>
+      <w:rFonts w:cstheme="majorBidi" w:eastAsiaTheme="majorEastAsia"/>
+      <w:color w:themeColor="text1" w:themeTint="D8" w:val="272727"/>
     </w:rPr>
   </w:style>
   <w:style w:styleId="BlockText" w:type="paragraph">
@@ -1855,8 +1973,8 @@
   </w:style>
   <w:style w:styleId="FootnoteBlockText" w:type="paragraph">
     <w:name w:val="Footnote Block Text"/>
-    <w:basedOn w:val="Footnote Text"/>
-    <w:next w:val="Footnote Text"/>
+    <w:basedOn w:val="FootnoteText"/>
+    <w:next w:val="FootnoteText"/>
     <w:uiPriority w:val="9"/>
     <w:unhideWhenUsed/>
     <w:qFormat/>
@@ -1886,13 +2004,6 @@
       </w:tblCellMar>
     </w:tblPr>
     <w:tblStylePr w:type="firstRow">
-      <w:tblPr>
-        <w:jc w:val="left"/>
-        <w:tblInd w:type="dxa" w:w="0"/>
-      </w:tblPr>
-      <w:trPr>
-        <w:jc w:val="left"/>
-      </w:trPr>
       <w:tcPr>
         <w:tcBorders>
           <w:bottom w:val="single"/>
@@ -2248,44 +2359,44 @@
         <a:sysClr val="window" lastClr="FFFFFF"/>
       </a:lt1>
       <a:dk2>
-        <a:srgbClr val="1F497D"/>
+        <a:srgbClr val="0E2841"/>
       </a:dk2>
       <a:lt2>
-        <a:srgbClr val="EEECE1"/>
+        <a:srgbClr val="E8E8E8"/>
       </a:lt2>
       <a:accent1>
-        <a:srgbClr val="4F81BD"/>
+        <a:srgbClr val="156082"/>
       </a:accent1>
       <a:accent2>
-        <a:srgbClr val="C0504D"/>
+        <a:srgbClr val="E97132"/>
       </a:accent2>
       <a:accent3>
-        <a:srgbClr val="9BBB59"/>
+        <a:srgbClr val="196B24"/>
       </a:accent3>
       <a:accent4>
-        <a:srgbClr val="8064A2"/>
+        <a:srgbClr val="0F9ED5"/>
       </a:accent4>
       <a:accent5>
-        <a:srgbClr val="4BACC6"/>
+        <a:srgbClr val="A02B93"/>
       </a:accent5>
       <a:accent6>
-        <a:srgbClr val="F79646"/>
+        <a:srgbClr val="4EA72E"/>
       </a:accent6>
       <a:hlink>
-        <a:srgbClr val="0000FF"/>
+        <a:srgbClr val="467886"/>
       </a:hlink>
       <a:folHlink>
-        <a:srgbClr val="800080"/>
+        <a:srgbClr val="96607D"/>
       </a:folHlink>
     </a:clrScheme>
     <a:fontScheme name="Office">
       <a:majorFont>
-        <a:latin typeface="Calibri"/>
+        <a:latin typeface="Aptos Display" panose="02110004020202020204"/>
         <a:ea typeface=""/>
         <a:cs typeface=""/>
-        <a:font script="Jpan" typeface="ＭＳ ゴシック"/>
+        <a:font script="Jpan" typeface="游ゴシック Light"/>
         <a:font script="Hang" typeface="맑은 고딕"/>
-        <a:font script="Hans" typeface="宋体"/>
+        <a:font script="Hans" typeface="等线 Light"/>
         <a:font script="Hant" typeface="新細明體"/>
         <a:font script="Arab" typeface="Times New Roman"/>
         <a:font script="Hebr" typeface="Times New Roman"/>
@@ -2312,14 +2423,32 @@
         <a:font script="Mong" typeface="Mongolian Baiti"/>
         <a:font script="Viet" typeface="Times New Roman"/>
         <a:font script="Uigh" typeface="Microsoft Uighur"/>
+        <a:font script="Geor" typeface="Sylfaen"/>
+        <a:font script="Armn" typeface="Arial"/>
+        <a:font script="Bugi" typeface="Leelawadee UI"/>
+        <a:font script="Bopo" typeface="Microsoft JhengHei"/>
+        <a:font script="Java" typeface="Javanese Text"/>
+        <a:font script="Lisu" typeface="Segoe UI"/>
+        <a:font script="Mymr" typeface="Myanmar Text"/>
+        <a:font script="Nkoo" typeface="Ebrima"/>
+        <a:font script="Olck" typeface="Nirmala UI"/>
+        <a:font script="Osma" typeface="Ebrima"/>
+        <a:font script="Phag" typeface="Phagspa"/>
+        <a:font script="Syrn" typeface="Estrangelo Edessa"/>
+        <a:font script="Syrj" typeface="Estrangelo Edessa"/>
+        <a:font script="Syre" typeface="Estrangelo Edessa"/>
+        <a:font script="Sora" typeface="Nirmala UI"/>
+        <a:font script="Tale" typeface="Microsoft Tai Le"/>
+        <a:font script="Talu" typeface="Microsoft New Tai Lue"/>
+        <a:font script="Tfng" typeface="Ebrima"/>
       </a:majorFont>
       <a:minorFont>
-        <a:latin typeface="Cambria"/>
+        <a:latin typeface="Aptos" panose="02110004020202020204"/>
         <a:ea typeface=""/>
         <a:cs typeface=""/>
-        <a:font script="Jpan" typeface="ＭＳ 明朝"/>
+        <a:font script="Jpan" typeface="游明朝"/>
         <a:font script="Hang" typeface="맑은 고딕"/>
-        <a:font script="Hans" typeface="宋体"/>
+        <a:font script="Hans" typeface="等线"/>
         <a:font script="Hant" typeface="新細明體"/>
         <a:font script="Arab" typeface="Arial"/>
         <a:font script="Hebr" typeface="Arial"/>
@@ -2346,6 +2475,24 @@
         <a:font script="Mong" typeface="Mongolian Baiti"/>
         <a:font script="Viet" typeface="Arial"/>
         <a:font script="Uigh" typeface="Microsoft Uighur"/>
+        <a:font script="Geor" typeface="Sylfaen"/>
+        <a:font script="Armn" typeface="Arial"/>
+        <a:font script="Bugi" typeface="Leelawadee UI"/>
+        <a:font script="Bopo" typeface="Microsoft JhengHei"/>
+        <a:font script="Java" typeface="Javanese Text"/>
+        <a:font script="Lisu" typeface="Segoe UI"/>
+        <a:font script="Mymr" typeface="Myanmar Text"/>
+        <a:font script="Nkoo" typeface="Ebrima"/>
+        <a:font script="Olck" typeface="Nirmala UI"/>
+        <a:font script="Osma" typeface="Ebrima"/>
+        <a:font script="Phag" typeface="Phagspa"/>
+        <a:font script="Syrn" typeface="Estrangelo Edessa"/>
+        <a:font script="Syrj" typeface="Estrangelo Edessa"/>
+        <a:font script="Syre" typeface="Estrangelo Edessa"/>
+        <a:font script="Sora" typeface="Nirmala UI"/>
+        <a:font script="Tale" typeface="Microsoft Tai Le"/>
+        <a:font script="Talu" typeface="Microsoft New Tai Lue"/>
+        <a:font script="Tfng" typeface="Ebrima"/>
       </a:minorFont>
     </a:fontScheme>
     <a:fmtScheme name="Office">
@@ -2357,200 +2504,141 @@
           <a:gsLst>
             <a:gs pos="0">
               <a:schemeClr val="phClr">
-                <a:tint val="50000"/>
-                <a:satMod val="300000"/>
+                <a:lumMod val="110000"/>
+                <a:satMod val="105000"/>
+                <a:tint val="67000"/>
               </a:schemeClr>
             </a:gs>
-            <a:gs pos="35000">
+            <a:gs pos="50000">
               <a:schemeClr val="phClr">
-                <a:tint val="37000"/>
-                <a:satMod val="300000"/>
+                <a:lumMod val="105000"/>
+                <a:satMod val="103000"/>
+                <a:tint val="73000"/>
               </a:schemeClr>
             </a:gs>
             <a:gs pos="100000">
               <a:schemeClr val="phClr">
-                <a:tint val="15000"/>
-                <a:satMod val="350000"/>
+                <a:lumMod val="105000"/>
+                <a:satMod val="109000"/>
+                <a:tint val="81000"/>
               </a:schemeClr>
             </a:gs>
           </a:gsLst>
-          <a:lin ang="16200000" scaled="1"/>
+          <a:lin ang="5400000" scaled="0"/>
         </a:gradFill>
         <a:gradFill rotWithShape="1">
           <a:gsLst>
             <a:gs pos="0">
               <a:schemeClr val="phClr">
-                <a:tint val="100000"/>
+                <a:satMod val="103000"/>
+                <a:lumMod val="102000"/>
+                <a:tint val="94000"/>
+              </a:schemeClr>
+            </a:gs>
+            <a:gs pos="50000">
+              <a:schemeClr val="phClr">
+                <a:satMod val="110000"/>
+                <a:lumMod val="100000"/>
                 <a:shade val="100000"/>
-                <a:satMod val="130000"/>
               </a:schemeClr>
             </a:gs>
             <a:gs pos="100000">
               <a:schemeClr val="phClr">
-                <a:tint val="50000"/>
-                <a:shade val="100000"/>
-                <a:satMod val="350000"/>
+                <a:lumMod val="99000"/>
+                <a:satMod val="120000"/>
+                <a:shade val="78000"/>
               </a:schemeClr>
             </a:gs>
           </a:gsLst>
-          <a:lin ang="16200000" scaled="0"/>
+          <a:lin ang="5400000" scaled="0"/>
         </a:gradFill>
       </a:fillStyleLst>
       <a:lnStyleLst>
-        <a:ln w="9525" cap="flat" cmpd="sng" algn="ctr">
-          <a:solidFill>
-            <a:schemeClr val="phClr">
-              <a:shade val="95000"/>
-              <a:satMod val="105000"/>
-            </a:schemeClr>
-          </a:solidFill>
-          <a:prstDash val="solid"/>
-        </a:ln>
-        <a:ln w="25400" cap="flat" cmpd="sng" algn="ctr">
+        <a:ln w="6350" cap="flat" cmpd="sng" algn="ctr">
           <a:solidFill>
             <a:schemeClr val="phClr"/>
           </a:solidFill>
           <a:prstDash val="solid"/>
+          <a:miter lim="800000"/>
         </a:ln>
-        <a:ln w="38100" cap="flat" cmpd="sng" algn="ctr">
+        <a:ln w="12700" cap="flat" cmpd="sng" algn="ctr">
           <a:solidFill>
             <a:schemeClr val="phClr"/>
           </a:solidFill>
           <a:prstDash val="solid"/>
+          <a:miter lim="800000"/>
+        </a:ln>
+        <a:ln w="19050" cap="flat" cmpd="sng" algn="ctr">
+          <a:solidFill>
+            <a:schemeClr val="phClr"/>
+          </a:solidFill>
+          <a:prstDash val="solid"/>
+          <a:miter lim="800000"/>
         </a:ln>
       </a:lnStyleLst>
       <a:effectStyleLst>
         <a:effectStyle>
+          <a:effectLst/>
+        </a:effectStyle>
+        <a:effectStyle>
+          <a:effectLst/>
+        </a:effectStyle>
+        <a:effectStyle>
           <a:effectLst>
-            <a:outerShdw blurRad="40000" dist="20000" dir="5400000" rotWithShape="0">
+            <a:outerShdw blurRad="57150" dist="19050" dir="5400000" algn="ctr" rotWithShape="0">
               <a:srgbClr val="000000">
-                <a:alpha val="38000"/>
+                <a:alpha val="63000"/>
               </a:srgbClr>
             </a:outerShdw>
           </a:effectLst>
-        </a:effectStyle>
-        <a:effectStyle>
-          <a:effectLst>
-            <a:outerShdw blurRad="40000" dist="23000" dir="5400000" rotWithShape="0">
-              <a:srgbClr val="000000">
-                <a:alpha val="35000"/>
-              </a:srgbClr>
-            </a:outerShdw>
-          </a:effectLst>
-        </a:effectStyle>
-        <a:effectStyle>
-          <a:effectLst>
-            <a:outerShdw blurRad="40000" dist="23000" dir="5400000" rotWithShape="0">
-              <a:srgbClr val="000000">
-                <a:alpha val="35000"/>
-              </a:srgbClr>
-            </a:outerShdw>
-          </a:effectLst>
-          <a:scene3d>
-            <a:camera prst="orthographicFront">
-              <a:rot lat="0" lon="0" rev="0"/>
-            </a:camera>
-            <a:lightRig rig="threePt" dir="t">
-              <a:rot lat="0" lon="0" rev="1200000"/>
-            </a:lightRig>
-          </a:scene3d>
-          <a:sp3d>
-            <a:bevelT w="63500" h="25400"/>
-          </a:sp3d>
         </a:effectStyle>
       </a:effectStyleLst>
       <a:bgFillStyleLst>
         <a:solidFill>
           <a:schemeClr val="phClr"/>
         </a:solidFill>
+        <a:solidFill>
+          <a:schemeClr val="phClr">
+            <a:tint val="95000"/>
+            <a:satMod val="170000"/>
+          </a:schemeClr>
+        </a:solidFill>
         <a:gradFill rotWithShape="1">
           <a:gsLst>
             <a:gs pos="0">
               <a:schemeClr val="phClr">
-                <a:tint val="40000"/>
-                <a:satMod val="350000"/>
+                <a:tint val="93000"/>
+                <a:satMod val="150000"/>
+                <a:shade val="98000"/>
+                <a:lumMod val="102000"/>
               </a:schemeClr>
             </a:gs>
-            <a:gs pos="40000">
+            <a:gs pos="50000">
               <a:schemeClr val="phClr">
-                <a:tint val="45000"/>
-                <a:shade val="99000"/>
-                <a:satMod val="350000"/>
+                <a:tint val="98000"/>
+                <a:satMod val="130000"/>
+                <a:shade val="90000"/>
+                <a:lumMod val="103000"/>
               </a:schemeClr>
             </a:gs>
             <a:gs pos="100000">
               <a:schemeClr val="phClr">
-                <a:shade val="20000"/>
-                <a:satMod val="255000"/>
+                <a:shade val="63000"/>
+                <a:satMod val="120000"/>
               </a:schemeClr>
             </a:gs>
           </a:gsLst>
-          <a:path path="circle">
-            <a:fillToRect l="50000" t="-80000" r="50000" b="180000"/>
-          </a:path>
-        </a:gradFill>
-        <a:gradFill rotWithShape="1">
-          <a:gsLst>
-            <a:gs pos="0">
-              <a:schemeClr val="phClr">
-                <a:tint val="80000"/>
-                <a:satMod val="300000"/>
-              </a:schemeClr>
-            </a:gs>
-            <a:gs pos="100000">
-              <a:schemeClr val="phClr">
-                <a:shade val="30000"/>
-                <a:satMod val="200000"/>
-              </a:schemeClr>
-            </a:gs>
-          </a:gsLst>
-          <a:path path="circle">
-            <a:fillToRect l="50000" t="50000" r="50000" b="50000"/>
-          </a:path>
+          <a:lin ang="5400000" scaled="0"/>
         </a:gradFill>
       </a:bgFillStyleLst>
     </a:fmtScheme>
   </a:themeElements>
-  <a:objectDefaults>
-    <a:spDef>
-      <a:spPr/>
-      <a:bodyPr/>
-      <a:lstStyle/>
-      <a:style>
-        <a:lnRef idx="1">
-          <a:schemeClr val="accent1"/>
-        </a:lnRef>
-        <a:fillRef idx="3">
-          <a:schemeClr val="accent1"/>
-        </a:fillRef>
-        <a:effectRef idx="2">
-          <a:schemeClr val="accent1"/>
-        </a:effectRef>
-        <a:fontRef idx="minor">
-          <a:schemeClr val="lt1"/>
-        </a:fontRef>
-      </a:style>
-    </a:spDef>
-    <a:lnDef>
-      <a:spPr/>
-      <a:bodyPr/>
-      <a:lstStyle/>
-      <a:style>
-        <a:lnRef idx="2">
-          <a:schemeClr val="accent1"/>
-        </a:lnRef>
-        <a:fillRef idx="0">
-          <a:schemeClr val="accent1"/>
-        </a:fillRef>
-        <a:effectRef idx="1">
-          <a:schemeClr val="accent1"/>
-        </a:effectRef>
-        <a:fontRef idx="minor">
-          <a:schemeClr val="tx1"/>
-        </a:fontRef>
-      </a:style>
-    </a:lnDef>
-  </a:objectDefaults>
+  <a:objectDefaults/>
   <a:extraClrSchemeLst/>
+  <a:extLst>
+    <a:ext uri="{05A4C25C-085E-4340-85A3-A5531E510DB2}">
+      <thm15:themeFamily xmlns:thm15="http://schemas.microsoft.com/office/thememl/2012/main" name="Office Theme" id="{2E142A2C-CD16-42D6-873A-C26D2A0506FA}" vid="{1BDDFF52-6CD6-40A5-AB3C-68EB2F1E4D0A}"/>
+    </a:ext>
+  </a:extLst>
 </a:theme>
 </file>
</xml_diff>

<commit_message>
Tanda diagramas UD07-13, sección CG-NAT en UD4 y docs actualizados
</commit_message>
<xml_diff>
--- a/docx/01-introduccion/boletin-U01-avanzado-resuelto.docx
+++ b/docx/01-introduccion/boletin-U01-avanzado-resuelto.docx
@@ -28,7 +28,7 @@
         </w:p>
       </w:sdtContent>
     </w:sdt>
-    <w:bookmarkStart w:id="9" w:name="X4858feb35e1492c05c4211374ee048c1425a805"/>
+    <w:bookmarkStart w:id="20" w:name="X4858feb35e1492c05c4211374ee048c1425a805"/>
     <w:p>
       <w:pPr>
         <w:pStyle w:val="Heading1"/>
@@ -37,8 +37,8 @@
         <w:t xml:space="preserve">Boletín de Introducción — Avanzado (Resuelto)</w:t>
       </w:r>
     </w:p>
-    <w:bookmarkEnd w:id="9"/>
-    <w:bookmarkStart w:id="18" w:name="X68d80aaea901b11f50f84b58517a0e5cee3e834"/>
+    <w:bookmarkEnd w:id="20"/>
+    <w:bookmarkStart w:id="29" w:name="X68d80aaea901b11f50f84b58517a0e5cee3e834"/>
     <w:p>
       <w:pPr>
         <w:pStyle w:val="Heading1"/>
@@ -54,7 +54,7 @@
         </w:pict>
       </w:r>
     </w:p>
-    <w:bookmarkStart w:id="10" w:name="diagnóstico-completo-no-tengo-internet"/>
+    <w:bookmarkStart w:id="21" w:name="diagnóstico-completo-no-tengo-internet"/>
     <w:p>
       <w:pPr>
         <w:pStyle w:val="Heading2"/>
@@ -66,7 +66,13 @@
         <w:t xml:space="preserve"> </w:t>
       </w:r>
       <w:r>
-        <w:t xml:space="preserve">“No tengo Internet”</w:t>
+        <w:t xml:space="preserve">“</w:t>
+      </w:r>
+      <w:r>
+        <w:t xml:space="preserve">No tengo Internet</w:t>
+      </w:r>
+      <w:r>
+        <w:t xml:space="preserve">”</w:t>
       </w:r>
     </w:p>
     <w:p>
@@ -235,8 +241,8 @@
         <w:t xml:space="preserve">. No necesitas mirar los de arriba.</w:t>
       </w:r>
     </w:p>
-    <w:bookmarkEnd w:id="10"/>
-    <w:bookmarkStart w:id="11" w:name="la-historia-de-un-paquete"/>
+    <w:bookmarkEnd w:id="21"/>
+    <w:bookmarkStart w:id="22" w:name="la-historia-de-un-paquete"/>
     <w:p>
       <w:pPr>
         <w:pStyle w:val="Heading2"/>
@@ -342,8 +348,8 @@
         <w:t xml:space="preserve">el navegador envía una petición HTTP GET al servidor de Google. El servidor responde con el HTML de la página, que viaja de vuelta en múltiples paquetes.</w:t>
       </w:r>
     </w:p>
-    <w:bookmarkEnd w:id="11"/>
-    <w:bookmarkStart w:id="12" w:name="arp-el-protocolo-olvidado"/>
+    <w:bookmarkEnd w:id="22"/>
+    <w:bookmarkStart w:id="23" w:name="arp-el-protocolo-olvidado"/>
     <w:p>
       <w:pPr>
         <w:pStyle w:val="Heading2"/>
@@ -394,7 +400,13 @@
         <w:t xml:space="preserve"> </w:t>
       </w:r>
       <w:r>
-        <w:t xml:space="preserve">“bloquea”</w:t>
+        <w:t xml:space="preserve">“</w:t>
+      </w:r>
+      <w:r>
+        <w:t xml:space="preserve">bloquea</w:t>
+      </w:r>
+      <w:r>
+        <w:t xml:space="preserve">”</w:t>
       </w:r>
       <w:r>
         <w:t xml:space="preserve">.</w:t>
@@ -435,7 +447,21 @@
           <w:i/>
           <w:iCs/>
         </w:rPr>
-        <w:t xml:space="preserve">“¿Quién tiene la IP 192.168.1.1?”</w:t>
+        <w:t xml:space="preserve">“</w:t>
+      </w:r>
+      <w:r>
+        <w:rPr>
+          <w:i/>
+          <w:iCs/>
+        </w:rPr>
+        <w:t xml:space="preserve">¿Quién tiene la IP 192.168.1.1?</w:t>
+      </w:r>
+      <w:r>
+        <w:rPr>
+          <w:i/>
+          <w:iCs/>
+        </w:rPr>
+        <w:t xml:space="preserve">”</w:t>
       </w:r>
       <w:r>
         <w:t xml:space="preserve"> </w:t>
@@ -479,7 +505,21 @@
           <w:i/>
           <w:iCs/>
         </w:rPr>
-        <w:t xml:space="preserve">“Yo, y mi MAC es aa:bb:cc:dd:ee:ff”</w:t>
+        <w:t xml:space="preserve">“</w:t>
+      </w:r>
+      <w:r>
+        <w:rPr>
+          <w:i/>
+          <w:iCs/>
+        </w:rPr>
+        <w:t xml:space="preserve">Yo, y mi MAC es aa:bb:cc:dd:ee:ff</w:t>
+      </w:r>
+      <w:r>
+        <w:rPr>
+          <w:i/>
+          <w:iCs/>
+        </w:rPr>
+        <w:t xml:space="preserve">”</w:t>
       </w:r>
       <w:r>
         <w:t xml:space="preserve">.</w:t>
@@ -517,8 +557,8 @@
         <w:t xml:space="preserve">Sin ARP, la capa 2 (Ethernet) no puede funcionar porque no sabe a quién enviar la trama.</w:t>
       </w:r>
     </w:p>
-    <w:bookmarkEnd w:id="12"/>
-    <w:bookmarkStart w:id="13" w:name="argumenta-contra-conrad"/>
+    <w:bookmarkEnd w:id="23"/>
+    <w:bookmarkStart w:id="24" w:name="argumenta-contra-conrad"/>
     <w:p>
       <w:pPr>
         <w:pStyle w:val="Heading2"/>
@@ -574,7 +614,13 @@
         <w:t xml:space="preserve"> </w:t>
       </w:r>
       <w:r>
-        <w:t xml:space="preserve">“lo arregla”</w:t>
+        <w:t xml:space="preserve">“</w:t>
+      </w:r>
+      <w:r>
+        <w:t xml:space="preserve">lo arregla</w:t>
+      </w:r>
+      <w:r>
+        <w:t xml:space="preserve">”</w:t>
       </w:r>
       <w:r>
         <w:t xml:space="preserve"> </w:t>
@@ -608,14 +654,20 @@
         <w:t xml:space="preserve"> </w:t>
       </w:r>
       <w:r>
-        <w:t xml:space="preserve">“el cable estaba suelto”</w:t>
+        <w:t xml:space="preserve">“</w:t>
+      </w:r>
+      <w:r>
+        <w:t xml:space="preserve">el cable estaba suelto</w:t>
+      </w:r>
+      <w:r>
+        <w:t xml:space="preserve">”</w:t>
       </w:r>
       <w:r>
         <w:t xml:space="preserve">, aprende y no te vuelve a llamar por lo mismo.</w:t>
       </w:r>
     </w:p>
-    <w:bookmarkEnd w:id="13"/>
-    <w:bookmarkStart w:id="14" w:name="diseña-la-red-del-aula"/>
+    <w:bookmarkEnd w:id="24"/>
+    <w:bookmarkStart w:id="25" w:name="diseña-la-red-del-aula"/>
     <w:p>
       <w:pPr>
         <w:pStyle w:val="Heading2"/>
@@ -756,8 +808,8 @@
         <w:t xml:space="preserve">- Con un solo switch de 48 puertos, la topología es simple, fácil de mantener y con margen para crecer.</w:t>
       </w:r>
     </w:p>
-    <w:bookmarkEnd w:id="14"/>
-    <w:bookmarkStart w:id="15" w:name="mente-binaria"/>
+    <w:bookmarkEnd w:id="25"/>
+    <w:bookmarkStart w:id="26" w:name="mente-binaria"/>
     <w:p>
       <w:pPr>
         <w:pStyle w:val="Heading2"/>
@@ -851,8 +903,8 @@
         <w:t xml:space="preserve">, no KB (2.560 KB serían 2.621.440 bytes). Su número es correcto pero la etiqueta es falsa.</w:t>
       </w:r>
     </w:p>
-    <w:bookmarkEnd w:id="15"/>
-    <w:bookmarkStart w:id="16" w:name="el-mapa-del-curso"/>
+    <w:bookmarkEnd w:id="26"/>
+    <w:bookmarkStart w:id="27" w:name="el-mapa-del-curso"/>
     <w:p>
       <w:pPr>
         <w:pStyle w:val="Heading2"/>
@@ -905,8 +957,8 @@
         <w:t xml:space="preserve">Durante todo el curso, cada vez que algo falle, volverás a la escalera del ping. Aprenderlo primero te da una herramienta que acompaña todo el curso.</w:t>
       </w:r>
     </w:p>
-    <w:bookmarkEnd w:id="16"/>
-    <w:bookmarkStart w:id="17" w:name="Xc8e5910c22462a634687887ceb7faf0b5be8d57"/>
+    <w:bookmarkEnd w:id="27"/>
+    <w:bookmarkStart w:id="28" w:name="Xc8e5910c22462a634687887ceb7faf0b5be8d57"/>
     <w:p>
       <w:pPr>
         <w:pStyle w:val="Heading2"/>
@@ -957,13 +1009,9 @@
         <w:t xml:space="preserve">Si el simulador no arranca o da problemas al iniciar sesión con la cuenta de la Cisco Networking Academy, el administrador no recurre al azar ni formatea el equipo. El procedimiento consiste en: verificar los requisitos del sistema operativo, comprobar la conexión a Internet que valida las credenciales y, en caso de persistir el error, documentar el mensaje exacto de la excepción con captura de pantalla y los pasos que diste hasta el fallo, y pedir ayuda con todo eso delante (al profesor o en el foro del aula virtual), para que quien te ayude pueda reproducirlo sin preguntarte lo mismo dos veces.</w:t>
       </w:r>
     </w:p>
-    <w:bookmarkEnd w:id="17"/>
-    <w:bookmarkEnd w:id="18"/>
-    <w:sectPr>
-      <w:footnotePr>
-        <w:numRestart w:val="eachSect"/>
-      </w:footnotePr>
-    </w:sectPr>
+    <w:bookmarkEnd w:id="28"/>
+    <w:bookmarkEnd w:id="29"/>
+    <w:sectPr/>
   </w:body>
 </w:document>
 </file>
@@ -1001,7 +1049,7 @@
       <w:lvlText w:val=" "/>
       <w:lvlJc w:val="left"/>
       <w:pPr>
-        <w:ind w:left="720" w:hanging="360"/>
+        <w:ind w:left="720" w:hanging="480"/>
       </w:pPr>
     </w:lvl>
     <w:lvl w:ilvl="1">
@@ -1009,7 +1057,7 @@
       <w:lvlText w:val=" "/>
       <w:lvlJc w:val="left"/>
       <w:pPr>
-        <w:ind w:left="1440" w:hanging="360"/>
+        <w:ind w:left="1440" w:hanging="480"/>
       </w:pPr>
     </w:lvl>
     <w:lvl w:ilvl="2">
@@ -1017,7 +1065,7 @@
       <w:lvlText w:val=" "/>
       <w:lvlJc w:val="left"/>
       <w:pPr>
-        <w:ind w:left="2160" w:hanging="360"/>
+        <w:ind w:left="2160" w:hanging="480"/>
       </w:pPr>
     </w:lvl>
     <w:lvl w:ilvl="3">
@@ -1025,7 +1073,7 @@
       <w:lvlText w:val=" "/>
       <w:lvlJc w:val="left"/>
       <w:pPr>
-        <w:ind w:left="2880" w:hanging="360"/>
+        <w:ind w:left="2880" w:hanging="480"/>
       </w:pPr>
     </w:lvl>
     <w:lvl w:ilvl="4">
@@ -1033,7 +1081,7 @@
       <w:lvlText w:val=" "/>
       <w:lvlJc w:val="left"/>
       <w:pPr>
-        <w:ind w:left="3600" w:hanging="360"/>
+        <w:ind w:left="3600" w:hanging="480"/>
       </w:pPr>
     </w:lvl>
     <w:lvl w:ilvl="5">
@@ -1041,7 +1089,7 @@
       <w:lvlText w:val=" "/>
       <w:lvlJc w:val="left"/>
       <w:pPr>
-        <w:ind w:left="4320" w:hanging="360"/>
+        <w:ind w:left="4320" w:hanging="480"/>
       </w:pPr>
     </w:lvl>
     <w:lvl w:ilvl="6">
@@ -1049,7 +1097,7 @@
       <w:lvlText w:val=" "/>
       <w:lvlJc w:val="left"/>
       <w:pPr>
-        <w:ind w:left="5040" w:hanging="360"/>
+        <w:ind w:left="5040" w:hanging="480"/>
       </w:pPr>
     </w:lvl>
     <w:lvl w:ilvl="7">
@@ -1057,7 +1105,7 @@
       <w:lvlText w:val=" "/>
       <w:lvlJc w:val="left"/>
       <w:pPr>
-        <w:ind w:left="5760" w:hanging="360"/>
+        <w:ind w:left="5760" w:hanging="480"/>
       </w:pPr>
     </w:lvl>
     <w:lvl w:ilvl="8">
@@ -1065,7 +1113,7 @@
       <w:lvlText w:val=" "/>
       <w:lvlJc w:val="left"/>
       <w:pPr>
-        <w:ind w:left="6480" w:hanging="360"/>
+        <w:ind w:left="6480" w:hanging="480"/>
       </w:pPr>
     </w:lvl>
   </w:abstractNum>
@@ -1078,7 +1126,7 @@
       <w:lvlText w:val="%1."/>
       <w:lvlJc w:val="left"/>
       <w:pPr>
-        <w:ind w:left="720" w:hanging="360"/>
+        <w:ind w:left="720" w:hanging="480"/>
       </w:pPr>
     </w:lvl>
     <w:lvl w:ilvl="1">
@@ -1087,7 +1135,7 @@
       <w:lvlText w:val="%2."/>
       <w:lvlJc w:val="left"/>
       <w:pPr>
-        <w:ind w:left="1440" w:hanging="360"/>
+        <w:ind w:left="1440" w:hanging="480"/>
       </w:pPr>
     </w:lvl>
     <w:lvl w:ilvl="2">
@@ -1096,7 +1144,7 @@
       <w:lvlText w:val="%3."/>
       <w:lvlJc w:val="left"/>
       <w:pPr>
-        <w:ind w:left="2160" w:hanging="360"/>
+        <w:ind w:left="2160" w:hanging="480"/>
       </w:pPr>
     </w:lvl>
     <w:lvl w:ilvl="3">
@@ -1105,7 +1153,7 @@
       <w:lvlText w:val="%4."/>
       <w:lvlJc w:val="left"/>
       <w:pPr>
-        <w:ind w:left="2880" w:hanging="360"/>
+        <w:ind w:left="2880" w:hanging="480"/>
       </w:pPr>
     </w:lvl>
     <w:lvl w:ilvl="4">
@@ -1114,7 +1162,7 @@
       <w:lvlText w:val="%5."/>
       <w:lvlJc w:val="left"/>
       <w:pPr>
-        <w:ind w:left="3600" w:hanging="360"/>
+        <w:ind w:left="3600" w:hanging="480"/>
       </w:pPr>
     </w:lvl>
     <w:lvl w:ilvl="5">
@@ -1123,7 +1171,7 @@
       <w:lvlText w:val="%6."/>
       <w:lvlJc w:val="left"/>
       <w:pPr>
-        <w:ind w:left="4320" w:hanging="360"/>
+        <w:ind w:left="4320" w:hanging="480"/>
       </w:pPr>
     </w:lvl>
     <w:lvl w:ilvl="6">
@@ -1132,7 +1180,7 @@
       <w:lvlText w:val="%7."/>
       <w:lvlJc w:val="left"/>
       <w:pPr>
-        <w:ind w:left="5040" w:hanging="360"/>
+        <w:ind w:left="5040" w:hanging="480"/>
       </w:pPr>
     </w:lvl>
     <w:lvl w:ilvl="7">
@@ -1141,7 +1189,7 @@
       <w:lvlText w:val="%8."/>
       <w:lvlJc w:val="left"/>
       <w:pPr>
-        <w:ind w:left="5760" w:hanging="360"/>
+        <w:ind w:left="5760" w:hanging="480"/>
       </w:pPr>
     </w:lvl>
     <w:lvl w:ilvl="8">
@@ -1150,7 +1198,7 @@
       <w:lvlText w:val="%9."/>
       <w:lvlJc w:val="left"/>
       <w:pPr>
-        <w:ind w:left="6480" w:hanging="360"/>
+        <w:ind w:left="6480" w:hanging="480"/>
       </w:pPr>
     </w:lvl>
   </w:abstractNum>
@@ -1163,7 +1211,7 @@
       <w:lvlText w:val="%1)"/>
       <w:lvlJc w:val="left"/>
       <w:pPr>
-        <w:ind w:left="720" w:hanging="360"/>
+        <w:ind w:left="720" w:hanging="480"/>
       </w:pPr>
     </w:lvl>
     <w:lvl w:ilvl="1">
@@ -1172,7 +1220,7 @@
       <w:lvlText w:val="%2)"/>
       <w:lvlJc w:val="left"/>
       <w:pPr>
-        <w:ind w:left="1440" w:hanging="360"/>
+        <w:ind w:left="1440" w:hanging="480"/>
       </w:pPr>
     </w:lvl>
     <w:lvl w:ilvl="2">
@@ -1181,7 +1229,7 @@
       <w:lvlText w:val="%3)"/>
       <w:lvlJc w:val="left"/>
       <w:pPr>
-        <w:ind w:left="2160" w:hanging="360"/>
+        <w:ind w:left="2160" w:hanging="480"/>
       </w:pPr>
     </w:lvl>
     <w:lvl w:ilvl="3">
@@ -1190,7 +1238,7 @@
       <w:lvlText w:val="%4)"/>
       <w:lvlJc w:val="left"/>
       <w:pPr>
-        <w:ind w:left="2880" w:hanging="360"/>
+        <w:ind w:left="2880" w:hanging="480"/>
       </w:pPr>
     </w:lvl>
     <w:lvl w:ilvl="4">
@@ -1199,7 +1247,7 @@
       <w:lvlText w:val="%5)"/>
       <w:lvlJc w:val="left"/>
       <w:pPr>
-        <w:ind w:left="3600" w:hanging="360"/>
+        <w:ind w:left="3600" w:hanging="480"/>
       </w:pPr>
     </w:lvl>
     <w:lvl w:ilvl="5">
@@ -1208,7 +1256,7 @@
       <w:lvlText w:val="%6)"/>
       <w:lvlJc w:val="left"/>
       <w:pPr>
-        <w:ind w:left="4320" w:hanging="360"/>
+        <w:ind w:left="4320" w:hanging="480"/>
       </w:pPr>
     </w:lvl>
     <w:lvl w:ilvl="6">
@@ -1217,7 +1265,7 @@
       <w:lvlText w:val="%7)"/>
       <w:lvlJc w:val="left"/>
       <w:pPr>
-        <w:ind w:left="5040" w:hanging="360"/>
+        <w:ind w:left="5040" w:hanging="480"/>
       </w:pPr>
     </w:lvl>
     <w:lvl w:ilvl="7">
@@ -1226,7 +1274,7 @@
       <w:lvlText w:val="%8)"/>
       <w:lvlJc w:val="left"/>
       <w:pPr>
-        <w:ind w:left="5760" w:hanging="360"/>
+        <w:ind w:left="5760" w:hanging="480"/>
       </w:pPr>
     </w:lvl>
     <w:lvl w:ilvl="8">
@@ -1235,7 +1283,7 @@
       <w:lvlText w:val="%9)"/>
       <w:lvlJc w:val="left"/>
       <w:pPr>
-        <w:ind w:left="6480" w:hanging="360"/>
+        <w:ind w:left="6480" w:hanging="480"/>
       </w:pPr>
     </w:lvl>
   </w:abstractNum>
@@ -1460,10 +1508,10 @@
   <w:docDefaults>
     <w:rPrDefault>
       <w:rPr>
-        <w:rFonts w:asciiTheme="minorHAnsi" w:cstheme="minorBidi" w:eastAsiaTheme="minorEastAsia" w:hAnsiTheme="minorHAnsi"/>
+        <w:rFonts w:asciiTheme="minorHAnsi" w:cstheme="minorBidi" w:eastAsiaTheme="minorHAnsi" w:hAnsiTheme="minorHAnsi"/>
         <w:sz w:val="24"/>
         <w:szCs w:val="24"/>
-        <w:lang w:bidi="ar-SA" w:eastAsia="zh-CN" w:val="es-ES"/>
+        <w:lang w:bidi="ar-SA" w:eastAsia="en-US" w:val="es-ES"/>
       </w:rPr>
     </w:rPrDefault>
     <w:pPrDefault>
@@ -1504,94 +1552,57 @@
     <w:name w:val="Title"/>
     <w:basedOn w:val="Normal"/>
     <w:next w:val="BodyText"/>
-    <w:link w:val="TitleChar"/>
-    <w:uiPriority w:val="10"/>
     <w:qFormat/>
-    <w:rsid w:val="00A10FD9"/>
     <w:pPr>
-      <w:spacing w:after="80" w:line="240" w:lineRule="auto"/>
-      <w:contextualSpacing/>
+      <w:keepNext/>
+      <w:keepLines/>
+      <w:spacing w:after="240" w:before="480"/>
       <w:jc w:val="center"/>
     </w:pPr>
     <w:rPr>
       <w:rFonts w:asciiTheme="majorHAnsi" w:cstheme="majorBidi" w:eastAsiaTheme="majorEastAsia" w:hAnsiTheme="majorHAnsi"/>
-      <w:sz w:val="56"/>
-      <w:szCs w:val="56"/>
-    </w:rPr>
-  </w:style>
-  <w:style w:customStyle="1" w:styleId="TitleChar" w:type="character">
-    <w:name w:val="Title Char"/>
-    <w:basedOn w:val="DefaultParagraphFont"/>
-    <w:link w:val="Title"/>
-    <w:uiPriority w:val="10"/>
-    <w:rsid w:val="00A10FD9"/>
-    <w:rPr>
-      <w:rFonts w:asciiTheme="majorHAnsi" w:cstheme="majorBidi" w:eastAsiaTheme="majorEastAsia" w:hAnsiTheme="majorHAnsi"/>
-      <w:sz w:val="56"/>
-      <w:szCs w:val="56"/>
+      <w:b/>
+      <w:bCs/>
+      <w:color w:themeColor="accent1" w:themeShade="B5" w:val="345A8A"/>
+      <w:sz w:val="36"/>
+      <w:szCs w:val="36"/>
     </w:rPr>
   </w:style>
   <w:style w:styleId="Subtitle" w:type="paragraph">
     <w:name w:val="Subtitle"/>
-    <w:basedOn w:val="Title"/>
-    <w:next w:val="BodyText"/>
-    <w:link w:val="SubtitleChar"/>
-    <w:uiPriority w:val="11"/>
-    <w:qFormat/>
-    <w:rsid w:val="00A10FD9"/>
-    <w:pPr>
-      <w:numPr>
-        <w:ilvl w:val="1"/>
-      </w:numPr>
-    </w:pPr>
-    <w:rPr>
-      <w:rFonts w:cstheme="majorBidi" w:eastAsiaTheme="majorEastAsia"/>
-      <w:spacing w:val="15"/>
-      <w:sz w:val="28"/>
-      <w:szCs w:val="28"/>
-    </w:rPr>
-  </w:style>
-  <w:style w:customStyle="1" w:styleId="SubtitleChar" w:type="character">
-    <w:name w:val="Subtitle Char"/>
-    <w:basedOn w:val="DefaultParagraphFont"/>
-    <w:link w:val="Subtitle"/>
-    <w:uiPriority w:val="11"/>
-    <w:rsid w:val="00A10FD9"/>
-    <w:rPr>
-      <w:rFonts w:cstheme="majorBidi" w:eastAsiaTheme="majorEastAsia"/>
-      <w:color w:themeColor="text1" w:themeTint="A6" w:val="595959"/>
-      <w:spacing w:val="15"/>
-      <w:sz w:val="28"/>
-      <w:szCs w:val="28"/>
-    </w:rPr>
-  </w:style>
-  <w:style w:customStyle="1" w:styleId="Author" w:type="paragraph">
-    <w:name w:val="Author"/>
     <w:basedOn w:val="Title"/>
     <w:next w:val="BodyText"/>
     <w:qFormat/>
     <w:pPr>
       <w:keepNext/>
       <w:keepLines/>
+      <w:spacing w:after="240" w:before="240"/>
+      <w:jc w:val="center"/>
     </w:pPr>
     <w:rPr>
-      <w:sz w:val="24"/>
-      <w:szCs w:val="24"/>
-    </w:rPr>
-  </w:style>
-  <w:style w:styleId="Date" w:type="paragraph">
-    <w:name w:val="Date"/>
-    <w:basedOn w:val="Title"/>
+      <w:sz w:val="30"/>
+      <w:szCs w:val="30"/>
+    </w:rPr>
+  </w:style>
+  <w:style w:customStyle="1" w:styleId="Author" w:type="paragraph">
+    <w:name w:val="Author"/>
     <w:next w:val="BodyText"/>
     <w:qFormat/>
     <w:pPr>
       <w:keepNext/>
       <w:keepLines/>
+      <w:jc w:val="center"/>
     </w:pPr>
-    <w:rPr>
-      <w:sz w:val="24"/>
-      <w:szCs w:val="24"/>
-    </w:rPr>
+  </w:style>
+  <w:style w:styleId="Date" w:type="paragraph">
+    <w:name w:val="Date"/>
+    <w:next w:val="BodyText"/>
+    <w:qFormat/>
+    <w:pPr>
+      <w:keepNext/>
+      <w:keepLines/>
+      <w:jc w:val="center"/>
+    </w:pPr>
   </w:style>
   <w:style w:customStyle="1" w:styleId="AbstractTitle" w:type="paragraph">
     <w:name w:val="Abstract Title"/>
@@ -1606,6 +1617,7 @@
     </w:pPr>
     <w:rPr>
       <w:b/>
+      <w:color w:val="345A8A"/>
       <w:sz w:val="20"/>
       <w:szCs w:val="20"/>
     </w:rPr>
@@ -1634,321 +1646,191 @@
     <w:rPr/>
   </w:style>
   <w:style w:styleId="Heading1" w:type="paragraph">
-    <w:name w:val="heading 1"/>
+    <w:name w:val="Heading 1"/>
     <w:basedOn w:val="Normal"/>
     <w:next w:val="BodyText"/>
-    <w:link w:val="Heading1Char"/>
     <w:uiPriority w:val="9"/>
     <w:qFormat/>
-    <w:rsid w:val="00A10FD9"/>
     <w:pPr>
       <w:keepNext/>
       <w:keepLines/>
-      <w:spacing w:after="80" w:before="360"/>
+      <w:spacing w:after="0" w:before="480"/>
       <w:outlineLvl w:val="0"/>
     </w:pPr>
     <w:rPr>
       <w:rFonts w:asciiTheme="majorHAnsi" w:cstheme="majorBidi" w:eastAsiaTheme="majorEastAsia" w:hAnsiTheme="majorHAnsi"/>
-      <w:color w:themeColor="accent1" w:themeShade="BF" w:val="0F4761"/>
-      <w:sz w:val="40"/>
-      <w:szCs w:val="40"/>
+      <w:b/>
+      <w:bCs/>
+      <w:color w:themeColor="accent1" w:val="4F81BD"/>
+      <w:sz w:val="32"/>
+      <w:szCs w:val="32"/>
     </w:rPr>
   </w:style>
   <w:style w:styleId="Heading2" w:type="paragraph">
-    <w:name w:val="heading 2"/>
+    <w:name w:val="Heading 2"/>
     <w:basedOn w:val="Normal"/>
     <w:next w:val="BodyText"/>
-    <w:link w:val="Heading2Char"/>
     <w:uiPriority w:val="9"/>
-    <w:semiHidden/>
     <w:unhideWhenUsed/>
     <w:qFormat/>
-    <w:rsid w:val="00A10FD9"/>
     <w:pPr>
       <w:keepNext/>
       <w:keepLines/>
-      <w:spacing w:after="80" w:before="160"/>
+      <w:spacing w:after="0" w:before="200"/>
       <w:outlineLvl w:val="1"/>
     </w:pPr>
     <w:rPr>
       <w:rFonts w:asciiTheme="majorHAnsi" w:cstheme="majorBidi" w:eastAsiaTheme="majorEastAsia" w:hAnsiTheme="majorHAnsi"/>
-      <w:color w:themeColor="accent1" w:themeShade="BF" w:val="0F4761"/>
-      <w:sz w:val="32"/>
-      <w:szCs w:val="32"/>
+      <w:b/>
+      <w:bCs/>
+      <w:color w:themeColor="accent1" w:val="4F81BD"/>
+      <w:sz w:val="28"/>
+      <w:szCs w:val="28"/>
     </w:rPr>
   </w:style>
   <w:style w:styleId="Heading3" w:type="paragraph">
-    <w:name w:val="heading 3"/>
+    <w:name w:val="Heading 3"/>
     <w:basedOn w:val="Normal"/>
     <w:next w:val="BodyText"/>
-    <w:link w:val="Heading3Char"/>
     <w:uiPriority w:val="9"/>
-    <w:semiHidden/>
     <w:unhideWhenUsed/>
     <w:qFormat/>
-    <w:rsid w:val="00A10FD9"/>
     <w:pPr>
       <w:keepNext/>
       <w:keepLines/>
-      <w:spacing w:after="80" w:before="160"/>
+      <w:spacing w:after="0" w:before="200"/>
       <w:outlineLvl w:val="2"/>
     </w:pPr>
     <w:rPr>
-      <w:rFonts w:cstheme="majorBidi" w:eastAsiaTheme="majorEastAsia"/>
-      <w:color w:themeColor="accent1" w:themeShade="BF" w:val="0F4761"/>
-      <w:sz w:val="28"/>
-      <w:szCs w:val="28"/>
+      <w:rFonts w:asciiTheme="majorHAnsi" w:cstheme="majorBidi" w:eastAsiaTheme="majorEastAsia" w:hAnsiTheme="majorHAnsi"/>
+      <w:b/>
+      <w:bCs/>
+      <w:color w:themeColor="accent1" w:val="4F81BD"/>
+      <w:sz w:val="24"/>
+      <w:szCs w:val="24"/>
     </w:rPr>
   </w:style>
   <w:style w:styleId="Heading4" w:type="paragraph">
-    <w:name w:val="heading 4"/>
+    <w:name w:val="Heading 4"/>
     <w:basedOn w:val="Normal"/>
     <w:next w:val="BodyText"/>
-    <w:link w:val="Heading4Char"/>
     <w:uiPriority w:val="9"/>
-    <w:semiHidden/>
     <w:unhideWhenUsed/>
     <w:qFormat/>
-    <w:rsid w:val="00A10FD9"/>
     <w:pPr>
       <w:keepNext/>
       <w:keepLines/>
-      <w:spacing w:after="40" w:before="80"/>
+      <w:spacing w:after="0" w:before="200"/>
       <w:outlineLvl w:val="3"/>
     </w:pPr>
     <w:rPr>
-      <w:rFonts w:cstheme="majorBidi" w:eastAsiaTheme="majorEastAsia"/>
+      <w:rFonts w:asciiTheme="majorHAnsi" w:cstheme="majorBidi" w:eastAsiaTheme="majorEastAsia" w:hAnsiTheme="majorHAnsi"/>
+      <w:bCs/>
       <w:i/>
-      <w:iCs/>
-      <w:color w:themeColor="accent1" w:themeShade="BF" w:val="0F4761"/>
+      <w:color w:themeColor="accent1" w:val="4F81BD"/>
+      <w:sz w:val="24"/>
+      <w:szCs w:val="24"/>
     </w:rPr>
   </w:style>
   <w:style w:styleId="Heading5" w:type="paragraph">
-    <w:name w:val="heading 5"/>
+    <w:name w:val="Heading 5"/>
     <w:basedOn w:val="Normal"/>
     <w:next w:val="BodyText"/>
-    <w:link w:val="Heading5Char"/>
     <w:uiPriority w:val="9"/>
-    <w:semiHidden/>
     <w:unhideWhenUsed/>
     <w:qFormat/>
-    <w:rsid w:val="00A10FD9"/>
     <w:pPr>
       <w:keepNext/>
       <w:keepLines/>
-      <w:spacing w:after="40" w:before="80"/>
+      <w:spacing w:after="0" w:before="200"/>
       <w:outlineLvl w:val="4"/>
     </w:pPr>
     <w:rPr>
-      <w:rFonts w:cstheme="majorBidi" w:eastAsiaTheme="majorEastAsia"/>
-      <w:color w:themeColor="accent1" w:themeShade="BF" w:val="0F4761"/>
+      <w:rFonts w:asciiTheme="majorHAnsi" w:cstheme="majorBidi" w:eastAsiaTheme="majorEastAsia" w:hAnsiTheme="majorHAnsi"/>
+      <w:iCs/>
+      <w:color w:themeColor="accent1" w:val="4F81BD"/>
+      <w:sz w:val="24"/>
+      <w:szCs w:val="24"/>
     </w:rPr>
   </w:style>
   <w:style w:styleId="Heading6" w:type="paragraph">
-    <w:name w:val="heading 6"/>
+    <w:name w:val="Heading 6"/>
     <w:basedOn w:val="Normal"/>
     <w:next w:val="BodyText"/>
-    <w:link w:val="Heading6Char"/>
     <w:uiPriority w:val="9"/>
-    <w:semiHidden/>
     <w:unhideWhenUsed/>
     <w:qFormat/>
-    <w:rsid w:val="00A10FD9"/>
     <w:pPr>
       <w:keepNext/>
       <w:keepLines/>
-      <w:spacing w:after="0" w:before="40"/>
+      <w:spacing w:after="0" w:before="200"/>
       <w:outlineLvl w:val="5"/>
     </w:pPr>
     <w:rPr>
-      <w:rFonts w:cstheme="majorBidi" w:eastAsiaTheme="majorEastAsia"/>
-      <w:i/>
-      <w:iCs/>
-      <w:color w:themeColor="text1" w:themeTint="A6" w:val="595959"/>
+      <w:rFonts w:asciiTheme="majorHAnsi" w:cstheme="majorBidi" w:eastAsiaTheme="majorEastAsia" w:hAnsiTheme="majorHAnsi"/>
+      <w:color w:themeColor="accent1" w:val="4F81BD"/>
+      <w:sz w:val="24"/>
+      <w:szCs w:val="24"/>
     </w:rPr>
   </w:style>
   <w:style w:styleId="Heading7" w:type="paragraph">
-    <w:name w:val="heading 7"/>
+    <w:name w:val="Heading 7"/>
     <w:basedOn w:val="Normal"/>
     <w:next w:val="BodyText"/>
-    <w:link w:val="Heading7Char"/>
     <w:uiPriority w:val="9"/>
-    <w:semiHidden/>
     <w:unhideWhenUsed/>
     <w:qFormat/>
-    <w:rsid w:val="00A10FD9"/>
     <w:pPr>
       <w:keepNext/>
       <w:keepLines/>
-      <w:spacing w:after="0" w:before="40"/>
+      <w:spacing w:after="0" w:before="200"/>
       <w:outlineLvl w:val="6"/>
     </w:pPr>
     <w:rPr>
-      <w:rFonts w:cstheme="majorBidi" w:eastAsiaTheme="majorEastAsia"/>
-      <w:color w:themeColor="text1" w:themeTint="A6" w:val="595959"/>
+      <w:rFonts w:asciiTheme="majorHAnsi" w:cstheme="majorBidi" w:eastAsiaTheme="majorEastAsia" w:hAnsiTheme="majorHAnsi"/>
+      <w:color w:themeColor="accent1" w:val="4F81BD"/>
+      <w:sz w:val="24"/>
+      <w:szCs w:val="24"/>
     </w:rPr>
   </w:style>
   <w:style w:styleId="Heading8" w:type="paragraph">
-    <w:name w:val="heading 8"/>
+    <w:name w:val="Heading 8"/>
     <w:basedOn w:val="Normal"/>
     <w:next w:val="BodyText"/>
-    <w:link w:val="Heading8Char"/>
     <w:uiPriority w:val="9"/>
-    <w:semiHidden/>
     <w:unhideWhenUsed/>
     <w:qFormat/>
-    <w:rsid w:val="00A10FD9"/>
     <w:pPr>
       <w:keepNext/>
       <w:keepLines/>
-      <w:spacing w:after="0"/>
+      <w:spacing w:after="0" w:before="200"/>
       <w:outlineLvl w:val="7"/>
     </w:pPr>
     <w:rPr>
-      <w:rFonts w:cstheme="majorBidi" w:eastAsiaTheme="majorEastAsia"/>
-      <w:i/>
-      <w:iCs/>
-      <w:color w:themeColor="text1" w:themeTint="D8" w:val="272727"/>
+      <w:rFonts w:asciiTheme="majorHAnsi" w:cstheme="majorBidi" w:eastAsiaTheme="majorEastAsia" w:hAnsiTheme="majorHAnsi"/>
+      <w:color w:themeColor="accent1" w:val="4F81BD"/>
+      <w:sz w:val="24"/>
+      <w:szCs w:val="24"/>
     </w:rPr>
   </w:style>
   <w:style w:styleId="Heading9" w:type="paragraph">
-    <w:name w:val="heading 9"/>
+    <w:name w:val="Heading 9"/>
     <w:basedOn w:val="Normal"/>
     <w:next w:val="BodyText"/>
-    <w:link w:val="Heading9Char"/>
     <w:uiPriority w:val="9"/>
-    <w:semiHidden/>
     <w:unhideWhenUsed/>
     <w:qFormat/>
-    <w:rsid w:val="00A10FD9"/>
     <w:pPr>
       <w:keepNext/>
       <w:keepLines/>
-      <w:spacing w:after="0"/>
+      <w:spacing w:after="0" w:before="200"/>
       <w:outlineLvl w:val="8"/>
     </w:pPr>
     <w:rPr>
-      <w:rFonts w:cstheme="majorBidi" w:eastAsiaTheme="majorEastAsia"/>
-      <w:color w:themeColor="text1" w:themeTint="D8" w:val="272727"/>
-    </w:rPr>
-  </w:style>
-  <w:style w:customStyle="1" w:styleId="Heading1Char" w:type="character">
-    <w:name w:val="Heading 1 Char"/>
-    <w:basedOn w:val="DefaultParagraphFont"/>
-    <w:link w:val="Heading1"/>
-    <w:uiPriority w:val="9"/>
-    <w:rsid w:val="00A10FD9"/>
-    <w:rPr>
       <w:rFonts w:asciiTheme="majorHAnsi" w:cstheme="majorBidi" w:eastAsiaTheme="majorEastAsia" w:hAnsiTheme="majorHAnsi"/>
-      <w:color w:themeColor="accent1" w:themeShade="BF" w:val="0F4761"/>
-      <w:sz w:val="40"/>
-      <w:szCs w:val="40"/>
-    </w:rPr>
-  </w:style>
-  <w:style w:customStyle="1" w:styleId="Heading2Char" w:type="character">
-    <w:name w:val="Heading 2 Char"/>
-    <w:basedOn w:val="DefaultParagraphFont"/>
-    <w:link w:val="Heading2"/>
-    <w:uiPriority w:val="9"/>
-    <w:semiHidden/>
-    <w:rsid w:val="00A10FD9"/>
-    <w:rPr>
-      <w:rFonts w:asciiTheme="majorHAnsi" w:cstheme="majorBidi" w:eastAsiaTheme="majorEastAsia" w:hAnsiTheme="majorHAnsi"/>
-      <w:color w:themeColor="accent1" w:themeShade="BF" w:val="0F4761"/>
-      <w:sz w:val="32"/>
-      <w:szCs w:val="32"/>
-    </w:rPr>
-  </w:style>
-  <w:style w:customStyle="1" w:styleId="Heading3Char" w:type="character">
-    <w:name w:val="Heading 3 Char"/>
-    <w:basedOn w:val="DefaultParagraphFont"/>
-    <w:link w:val="Heading3"/>
-    <w:uiPriority w:val="9"/>
-    <w:semiHidden/>
-    <w:rsid w:val="00A10FD9"/>
-    <w:rPr>
-      <w:rFonts w:cstheme="majorBidi" w:eastAsiaTheme="majorEastAsia"/>
-      <w:color w:themeColor="accent1" w:themeShade="BF" w:val="0F4761"/>
-      <w:sz w:val="28"/>
-      <w:szCs w:val="28"/>
-    </w:rPr>
-  </w:style>
-  <w:style w:customStyle="1" w:styleId="Heading4Char" w:type="character">
-    <w:name w:val="Heading 4 Char"/>
-    <w:basedOn w:val="DefaultParagraphFont"/>
-    <w:link w:val="Heading4"/>
-    <w:uiPriority w:val="9"/>
-    <w:semiHidden/>
-    <w:rsid w:val="00A10FD9"/>
-    <w:rPr>
-      <w:rFonts w:cstheme="majorBidi" w:eastAsiaTheme="majorEastAsia"/>
-      <w:i/>
-      <w:iCs/>
-      <w:color w:themeColor="accent1" w:themeShade="BF" w:val="0F4761"/>
-    </w:rPr>
-  </w:style>
-  <w:style w:customStyle="1" w:styleId="Heading5Char" w:type="character">
-    <w:name w:val="Heading 5 Char"/>
-    <w:basedOn w:val="DefaultParagraphFont"/>
-    <w:link w:val="Heading5"/>
-    <w:uiPriority w:val="9"/>
-    <w:semiHidden/>
-    <w:rsid w:val="00A10FD9"/>
-    <w:rPr>
-      <w:rFonts w:cstheme="majorBidi" w:eastAsiaTheme="majorEastAsia"/>
-      <w:color w:themeColor="accent1" w:themeShade="BF" w:val="0F4761"/>
-    </w:rPr>
-  </w:style>
-  <w:style w:customStyle="1" w:styleId="Heading6Char" w:type="character">
-    <w:name w:val="Heading 6 Char"/>
-    <w:basedOn w:val="DefaultParagraphFont"/>
-    <w:link w:val="Heading6"/>
-    <w:uiPriority w:val="9"/>
-    <w:semiHidden/>
-    <w:rsid w:val="00A10FD9"/>
-    <w:rPr>
-      <w:rFonts w:cstheme="majorBidi" w:eastAsiaTheme="majorEastAsia"/>
-      <w:i/>
-      <w:iCs/>
-      <w:color w:themeColor="text1" w:themeTint="A6" w:val="595959"/>
-    </w:rPr>
-  </w:style>
-  <w:style w:customStyle="1" w:styleId="Heading7Char" w:type="character">
-    <w:name w:val="Heading 7 Char"/>
-    <w:basedOn w:val="DefaultParagraphFont"/>
-    <w:link w:val="Heading7"/>
-    <w:uiPriority w:val="9"/>
-    <w:semiHidden/>
-    <w:rsid w:val="00A10FD9"/>
-    <w:rPr>
-      <w:rFonts w:cstheme="majorBidi" w:eastAsiaTheme="majorEastAsia"/>
-      <w:color w:themeColor="text1" w:themeTint="A6" w:val="595959"/>
-    </w:rPr>
-  </w:style>
-  <w:style w:customStyle="1" w:styleId="Heading8Char" w:type="character">
-    <w:name w:val="Heading 8 Char"/>
-    <w:basedOn w:val="DefaultParagraphFont"/>
-    <w:link w:val="Heading8"/>
-    <w:uiPriority w:val="9"/>
-    <w:semiHidden/>
-    <w:rsid w:val="00A10FD9"/>
-    <w:rPr>
-      <w:rFonts w:cstheme="majorBidi" w:eastAsiaTheme="majorEastAsia"/>
-      <w:i/>
-      <w:iCs/>
-      <w:color w:themeColor="text1" w:themeTint="D8" w:val="272727"/>
-    </w:rPr>
-  </w:style>
-  <w:style w:customStyle="1" w:styleId="Heading9Char" w:type="character">
-    <w:name w:val="Heading 9 Char"/>
-    <w:basedOn w:val="DefaultParagraphFont"/>
-    <w:link w:val="Heading9"/>
-    <w:uiPriority w:val="9"/>
-    <w:semiHidden/>
-    <w:rsid w:val="00A10FD9"/>
-    <w:rPr>
-      <w:rFonts w:cstheme="majorBidi" w:eastAsiaTheme="majorEastAsia"/>
-      <w:color w:themeColor="text1" w:themeTint="D8" w:val="272727"/>
+      <w:color w:themeColor="accent1" w:val="4F81BD"/>
+      <w:sz w:val="24"/>
+      <w:szCs w:val="24"/>
     </w:rPr>
   </w:style>
   <w:style w:styleId="BlockText" w:type="paragraph">
@@ -1973,8 +1855,8 @@
   </w:style>
   <w:style w:styleId="FootnoteBlockText" w:type="paragraph">
     <w:name w:val="Footnote Block Text"/>
-    <w:basedOn w:val="FootnoteText"/>
-    <w:next w:val="FootnoteText"/>
+    <w:basedOn w:val="Footnote Text"/>
+    <w:next w:val="Footnote Text"/>
     <w:uiPriority w:val="9"/>
     <w:unhideWhenUsed/>
     <w:qFormat/>
@@ -2004,6 +1886,13 @@
       </w:tblCellMar>
     </w:tblPr>
     <w:tblStylePr w:type="firstRow">
+      <w:tblPr>
+        <w:jc w:val="left"/>
+        <w:tblInd w:type="dxa" w:w="0"/>
+      </w:tblPr>
+      <w:trPr>
+        <w:jc w:val="left"/>
+      </w:trPr>
       <w:tcPr>
         <w:tcBorders>
           <w:bottom w:val="single"/>
@@ -2359,44 +2248,44 @@
         <a:sysClr val="window" lastClr="FFFFFF"/>
       </a:lt1>
       <a:dk2>
-        <a:srgbClr val="0E2841"/>
+        <a:srgbClr val="1F497D"/>
       </a:dk2>
       <a:lt2>
-        <a:srgbClr val="E8E8E8"/>
+        <a:srgbClr val="EEECE1"/>
       </a:lt2>
       <a:accent1>
-        <a:srgbClr val="156082"/>
+        <a:srgbClr val="4F81BD"/>
       </a:accent1>
       <a:accent2>
-        <a:srgbClr val="E97132"/>
+        <a:srgbClr val="C0504D"/>
       </a:accent2>
       <a:accent3>
-        <a:srgbClr val="196B24"/>
+        <a:srgbClr val="9BBB59"/>
       </a:accent3>
       <a:accent4>
-        <a:srgbClr val="0F9ED5"/>
+        <a:srgbClr val="8064A2"/>
       </a:accent4>
       <a:accent5>
-        <a:srgbClr val="A02B93"/>
+        <a:srgbClr val="4BACC6"/>
       </a:accent5>
       <a:accent6>
-        <a:srgbClr val="4EA72E"/>
+        <a:srgbClr val="F79646"/>
       </a:accent6>
       <a:hlink>
-        <a:srgbClr val="467886"/>
+        <a:srgbClr val="0000FF"/>
       </a:hlink>
       <a:folHlink>
-        <a:srgbClr val="96607D"/>
+        <a:srgbClr val="800080"/>
       </a:folHlink>
     </a:clrScheme>
     <a:fontScheme name="Office">
       <a:majorFont>
-        <a:latin typeface="Aptos Display" panose="02110004020202020204"/>
+        <a:latin typeface="Calibri"/>
         <a:ea typeface=""/>
         <a:cs typeface=""/>
-        <a:font script="Jpan" typeface="游ゴシック Light"/>
+        <a:font script="Jpan" typeface="ＭＳ ゴシック"/>
         <a:font script="Hang" typeface="맑은 고딕"/>
-        <a:font script="Hans" typeface="等线 Light"/>
+        <a:font script="Hans" typeface="宋体"/>
         <a:font script="Hant" typeface="新細明體"/>
         <a:font script="Arab" typeface="Times New Roman"/>
         <a:font script="Hebr" typeface="Times New Roman"/>
@@ -2423,32 +2312,14 @@
         <a:font script="Mong" typeface="Mongolian Baiti"/>
         <a:font script="Viet" typeface="Times New Roman"/>
         <a:font script="Uigh" typeface="Microsoft Uighur"/>
-        <a:font script="Geor" typeface="Sylfaen"/>
-        <a:font script="Armn" typeface="Arial"/>
-        <a:font script="Bugi" typeface="Leelawadee UI"/>
-        <a:font script="Bopo" typeface="Microsoft JhengHei"/>
-        <a:font script="Java" typeface="Javanese Text"/>
-        <a:font script="Lisu" typeface="Segoe UI"/>
-        <a:font script="Mymr" typeface="Myanmar Text"/>
-        <a:font script="Nkoo" typeface="Ebrima"/>
-        <a:font script="Olck" typeface="Nirmala UI"/>
-        <a:font script="Osma" typeface="Ebrima"/>
-        <a:font script="Phag" typeface="Phagspa"/>
-        <a:font script="Syrn" typeface="Estrangelo Edessa"/>
-        <a:font script="Syrj" typeface="Estrangelo Edessa"/>
-        <a:font script="Syre" typeface="Estrangelo Edessa"/>
-        <a:font script="Sora" typeface="Nirmala UI"/>
-        <a:font script="Tale" typeface="Microsoft Tai Le"/>
-        <a:font script="Talu" typeface="Microsoft New Tai Lue"/>
-        <a:font script="Tfng" typeface="Ebrima"/>
       </a:majorFont>
       <a:minorFont>
-        <a:latin typeface="Aptos" panose="02110004020202020204"/>
+        <a:latin typeface="Cambria"/>
         <a:ea typeface=""/>
         <a:cs typeface=""/>
-        <a:font script="Jpan" typeface="游明朝"/>
+        <a:font script="Jpan" typeface="ＭＳ 明朝"/>
         <a:font script="Hang" typeface="맑은 고딕"/>
-        <a:font script="Hans" typeface="等线"/>
+        <a:font script="Hans" typeface="宋体"/>
         <a:font script="Hant" typeface="新細明體"/>
         <a:font script="Arab" typeface="Arial"/>
         <a:font script="Hebr" typeface="Arial"/>
@@ -2475,24 +2346,6 @@
         <a:font script="Mong" typeface="Mongolian Baiti"/>
         <a:font script="Viet" typeface="Arial"/>
         <a:font script="Uigh" typeface="Microsoft Uighur"/>
-        <a:font script="Geor" typeface="Sylfaen"/>
-        <a:font script="Armn" typeface="Arial"/>
-        <a:font script="Bugi" typeface="Leelawadee UI"/>
-        <a:font script="Bopo" typeface="Microsoft JhengHei"/>
-        <a:font script="Java" typeface="Javanese Text"/>
-        <a:font script="Lisu" typeface="Segoe UI"/>
-        <a:font script="Mymr" typeface="Myanmar Text"/>
-        <a:font script="Nkoo" typeface="Ebrima"/>
-        <a:font script="Olck" typeface="Nirmala UI"/>
-        <a:font script="Osma" typeface="Ebrima"/>
-        <a:font script="Phag" typeface="Phagspa"/>
-        <a:font script="Syrn" typeface="Estrangelo Edessa"/>
-        <a:font script="Syrj" typeface="Estrangelo Edessa"/>
-        <a:font script="Syre" typeface="Estrangelo Edessa"/>
-        <a:font script="Sora" typeface="Nirmala UI"/>
-        <a:font script="Tale" typeface="Microsoft Tai Le"/>
-        <a:font script="Talu" typeface="Microsoft New Tai Lue"/>
-        <a:font script="Tfng" typeface="Ebrima"/>
       </a:minorFont>
     </a:fontScheme>
     <a:fmtScheme name="Office">
@@ -2504,141 +2357,200 @@
           <a:gsLst>
             <a:gs pos="0">
               <a:schemeClr val="phClr">
-                <a:lumMod val="110000"/>
-                <a:satMod val="105000"/>
-                <a:tint val="67000"/>
+                <a:tint val="50000"/>
+                <a:satMod val="300000"/>
               </a:schemeClr>
             </a:gs>
-            <a:gs pos="50000">
+            <a:gs pos="35000">
               <a:schemeClr val="phClr">
-                <a:lumMod val="105000"/>
-                <a:satMod val="103000"/>
-                <a:tint val="73000"/>
+                <a:tint val="37000"/>
+                <a:satMod val="300000"/>
               </a:schemeClr>
             </a:gs>
             <a:gs pos="100000">
               <a:schemeClr val="phClr">
-                <a:lumMod val="105000"/>
-                <a:satMod val="109000"/>
-                <a:tint val="81000"/>
+                <a:tint val="15000"/>
+                <a:satMod val="350000"/>
               </a:schemeClr>
             </a:gs>
           </a:gsLst>
-          <a:lin ang="5400000" scaled="0"/>
+          <a:lin ang="16200000" scaled="1"/>
         </a:gradFill>
         <a:gradFill rotWithShape="1">
           <a:gsLst>
             <a:gs pos="0">
               <a:schemeClr val="phClr">
-                <a:satMod val="103000"/>
-                <a:lumMod val="102000"/>
-                <a:tint val="94000"/>
-              </a:schemeClr>
-            </a:gs>
-            <a:gs pos="50000">
-              <a:schemeClr val="phClr">
-                <a:satMod val="110000"/>
-                <a:lumMod val="100000"/>
+                <a:tint val="100000"/>
                 <a:shade val="100000"/>
+                <a:satMod val="130000"/>
               </a:schemeClr>
             </a:gs>
             <a:gs pos="100000">
               <a:schemeClr val="phClr">
-                <a:lumMod val="99000"/>
-                <a:satMod val="120000"/>
-                <a:shade val="78000"/>
+                <a:tint val="50000"/>
+                <a:shade val="100000"/>
+                <a:satMod val="350000"/>
               </a:schemeClr>
             </a:gs>
           </a:gsLst>
-          <a:lin ang="5400000" scaled="0"/>
+          <a:lin ang="16200000" scaled="0"/>
         </a:gradFill>
       </a:fillStyleLst>
       <a:lnStyleLst>
-        <a:ln w="6350" cap="flat" cmpd="sng" algn="ctr">
+        <a:ln w="9525" cap="flat" cmpd="sng" algn="ctr">
+          <a:solidFill>
+            <a:schemeClr val="phClr">
+              <a:shade val="95000"/>
+              <a:satMod val="105000"/>
+            </a:schemeClr>
+          </a:solidFill>
+          <a:prstDash val="solid"/>
+        </a:ln>
+        <a:ln w="25400" cap="flat" cmpd="sng" algn="ctr">
           <a:solidFill>
             <a:schemeClr val="phClr"/>
           </a:solidFill>
           <a:prstDash val="solid"/>
-          <a:miter lim="800000"/>
         </a:ln>
-        <a:ln w="12700" cap="flat" cmpd="sng" algn="ctr">
+        <a:ln w="38100" cap="flat" cmpd="sng" algn="ctr">
           <a:solidFill>
             <a:schemeClr val="phClr"/>
           </a:solidFill>
           <a:prstDash val="solid"/>
-          <a:miter lim="800000"/>
-        </a:ln>
-        <a:ln w="19050" cap="flat" cmpd="sng" algn="ctr">
-          <a:solidFill>
-            <a:schemeClr val="phClr"/>
-          </a:solidFill>
-          <a:prstDash val="solid"/>
-          <a:miter lim="800000"/>
         </a:ln>
       </a:lnStyleLst>
       <a:effectStyleLst>
         <a:effectStyle>
-          <a:effectLst/>
-        </a:effectStyle>
-        <a:effectStyle>
-          <a:effectLst/>
+          <a:effectLst>
+            <a:outerShdw blurRad="40000" dist="20000" dir="5400000" rotWithShape="0">
+              <a:srgbClr val="000000">
+                <a:alpha val="38000"/>
+              </a:srgbClr>
+            </a:outerShdw>
+          </a:effectLst>
         </a:effectStyle>
         <a:effectStyle>
           <a:effectLst>
-            <a:outerShdw blurRad="57150" dist="19050" dir="5400000" algn="ctr" rotWithShape="0">
+            <a:outerShdw blurRad="40000" dist="23000" dir="5400000" rotWithShape="0">
               <a:srgbClr val="000000">
-                <a:alpha val="63000"/>
+                <a:alpha val="35000"/>
               </a:srgbClr>
             </a:outerShdw>
           </a:effectLst>
+        </a:effectStyle>
+        <a:effectStyle>
+          <a:effectLst>
+            <a:outerShdw blurRad="40000" dist="23000" dir="5400000" rotWithShape="0">
+              <a:srgbClr val="000000">
+                <a:alpha val="35000"/>
+              </a:srgbClr>
+            </a:outerShdw>
+          </a:effectLst>
+          <a:scene3d>
+            <a:camera prst="orthographicFront">
+              <a:rot lat="0" lon="0" rev="0"/>
+            </a:camera>
+            <a:lightRig rig="threePt" dir="t">
+              <a:rot lat="0" lon="0" rev="1200000"/>
+            </a:lightRig>
+          </a:scene3d>
+          <a:sp3d>
+            <a:bevelT w="63500" h="25400"/>
+          </a:sp3d>
         </a:effectStyle>
       </a:effectStyleLst>
       <a:bgFillStyleLst>
         <a:solidFill>
           <a:schemeClr val="phClr"/>
         </a:solidFill>
-        <a:solidFill>
-          <a:schemeClr val="phClr">
-            <a:tint val="95000"/>
-            <a:satMod val="170000"/>
-          </a:schemeClr>
-        </a:solidFill>
         <a:gradFill rotWithShape="1">
           <a:gsLst>
             <a:gs pos="0">
               <a:schemeClr val="phClr">
-                <a:tint val="93000"/>
-                <a:satMod val="150000"/>
-                <a:shade val="98000"/>
-                <a:lumMod val="102000"/>
+                <a:tint val="40000"/>
+                <a:satMod val="350000"/>
               </a:schemeClr>
             </a:gs>
-            <a:gs pos="50000">
+            <a:gs pos="40000">
               <a:schemeClr val="phClr">
-                <a:tint val="98000"/>
-                <a:satMod val="130000"/>
-                <a:shade val="90000"/>
-                <a:lumMod val="103000"/>
+                <a:tint val="45000"/>
+                <a:shade val="99000"/>
+                <a:satMod val="350000"/>
               </a:schemeClr>
             </a:gs>
             <a:gs pos="100000">
               <a:schemeClr val="phClr">
-                <a:shade val="63000"/>
-                <a:satMod val="120000"/>
+                <a:shade val="20000"/>
+                <a:satMod val="255000"/>
               </a:schemeClr>
             </a:gs>
           </a:gsLst>
-          <a:lin ang="5400000" scaled="0"/>
+          <a:path path="circle">
+            <a:fillToRect l="50000" t="-80000" r="50000" b="180000"/>
+          </a:path>
+        </a:gradFill>
+        <a:gradFill rotWithShape="1">
+          <a:gsLst>
+            <a:gs pos="0">
+              <a:schemeClr val="phClr">
+                <a:tint val="80000"/>
+                <a:satMod val="300000"/>
+              </a:schemeClr>
+            </a:gs>
+            <a:gs pos="100000">
+              <a:schemeClr val="phClr">
+                <a:shade val="30000"/>
+                <a:satMod val="200000"/>
+              </a:schemeClr>
+            </a:gs>
+          </a:gsLst>
+          <a:path path="circle">
+            <a:fillToRect l="50000" t="50000" r="50000" b="50000"/>
+          </a:path>
         </a:gradFill>
       </a:bgFillStyleLst>
     </a:fmtScheme>
   </a:themeElements>
-  <a:objectDefaults/>
+  <a:objectDefaults>
+    <a:spDef>
+      <a:spPr/>
+      <a:bodyPr/>
+      <a:lstStyle/>
+      <a:style>
+        <a:lnRef idx="1">
+          <a:schemeClr val="accent1"/>
+        </a:lnRef>
+        <a:fillRef idx="3">
+          <a:schemeClr val="accent1"/>
+        </a:fillRef>
+        <a:effectRef idx="2">
+          <a:schemeClr val="accent1"/>
+        </a:effectRef>
+        <a:fontRef idx="minor">
+          <a:schemeClr val="lt1"/>
+        </a:fontRef>
+      </a:style>
+    </a:spDef>
+    <a:lnDef>
+      <a:spPr/>
+      <a:bodyPr/>
+      <a:lstStyle/>
+      <a:style>
+        <a:lnRef idx="2">
+          <a:schemeClr val="accent1"/>
+        </a:lnRef>
+        <a:fillRef idx="0">
+          <a:schemeClr val="accent1"/>
+        </a:fillRef>
+        <a:effectRef idx="1">
+          <a:schemeClr val="accent1"/>
+        </a:effectRef>
+        <a:fontRef idx="minor">
+          <a:schemeClr val="tx1"/>
+        </a:fontRef>
+      </a:style>
+    </a:lnDef>
+  </a:objectDefaults>
   <a:extraClrSchemeLst/>
-  <a:extLst>
-    <a:ext uri="{05A4C25C-085E-4340-85A3-A5531E510DB2}">
-      <thm15:themeFamily xmlns:thm15="http://schemas.microsoft.com/office/thememl/2012/main" name="Office Theme" id="{2E142A2C-CD16-42D6-873A-C26D2A0506FA}" vid="{1BDDFF52-6CD6-40A5-AB3C-68EB2F1E4D0A}"/>
-    </a:ext>
-  </a:extLst>
 </a:theme>
 </file>
</xml_diff>

<commit_message>
UD06/UD07: resume puntos, añade 8 diagramas Excalidraw y catálogo de librerías
</commit_message>
<xml_diff>
--- a/docx/01-introduccion/boletin-U01-avanzado-resuelto.docx
+++ b/docx/01-introduccion/boletin-U01-avanzado-resuelto.docx
@@ -28,7 +28,7 @@
         </w:p>
       </w:sdtContent>
     </w:sdt>
-    <w:bookmarkStart w:id="20" w:name="X4858feb35e1492c05c4211374ee048c1425a805"/>
+    <w:bookmarkStart w:id="9" w:name="X4858feb35e1492c05c4211374ee048c1425a805"/>
     <w:p>
       <w:pPr>
         <w:pStyle w:val="Heading1"/>
@@ -37,8 +37,8 @@
         <w:t xml:space="preserve">Boletín de Introducción — Avanzado (Resuelto)</w:t>
       </w:r>
     </w:p>
-    <w:bookmarkEnd w:id="20"/>
-    <w:bookmarkStart w:id="29" w:name="X68d80aaea901b11f50f84b58517a0e5cee3e834"/>
+    <w:bookmarkEnd w:id="9"/>
+    <w:bookmarkStart w:id="18" w:name="X68d80aaea901b11f50f84b58517a0e5cee3e834"/>
     <w:p>
       <w:pPr>
         <w:pStyle w:val="Heading1"/>
@@ -54,7 +54,7 @@
         </w:pict>
       </w:r>
     </w:p>
-    <w:bookmarkStart w:id="21" w:name="diagnóstico-completo-no-tengo-internet"/>
+    <w:bookmarkStart w:id="10" w:name="diagnóstico-completo-no-tengo-internet"/>
     <w:p>
       <w:pPr>
         <w:pStyle w:val="Heading2"/>
@@ -66,13 +66,7 @@
         <w:t xml:space="preserve"> </w:t>
       </w:r>
       <w:r>
-        <w:t xml:space="preserve">“</w:t>
-      </w:r>
-      <w:r>
-        <w:t xml:space="preserve">No tengo Internet</w:t>
-      </w:r>
-      <w:r>
-        <w:t xml:space="preserve">”</w:t>
+        <w:t xml:space="preserve">“No tengo Internet”</w:t>
       </w:r>
     </w:p>
     <w:p>
@@ -241,8 +235,8 @@
         <w:t xml:space="preserve">. No necesitas mirar los de arriba.</w:t>
       </w:r>
     </w:p>
-    <w:bookmarkEnd w:id="21"/>
-    <w:bookmarkStart w:id="22" w:name="la-historia-de-un-paquete"/>
+    <w:bookmarkEnd w:id="10"/>
+    <w:bookmarkStart w:id="11" w:name="la-historia-de-un-paquete"/>
     <w:p>
       <w:pPr>
         <w:pStyle w:val="Heading2"/>
@@ -348,8 +342,8 @@
         <w:t xml:space="preserve">el navegador envía una petición HTTP GET al servidor de Google. El servidor responde con el HTML de la página, que viaja de vuelta en múltiples paquetes.</w:t>
       </w:r>
     </w:p>
-    <w:bookmarkEnd w:id="22"/>
-    <w:bookmarkStart w:id="23" w:name="arp-el-protocolo-olvidado"/>
+    <w:bookmarkEnd w:id="11"/>
+    <w:bookmarkStart w:id="12" w:name="arp-el-protocolo-olvidado"/>
     <w:p>
       <w:pPr>
         <w:pStyle w:val="Heading2"/>
@@ -400,13 +394,7 @@
         <w:t xml:space="preserve"> </w:t>
       </w:r>
       <w:r>
-        <w:t xml:space="preserve">“</w:t>
-      </w:r>
-      <w:r>
-        <w:t xml:space="preserve">bloquea</w:t>
-      </w:r>
-      <w:r>
-        <w:t xml:space="preserve">”</w:t>
+        <w:t xml:space="preserve">“bloquea”</w:t>
       </w:r>
       <w:r>
         <w:t xml:space="preserve">.</w:t>
@@ -447,21 +435,7 @@
           <w:i/>
           <w:iCs/>
         </w:rPr>
-        <w:t xml:space="preserve">“</w:t>
-      </w:r>
-      <w:r>
-        <w:rPr>
-          <w:i/>
-          <w:iCs/>
-        </w:rPr>
-        <w:t xml:space="preserve">¿Quién tiene la IP 192.168.1.1?</w:t>
-      </w:r>
-      <w:r>
-        <w:rPr>
-          <w:i/>
-          <w:iCs/>
-        </w:rPr>
-        <w:t xml:space="preserve">”</w:t>
+        <w:t xml:space="preserve">“¿Quién tiene la IP 192.168.1.1?”</w:t>
       </w:r>
       <w:r>
         <w:t xml:space="preserve"> </w:t>
@@ -505,21 +479,7 @@
           <w:i/>
           <w:iCs/>
         </w:rPr>
-        <w:t xml:space="preserve">“</w:t>
-      </w:r>
-      <w:r>
-        <w:rPr>
-          <w:i/>
-          <w:iCs/>
-        </w:rPr>
-        <w:t xml:space="preserve">Yo, y mi MAC es aa:bb:cc:dd:ee:ff</w:t>
-      </w:r>
-      <w:r>
-        <w:rPr>
-          <w:i/>
-          <w:iCs/>
-        </w:rPr>
-        <w:t xml:space="preserve">”</w:t>
+        <w:t xml:space="preserve">“Yo, y mi MAC es aa:bb:cc:dd:ee:ff”</w:t>
       </w:r>
       <w:r>
         <w:t xml:space="preserve">.</w:t>
@@ -557,8 +517,8 @@
         <w:t xml:space="preserve">Sin ARP, la capa 2 (Ethernet) no puede funcionar porque no sabe a quién enviar la trama.</w:t>
       </w:r>
     </w:p>
-    <w:bookmarkEnd w:id="23"/>
-    <w:bookmarkStart w:id="24" w:name="argumenta-contra-conrad"/>
+    <w:bookmarkEnd w:id="12"/>
+    <w:bookmarkStart w:id="13" w:name="argumenta-contra-conrad"/>
     <w:p>
       <w:pPr>
         <w:pStyle w:val="Heading2"/>
@@ -614,13 +574,7 @@
         <w:t xml:space="preserve"> </w:t>
       </w:r>
       <w:r>
-        <w:t xml:space="preserve">“</w:t>
-      </w:r>
-      <w:r>
-        <w:t xml:space="preserve">lo arregla</w:t>
-      </w:r>
-      <w:r>
-        <w:t xml:space="preserve">”</w:t>
+        <w:t xml:space="preserve">“lo arregla”</w:t>
       </w:r>
       <w:r>
         <w:t xml:space="preserve"> </w:t>
@@ -654,20 +608,14 @@
         <w:t xml:space="preserve"> </w:t>
       </w:r>
       <w:r>
-        <w:t xml:space="preserve">“</w:t>
-      </w:r>
-      <w:r>
-        <w:t xml:space="preserve">el cable estaba suelto</w:t>
-      </w:r>
-      <w:r>
-        <w:t xml:space="preserve">”</w:t>
+        <w:t xml:space="preserve">“el cable estaba suelto”</w:t>
       </w:r>
       <w:r>
         <w:t xml:space="preserve">, aprende y no te vuelve a llamar por lo mismo.</w:t>
       </w:r>
     </w:p>
-    <w:bookmarkEnd w:id="24"/>
-    <w:bookmarkStart w:id="25" w:name="diseña-la-red-del-aula"/>
+    <w:bookmarkEnd w:id="13"/>
+    <w:bookmarkStart w:id="14" w:name="diseña-la-red-del-aula"/>
     <w:p>
       <w:pPr>
         <w:pStyle w:val="Heading2"/>
@@ -808,8 +756,8 @@
         <w:t xml:space="preserve">- Con un solo switch de 48 puertos, la topología es simple, fácil de mantener y con margen para crecer.</w:t>
       </w:r>
     </w:p>
-    <w:bookmarkEnd w:id="25"/>
-    <w:bookmarkStart w:id="26" w:name="mente-binaria"/>
+    <w:bookmarkEnd w:id="14"/>
+    <w:bookmarkStart w:id="15" w:name="mente-binaria"/>
     <w:p>
       <w:pPr>
         <w:pStyle w:val="Heading2"/>
@@ -903,8 +851,8 @@
         <w:t xml:space="preserve">, no KB (2.560 KB serían 2.621.440 bytes). Su número es correcto pero la etiqueta es falsa.</w:t>
       </w:r>
     </w:p>
-    <w:bookmarkEnd w:id="26"/>
-    <w:bookmarkStart w:id="27" w:name="el-mapa-del-curso"/>
+    <w:bookmarkEnd w:id="15"/>
+    <w:bookmarkStart w:id="16" w:name="el-mapa-del-curso"/>
     <w:p>
       <w:pPr>
         <w:pStyle w:val="Heading2"/>
@@ -957,8 +905,8 @@
         <w:t xml:space="preserve">Durante todo el curso, cada vez que algo falle, volverás a la escalera del ping. Aprenderlo primero te da una herramienta que acompaña todo el curso.</w:t>
       </w:r>
     </w:p>
-    <w:bookmarkEnd w:id="27"/>
-    <w:bookmarkStart w:id="28" w:name="Xc8e5910c22462a634687887ceb7faf0b5be8d57"/>
+    <w:bookmarkEnd w:id="16"/>
+    <w:bookmarkStart w:id="17" w:name="Xc8e5910c22462a634687887ceb7faf0b5be8d57"/>
     <w:p>
       <w:pPr>
         <w:pStyle w:val="Heading2"/>
@@ -1009,9 +957,13 @@
         <w:t xml:space="preserve">Si el simulador no arranca o da problemas al iniciar sesión con la cuenta de la Cisco Networking Academy, el administrador no recurre al azar ni formatea el equipo. El procedimiento consiste en: verificar los requisitos del sistema operativo, comprobar la conexión a Internet que valida las credenciales y, en caso de persistir el error, documentar el mensaje exacto de la excepción con captura de pantalla y los pasos que diste hasta el fallo, y pedir ayuda con todo eso delante (al profesor o en el foro del aula virtual), para que quien te ayude pueda reproducirlo sin preguntarte lo mismo dos veces.</w:t>
       </w:r>
     </w:p>
-    <w:bookmarkEnd w:id="28"/>
-    <w:bookmarkEnd w:id="29"/>
-    <w:sectPr/>
+    <w:bookmarkEnd w:id="17"/>
+    <w:bookmarkEnd w:id="18"/>
+    <w:sectPr>
+      <w:footnotePr>
+        <w:numRestart w:val="eachSect"/>
+      </w:footnotePr>
+    </w:sectPr>
   </w:body>
 </w:document>
 </file>
@@ -1049,7 +1001,7 @@
       <w:lvlText w:val=" "/>
       <w:lvlJc w:val="left"/>
       <w:pPr>
-        <w:ind w:left="720" w:hanging="480"/>
+        <w:ind w:left="720" w:hanging="360"/>
       </w:pPr>
     </w:lvl>
     <w:lvl w:ilvl="1">
@@ -1057,7 +1009,7 @@
       <w:lvlText w:val=" "/>
       <w:lvlJc w:val="left"/>
       <w:pPr>
-        <w:ind w:left="1440" w:hanging="480"/>
+        <w:ind w:left="1440" w:hanging="360"/>
       </w:pPr>
     </w:lvl>
     <w:lvl w:ilvl="2">
@@ -1065,7 +1017,7 @@
       <w:lvlText w:val=" "/>
       <w:lvlJc w:val="left"/>
       <w:pPr>
-        <w:ind w:left="2160" w:hanging="480"/>
+        <w:ind w:left="2160" w:hanging="360"/>
       </w:pPr>
     </w:lvl>
     <w:lvl w:ilvl="3">
@@ -1073,7 +1025,7 @@
       <w:lvlText w:val=" "/>
       <w:lvlJc w:val="left"/>
       <w:pPr>
-        <w:ind w:left="2880" w:hanging="480"/>
+        <w:ind w:left="2880" w:hanging="360"/>
       </w:pPr>
     </w:lvl>
     <w:lvl w:ilvl="4">
@@ -1081,7 +1033,7 @@
       <w:lvlText w:val=" "/>
       <w:lvlJc w:val="left"/>
       <w:pPr>
-        <w:ind w:left="3600" w:hanging="480"/>
+        <w:ind w:left="3600" w:hanging="360"/>
       </w:pPr>
     </w:lvl>
     <w:lvl w:ilvl="5">
@@ -1089,7 +1041,7 @@
       <w:lvlText w:val=" "/>
       <w:lvlJc w:val="left"/>
       <w:pPr>
-        <w:ind w:left="4320" w:hanging="480"/>
+        <w:ind w:left="4320" w:hanging="360"/>
       </w:pPr>
     </w:lvl>
     <w:lvl w:ilvl="6">
@@ -1097,7 +1049,7 @@
       <w:lvlText w:val=" "/>
       <w:lvlJc w:val="left"/>
       <w:pPr>
-        <w:ind w:left="5040" w:hanging="480"/>
+        <w:ind w:left="5040" w:hanging="360"/>
       </w:pPr>
     </w:lvl>
     <w:lvl w:ilvl="7">
@@ -1105,7 +1057,7 @@
       <w:lvlText w:val=" "/>
       <w:lvlJc w:val="left"/>
       <w:pPr>
-        <w:ind w:left="5760" w:hanging="480"/>
+        <w:ind w:left="5760" w:hanging="360"/>
       </w:pPr>
     </w:lvl>
     <w:lvl w:ilvl="8">
@@ -1113,7 +1065,7 @@
       <w:lvlText w:val=" "/>
       <w:lvlJc w:val="left"/>
       <w:pPr>
-        <w:ind w:left="6480" w:hanging="480"/>
+        <w:ind w:left="6480" w:hanging="360"/>
       </w:pPr>
     </w:lvl>
   </w:abstractNum>
@@ -1126,7 +1078,7 @@
       <w:lvlText w:val="%1."/>
       <w:lvlJc w:val="left"/>
       <w:pPr>
-        <w:ind w:left="720" w:hanging="480"/>
+        <w:ind w:left="720" w:hanging="360"/>
       </w:pPr>
     </w:lvl>
     <w:lvl w:ilvl="1">
@@ -1135,7 +1087,7 @@
       <w:lvlText w:val="%2."/>
       <w:lvlJc w:val="left"/>
       <w:pPr>
-        <w:ind w:left="1440" w:hanging="480"/>
+        <w:ind w:left="1440" w:hanging="360"/>
       </w:pPr>
     </w:lvl>
     <w:lvl w:ilvl="2">
@@ -1144,7 +1096,7 @@
       <w:lvlText w:val="%3."/>
       <w:lvlJc w:val="left"/>
       <w:pPr>
-        <w:ind w:left="2160" w:hanging="480"/>
+        <w:ind w:left="2160" w:hanging="360"/>
       </w:pPr>
     </w:lvl>
     <w:lvl w:ilvl="3">
@@ -1153,7 +1105,7 @@
       <w:lvlText w:val="%4."/>
       <w:lvlJc w:val="left"/>
       <w:pPr>
-        <w:ind w:left="2880" w:hanging="480"/>
+        <w:ind w:left="2880" w:hanging="360"/>
       </w:pPr>
     </w:lvl>
     <w:lvl w:ilvl="4">
@@ -1162,7 +1114,7 @@
       <w:lvlText w:val="%5."/>
       <w:lvlJc w:val="left"/>
       <w:pPr>
-        <w:ind w:left="3600" w:hanging="480"/>
+        <w:ind w:left="3600" w:hanging="360"/>
       </w:pPr>
     </w:lvl>
     <w:lvl w:ilvl="5">
@@ -1171,7 +1123,7 @@
       <w:lvlText w:val="%6."/>
       <w:lvlJc w:val="left"/>
       <w:pPr>
-        <w:ind w:left="4320" w:hanging="480"/>
+        <w:ind w:left="4320" w:hanging="360"/>
       </w:pPr>
     </w:lvl>
     <w:lvl w:ilvl="6">
@@ -1180,7 +1132,7 @@
       <w:lvlText w:val="%7."/>
       <w:lvlJc w:val="left"/>
       <w:pPr>
-        <w:ind w:left="5040" w:hanging="480"/>
+        <w:ind w:left="5040" w:hanging="360"/>
       </w:pPr>
     </w:lvl>
     <w:lvl w:ilvl="7">
@@ -1189,7 +1141,7 @@
       <w:lvlText w:val="%8."/>
       <w:lvlJc w:val="left"/>
       <w:pPr>
-        <w:ind w:left="5760" w:hanging="480"/>
+        <w:ind w:left="5760" w:hanging="360"/>
       </w:pPr>
     </w:lvl>
     <w:lvl w:ilvl="8">
@@ -1198,7 +1150,7 @@
       <w:lvlText w:val="%9."/>
       <w:lvlJc w:val="left"/>
       <w:pPr>
-        <w:ind w:left="6480" w:hanging="480"/>
+        <w:ind w:left="6480" w:hanging="360"/>
       </w:pPr>
     </w:lvl>
   </w:abstractNum>
@@ -1211,7 +1163,7 @@
       <w:lvlText w:val="%1)"/>
       <w:lvlJc w:val="left"/>
       <w:pPr>
-        <w:ind w:left="720" w:hanging="480"/>
+        <w:ind w:left="720" w:hanging="360"/>
       </w:pPr>
     </w:lvl>
     <w:lvl w:ilvl="1">
@@ -1220,7 +1172,7 @@
       <w:lvlText w:val="%2)"/>
       <w:lvlJc w:val="left"/>
       <w:pPr>
-        <w:ind w:left="1440" w:hanging="480"/>
+        <w:ind w:left="1440" w:hanging="360"/>
       </w:pPr>
     </w:lvl>
     <w:lvl w:ilvl="2">
@@ -1229,7 +1181,7 @@
       <w:lvlText w:val="%3)"/>
       <w:lvlJc w:val="left"/>
       <w:pPr>
-        <w:ind w:left="2160" w:hanging="480"/>
+        <w:ind w:left="2160" w:hanging="360"/>
       </w:pPr>
     </w:lvl>
     <w:lvl w:ilvl="3">
@@ -1238,7 +1190,7 @@
       <w:lvlText w:val="%4)"/>
       <w:lvlJc w:val="left"/>
       <w:pPr>
-        <w:ind w:left="2880" w:hanging="480"/>
+        <w:ind w:left="2880" w:hanging="360"/>
       </w:pPr>
     </w:lvl>
     <w:lvl w:ilvl="4">
@@ -1247,7 +1199,7 @@
       <w:lvlText w:val="%5)"/>
       <w:lvlJc w:val="left"/>
       <w:pPr>
-        <w:ind w:left="3600" w:hanging="480"/>
+        <w:ind w:left="3600" w:hanging="360"/>
       </w:pPr>
     </w:lvl>
     <w:lvl w:ilvl="5">
@@ -1256,7 +1208,7 @@
       <w:lvlText w:val="%6)"/>
       <w:lvlJc w:val="left"/>
       <w:pPr>
-        <w:ind w:left="4320" w:hanging="480"/>
+        <w:ind w:left="4320" w:hanging="360"/>
       </w:pPr>
     </w:lvl>
     <w:lvl w:ilvl="6">
@@ -1265,7 +1217,7 @@
       <w:lvlText w:val="%7)"/>
       <w:lvlJc w:val="left"/>
       <w:pPr>
-        <w:ind w:left="5040" w:hanging="480"/>
+        <w:ind w:left="5040" w:hanging="360"/>
       </w:pPr>
     </w:lvl>
     <w:lvl w:ilvl="7">
@@ -1274,7 +1226,7 @@
       <w:lvlText w:val="%8)"/>
       <w:lvlJc w:val="left"/>
       <w:pPr>
-        <w:ind w:left="5760" w:hanging="480"/>
+        <w:ind w:left="5760" w:hanging="360"/>
       </w:pPr>
     </w:lvl>
     <w:lvl w:ilvl="8">
@@ -1283,7 +1235,7 @@
       <w:lvlText w:val="%9)"/>
       <w:lvlJc w:val="left"/>
       <w:pPr>
-        <w:ind w:left="6480" w:hanging="480"/>
+        <w:ind w:left="6480" w:hanging="360"/>
       </w:pPr>
     </w:lvl>
   </w:abstractNum>
@@ -1508,10 +1460,10 @@
   <w:docDefaults>
     <w:rPrDefault>
       <w:rPr>
-        <w:rFonts w:asciiTheme="minorHAnsi" w:cstheme="minorBidi" w:eastAsiaTheme="minorHAnsi" w:hAnsiTheme="minorHAnsi"/>
+        <w:rFonts w:asciiTheme="minorHAnsi" w:cstheme="minorBidi" w:eastAsiaTheme="minorEastAsia" w:hAnsiTheme="minorHAnsi"/>
         <w:sz w:val="24"/>
         <w:szCs w:val="24"/>
-        <w:lang w:bidi="ar-SA" w:eastAsia="en-US" w:val="es-ES"/>
+        <w:lang w:bidi="ar-SA" w:eastAsia="zh-CN" w:val="es-ES"/>
       </w:rPr>
     </w:rPrDefault>
     <w:pPrDefault>
@@ -1552,57 +1504,94 @@
     <w:name w:val="Title"/>
     <w:basedOn w:val="Normal"/>
     <w:next w:val="BodyText"/>
+    <w:link w:val="TitleChar"/>
+    <w:uiPriority w:val="10"/>
     <w:qFormat/>
+    <w:rsid w:val="00A10FD9"/>
     <w:pPr>
-      <w:keepNext/>
-      <w:keepLines/>
-      <w:spacing w:after="240" w:before="480"/>
+      <w:spacing w:after="80" w:line="240" w:lineRule="auto"/>
+      <w:contextualSpacing/>
       <w:jc w:val="center"/>
     </w:pPr>
     <w:rPr>
       <w:rFonts w:asciiTheme="majorHAnsi" w:cstheme="majorBidi" w:eastAsiaTheme="majorEastAsia" w:hAnsiTheme="majorHAnsi"/>
-      <w:b/>
-      <w:bCs/>
-      <w:color w:themeColor="accent1" w:themeShade="B5" w:val="345A8A"/>
-      <w:sz w:val="36"/>
-      <w:szCs w:val="36"/>
+      <w:sz w:val="56"/>
+      <w:szCs w:val="56"/>
+    </w:rPr>
+  </w:style>
+  <w:style w:customStyle="1" w:styleId="TitleChar" w:type="character">
+    <w:name w:val="Title Char"/>
+    <w:basedOn w:val="DefaultParagraphFont"/>
+    <w:link w:val="Title"/>
+    <w:uiPriority w:val="10"/>
+    <w:rsid w:val="00A10FD9"/>
+    <w:rPr>
+      <w:rFonts w:asciiTheme="majorHAnsi" w:cstheme="majorBidi" w:eastAsiaTheme="majorEastAsia" w:hAnsiTheme="majorHAnsi"/>
+      <w:sz w:val="56"/>
+      <w:szCs w:val="56"/>
     </w:rPr>
   </w:style>
   <w:style w:styleId="Subtitle" w:type="paragraph">
     <w:name w:val="Subtitle"/>
+    <w:basedOn w:val="Title"/>
+    <w:next w:val="BodyText"/>
+    <w:link w:val="SubtitleChar"/>
+    <w:uiPriority w:val="11"/>
+    <w:qFormat/>
+    <w:rsid w:val="00A10FD9"/>
+    <w:pPr>
+      <w:numPr>
+        <w:ilvl w:val="1"/>
+      </w:numPr>
+    </w:pPr>
+    <w:rPr>
+      <w:rFonts w:cstheme="majorBidi" w:eastAsiaTheme="majorEastAsia"/>
+      <w:spacing w:val="15"/>
+      <w:sz w:val="28"/>
+      <w:szCs w:val="28"/>
+    </w:rPr>
+  </w:style>
+  <w:style w:customStyle="1" w:styleId="SubtitleChar" w:type="character">
+    <w:name w:val="Subtitle Char"/>
+    <w:basedOn w:val="DefaultParagraphFont"/>
+    <w:link w:val="Subtitle"/>
+    <w:uiPriority w:val="11"/>
+    <w:rsid w:val="00A10FD9"/>
+    <w:rPr>
+      <w:rFonts w:cstheme="majorBidi" w:eastAsiaTheme="majorEastAsia"/>
+      <w:color w:themeColor="text1" w:themeTint="A6" w:val="595959"/>
+      <w:spacing w:val="15"/>
+      <w:sz w:val="28"/>
+      <w:szCs w:val="28"/>
+    </w:rPr>
+  </w:style>
+  <w:style w:customStyle="1" w:styleId="Author" w:type="paragraph">
+    <w:name w:val="Author"/>
     <w:basedOn w:val="Title"/>
     <w:next w:val="BodyText"/>
     <w:qFormat/>
     <w:pPr>
       <w:keepNext/>
       <w:keepLines/>
-      <w:spacing w:after="240" w:before="240"/>
-      <w:jc w:val="center"/>
     </w:pPr>
     <w:rPr>
-      <w:sz w:val="30"/>
-      <w:szCs w:val="30"/>
-    </w:rPr>
-  </w:style>
-  <w:style w:customStyle="1" w:styleId="Author" w:type="paragraph">
-    <w:name w:val="Author"/>
+      <w:sz w:val="24"/>
+      <w:szCs w:val="24"/>
+    </w:rPr>
+  </w:style>
+  <w:style w:styleId="Date" w:type="paragraph">
+    <w:name w:val="Date"/>
+    <w:basedOn w:val="Title"/>
     <w:next w:val="BodyText"/>
     <w:qFormat/>
     <w:pPr>
       <w:keepNext/>
       <w:keepLines/>
-      <w:jc w:val="center"/>
     </w:pPr>
-  </w:style>
-  <w:style w:styleId="Date" w:type="paragraph">
-    <w:name w:val="Date"/>
-    <w:next w:val="BodyText"/>
-    <w:qFormat/>
-    <w:pPr>
-      <w:keepNext/>
-      <w:keepLines/>
-      <w:jc w:val="center"/>
-    </w:pPr>
+    <w:rPr>
+      <w:sz w:val="24"/>
+      <w:szCs w:val="24"/>
+    </w:rPr>
   </w:style>
   <w:style w:customStyle="1" w:styleId="AbstractTitle" w:type="paragraph">
     <w:name w:val="Abstract Title"/>
@@ -1617,7 +1606,6 @@
     </w:pPr>
     <w:rPr>
       <w:b/>
-      <w:color w:val="345A8A"/>
       <w:sz w:val="20"/>
       <w:szCs w:val="20"/>
     </w:rPr>
@@ -1646,191 +1634,321 @@
     <w:rPr/>
   </w:style>
   <w:style w:styleId="Heading1" w:type="paragraph">
-    <w:name w:val="Heading 1"/>
+    <w:name w:val="heading 1"/>
     <w:basedOn w:val="Normal"/>
     <w:next w:val="BodyText"/>
+    <w:link w:val="Heading1Char"/>
     <w:uiPriority w:val="9"/>
     <w:qFormat/>
+    <w:rsid w:val="00A10FD9"/>
     <w:pPr>
       <w:keepNext/>
       <w:keepLines/>
-      <w:spacing w:after="0" w:before="480"/>
+      <w:spacing w:after="80" w:before="360"/>
       <w:outlineLvl w:val="0"/>
     </w:pPr>
     <w:rPr>
       <w:rFonts w:asciiTheme="majorHAnsi" w:cstheme="majorBidi" w:eastAsiaTheme="majorEastAsia" w:hAnsiTheme="majorHAnsi"/>
-      <w:b/>
-      <w:bCs/>
-      <w:color w:themeColor="accent1" w:val="4F81BD"/>
-      <w:sz w:val="32"/>
-      <w:szCs w:val="32"/>
+      <w:color w:themeColor="accent1" w:themeShade="BF" w:val="0F4761"/>
+      <w:sz w:val="40"/>
+      <w:szCs w:val="40"/>
     </w:rPr>
   </w:style>
   <w:style w:styleId="Heading2" w:type="paragraph">
-    <w:name w:val="Heading 2"/>
+    <w:name w:val="heading 2"/>
     <w:basedOn w:val="Normal"/>
     <w:next w:val="BodyText"/>
+    <w:link w:val="Heading2Char"/>
     <w:uiPriority w:val="9"/>
+    <w:semiHidden/>
     <w:unhideWhenUsed/>
     <w:qFormat/>
+    <w:rsid w:val="00A10FD9"/>
     <w:pPr>
       <w:keepNext/>
       <w:keepLines/>
-      <w:spacing w:after="0" w:before="200"/>
+      <w:spacing w:after="80" w:before="160"/>
       <w:outlineLvl w:val="1"/>
     </w:pPr>
     <w:rPr>
       <w:rFonts w:asciiTheme="majorHAnsi" w:cstheme="majorBidi" w:eastAsiaTheme="majorEastAsia" w:hAnsiTheme="majorHAnsi"/>
-      <w:b/>
-      <w:bCs/>
-      <w:color w:themeColor="accent1" w:val="4F81BD"/>
-      <w:sz w:val="28"/>
-      <w:szCs w:val="28"/>
+      <w:color w:themeColor="accent1" w:themeShade="BF" w:val="0F4761"/>
+      <w:sz w:val="32"/>
+      <w:szCs w:val="32"/>
     </w:rPr>
   </w:style>
   <w:style w:styleId="Heading3" w:type="paragraph">
-    <w:name w:val="Heading 3"/>
+    <w:name w:val="heading 3"/>
     <w:basedOn w:val="Normal"/>
     <w:next w:val="BodyText"/>
+    <w:link w:val="Heading3Char"/>
     <w:uiPriority w:val="9"/>
+    <w:semiHidden/>
     <w:unhideWhenUsed/>
     <w:qFormat/>
+    <w:rsid w:val="00A10FD9"/>
     <w:pPr>
       <w:keepNext/>
       <w:keepLines/>
-      <w:spacing w:after="0" w:before="200"/>
+      <w:spacing w:after="80" w:before="160"/>
       <w:outlineLvl w:val="2"/>
     </w:pPr>
     <w:rPr>
-      <w:rFonts w:asciiTheme="majorHAnsi" w:cstheme="majorBidi" w:eastAsiaTheme="majorEastAsia" w:hAnsiTheme="majorHAnsi"/>
-      <w:b/>
-      <w:bCs/>
-      <w:color w:themeColor="accent1" w:val="4F81BD"/>
-      <w:sz w:val="24"/>
-      <w:szCs w:val="24"/>
+      <w:rFonts w:cstheme="majorBidi" w:eastAsiaTheme="majorEastAsia"/>
+      <w:color w:themeColor="accent1" w:themeShade="BF" w:val="0F4761"/>
+      <w:sz w:val="28"/>
+      <w:szCs w:val="28"/>
     </w:rPr>
   </w:style>
   <w:style w:styleId="Heading4" w:type="paragraph">
-    <w:name w:val="Heading 4"/>
+    <w:name w:val="heading 4"/>
     <w:basedOn w:val="Normal"/>
     <w:next w:val="BodyText"/>
+    <w:link w:val="Heading4Char"/>
     <w:uiPriority w:val="9"/>
+    <w:semiHidden/>
     <w:unhideWhenUsed/>
     <w:qFormat/>
+    <w:rsid w:val="00A10FD9"/>
     <w:pPr>
       <w:keepNext/>
       <w:keepLines/>
-      <w:spacing w:after="0" w:before="200"/>
+      <w:spacing w:after="40" w:before="80"/>
       <w:outlineLvl w:val="3"/>
     </w:pPr>
     <w:rPr>
-      <w:rFonts w:asciiTheme="majorHAnsi" w:cstheme="majorBidi" w:eastAsiaTheme="majorEastAsia" w:hAnsiTheme="majorHAnsi"/>
-      <w:bCs/>
+      <w:rFonts w:cstheme="majorBidi" w:eastAsiaTheme="majorEastAsia"/>
       <w:i/>
-      <w:color w:themeColor="accent1" w:val="4F81BD"/>
-      <w:sz w:val="24"/>
-      <w:szCs w:val="24"/>
+      <w:iCs/>
+      <w:color w:themeColor="accent1" w:themeShade="BF" w:val="0F4761"/>
     </w:rPr>
   </w:style>
   <w:style w:styleId="Heading5" w:type="paragraph">
-    <w:name w:val="Heading 5"/>
+    <w:name w:val="heading 5"/>
     <w:basedOn w:val="Normal"/>
     <w:next w:val="BodyText"/>
+    <w:link w:val="Heading5Char"/>
     <w:uiPriority w:val="9"/>
+    <w:semiHidden/>
     <w:unhideWhenUsed/>
     <w:qFormat/>
+    <w:rsid w:val="00A10FD9"/>
     <w:pPr>
       <w:keepNext/>
       <w:keepLines/>
-      <w:spacing w:after="0" w:before="200"/>
+      <w:spacing w:after="40" w:before="80"/>
       <w:outlineLvl w:val="4"/>
     </w:pPr>
     <w:rPr>
-      <w:rFonts w:asciiTheme="majorHAnsi" w:cstheme="majorBidi" w:eastAsiaTheme="majorEastAsia" w:hAnsiTheme="majorHAnsi"/>
-      <w:iCs/>
-      <w:color w:themeColor="accent1" w:val="4F81BD"/>
-      <w:sz w:val="24"/>
-      <w:szCs w:val="24"/>
+      <w:rFonts w:cstheme="majorBidi" w:eastAsiaTheme="majorEastAsia"/>
+      <w:color w:themeColor="accent1" w:themeShade="BF" w:val="0F4761"/>
     </w:rPr>
   </w:style>
   <w:style w:styleId="Heading6" w:type="paragraph">
-    <w:name w:val="Heading 6"/>
+    <w:name w:val="heading 6"/>
     <w:basedOn w:val="Normal"/>
     <w:next w:val="BodyText"/>
+    <w:link w:val="Heading6Char"/>
     <w:uiPriority w:val="9"/>
+    <w:semiHidden/>
     <w:unhideWhenUsed/>
     <w:qFormat/>
+    <w:rsid w:val="00A10FD9"/>
     <w:pPr>
       <w:keepNext/>
       <w:keepLines/>
-      <w:spacing w:after="0" w:before="200"/>
+      <w:spacing w:after="0" w:before="40"/>
       <w:outlineLvl w:val="5"/>
     </w:pPr>
     <w:rPr>
-      <w:rFonts w:asciiTheme="majorHAnsi" w:cstheme="majorBidi" w:eastAsiaTheme="majorEastAsia" w:hAnsiTheme="majorHAnsi"/>
-      <w:color w:themeColor="accent1" w:val="4F81BD"/>
-      <w:sz w:val="24"/>
-      <w:szCs w:val="24"/>
+      <w:rFonts w:cstheme="majorBidi" w:eastAsiaTheme="majorEastAsia"/>
+      <w:i/>
+      <w:iCs/>
+      <w:color w:themeColor="text1" w:themeTint="A6" w:val="595959"/>
     </w:rPr>
   </w:style>
   <w:style w:styleId="Heading7" w:type="paragraph">
-    <w:name w:val="Heading 7"/>
+    <w:name w:val="heading 7"/>
     <w:basedOn w:val="Normal"/>
     <w:next w:val="BodyText"/>
+    <w:link w:val="Heading7Char"/>
     <w:uiPriority w:val="9"/>
+    <w:semiHidden/>
     <w:unhideWhenUsed/>
     <w:qFormat/>
+    <w:rsid w:val="00A10FD9"/>
     <w:pPr>
       <w:keepNext/>
       <w:keepLines/>
-      <w:spacing w:after="0" w:before="200"/>
+      <w:spacing w:after="0" w:before="40"/>
       <w:outlineLvl w:val="6"/>
     </w:pPr>
     <w:rPr>
-      <w:rFonts w:asciiTheme="majorHAnsi" w:cstheme="majorBidi" w:eastAsiaTheme="majorEastAsia" w:hAnsiTheme="majorHAnsi"/>
-      <w:color w:themeColor="accent1" w:val="4F81BD"/>
-      <w:sz w:val="24"/>
-      <w:szCs w:val="24"/>
+      <w:rFonts w:cstheme="majorBidi" w:eastAsiaTheme="majorEastAsia"/>
+      <w:color w:themeColor="text1" w:themeTint="A6" w:val="595959"/>
     </w:rPr>
   </w:style>
   <w:style w:styleId="Heading8" w:type="paragraph">
-    <w:name w:val="Heading 8"/>
+    <w:name w:val="heading 8"/>
     <w:basedOn w:val="Normal"/>
     <w:next w:val="BodyText"/>
+    <w:link w:val="Heading8Char"/>
     <w:uiPriority w:val="9"/>
+    <w:semiHidden/>
     <w:unhideWhenUsed/>
     <w:qFormat/>
+    <w:rsid w:val="00A10FD9"/>
     <w:pPr>
       <w:keepNext/>
       <w:keepLines/>
-      <w:spacing w:after="0" w:before="200"/>
+      <w:spacing w:after="0"/>
       <w:outlineLvl w:val="7"/>
     </w:pPr>
     <w:rPr>
-      <w:rFonts w:asciiTheme="majorHAnsi" w:cstheme="majorBidi" w:eastAsiaTheme="majorEastAsia" w:hAnsiTheme="majorHAnsi"/>
-      <w:color w:themeColor="accent1" w:val="4F81BD"/>
-      <w:sz w:val="24"/>
-      <w:szCs w:val="24"/>
+      <w:rFonts w:cstheme="majorBidi" w:eastAsiaTheme="majorEastAsia"/>
+      <w:i/>
+      <w:iCs/>
+      <w:color w:themeColor="text1" w:themeTint="D8" w:val="272727"/>
     </w:rPr>
   </w:style>
   <w:style w:styleId="Heading9" w:type="paragraph">
-    <w:name w:val="Heading 9"/>
+    <w:name w:val="heading 9"/>
     <w:basedOn w:val="Normal"/>
     <w:next w:val="BodyText"/>
+    <w:link w:val="Heading9Char"/>
     <w:uiPriority w:val="9"/>
+    <w:semiHidden/>
     <w:unhideWhenUsed/>
     <w:qFormat/>
+    <w:rsid w:val="00A10FD9"/>
     <w:pPr>
       <w:keepNext/>
       <w:keepLines/>
-      <w:spacing w:after="0" w:before="200"/>
+      <w:spacing w:after="0"/>
       <w:outlineLvl w:val="8"/>
     </w:pPr>
     <w:rPr>
+      <w:rFonts w:cstheme="majorBidi" w:eastAsiaTheme="majorEastAsia"/>
+      <w:color w:themeColor="text1" w:themeTint="D8" w:val="272727"/>
+    </w:rPr>
+  </w:style>
+  <w:style w:customStyle="1" w:styleId="Heading1Char" w:type="character">
+    <w:name w:val="Heading 1 Char"/>
+    <w:basedOn w:val="DefaultParagraphFont"/>
+    <w:link w:val="Heading1"/>
+    <w:uiPriority w:val="9"/>
+    <w:rsid w:val="00A10FD9"/>
+    <w:rPr>
       <w:rFonts w:asciiTheme="majorHAnsi" w:cstheme="majorBidi" w:eastAsiaTheme="majorEastAsia" w:hAnsiTheme="majorHAnsi"/>
-      <w:color w:themeColor="accent1" w:val="4F81BD"/>
-      <w:sz w:val="24"/>
-      <w:szCs w:val="24"/>
+      <w:color w:themeColor="accent1" w:themeShade="BF" w:val="0F4761"/>
+      <w:sz w:val="40"/>
+      <w:szCs w:val="40"/>
+    </w:rPr>
+  </w:style>
+  <w:style w:customStyle="1" w:styleId="Heading2Char" w:type="character">
+    <w:name w:val="Heading 2 Char"/>
+    <w:basedOn w:val="DefaultParagraphFont"/>
+    <w:link w:val="Heading2"/>
+    <w:uiPriority w:val="9"/>
+    <w:semiHidden/>
+    <w:rsid w:val="00A10FD9"/>
+    <w:rPr>
+      <w:rFonts w:asciiTheme="majorHAnsi" w:cstheme="majorBidi" w:eastAsiaTheme="majorEastAsia" w:hAnsiTheme="majorHAnsi"/>
+      <w:color w:themeColor="accent1" w:themeShade="BF" w:val="0F4761"/>
+      <w:sz w:val="32"/>
+      <w:szCs w:val="32"/>
+    </w:rPr>
+  </w:style>
+  <w:style w:customStyle="1" w:styleId="Heading3Char" w:type="character">
+    <w:name w:val="Heading 3 Char"/>
+    <w:basedOn w:val="DefaultParagraphFont"/>
+    <w:link w:val="Heading3"/>
+    <w:uiPriority w:val="9"/>
+    <w:semiHidden/>
+    <w:rsid w:val="00A10FD9"/>
+    <w:rPr>
+      <w:rFonts w:cstheme="majorBidi" w:eastAsiaTheme="majorEastAsia"/>
+      <w:color w:themeColor="accent1" w:themeShade="BF" w:val="0F4761"/>
+      <w:sz w:val="28"/>
+      <w:szCs w:val="28"/>
+    </w:rPr>
+  </w:style>
+  <w:style w:customStyle="1" w:styleId="Heading4Char" w:type="character">
+    <w:name w:val="Heading 4 Char"/>
+    <w:basedOn w:val="DefaultParagraphFont"/>
+    <w:link w:val="Heading4"/>
+    <w:uiPriority w:val="9"/>
+    <w:semiHidden/>
+    <w:rsid w:val="00A10FD9"/>
+    <w:rPr>
+      <w:rFonts w:cstheme="majorBidi" w:eastAsiaTheme="majorEastAsia"/>
+      <w:i/>
+      <w:iCs/>
+      <w:color w:themeColor="accent1" w:themeShade="BF" w:val="0F4761"/>
+    </w:rPr>
+  </w:style>
+  <w:style w:customStyle="1" w:styleId="Heading5Char" w:type="character">
+    <w:name w:val="Heading 5 Char"/>
+    <w:basedOn w:val="DefaultParagraphFont"/>
+    <w:link w:val="Heading5"/>
+    <w:uiPriority w:val="9"/>
+    <w:semiHidden/>
+    <w:rsid w:val="00A10FD9"/>
+    <w:rPr>
+      <w:rFonts w:cstheme="majorBidi" w:eastAsiaTheme="majorEastAsia"/>
+      <w:color w:themeColor="accent1" w:themeShade="BF" w:val="0F4761"/>
+    </w:rPr>
+  </w:style>
+  <w:style w:customStyle="1" w:styleId="Heading6Char" w:type="character">
+    <w:name w:val="Heading 6 Char"/>
+    <w:basedOn w:val="DefaultParagraphFont"/>
+    <w:link w:val="Heading6"/>
+    <w:uiPriority w:val="9"/>
+    <w:semiHidden/>
+    <w:rsid w:val="00A10FD9"/>
+    <w:rPr>
+      <w:rFonts w:cstheme="majorBidi" w:eastAsiaTheme="majorEastAsia"/>
+      <w:i/>
+      <w:iCs/>
+      <w:color w:themeColor="text1" w:themeTint="A6" w:val="595959"/>
+    </w:rPr>
+  </w:style>
+  <w:style w:customStyle="1" w:styleId="Heading7Char" w:type="character">
+    <w:name w:val="Heading 7 Char"/>
+    <w:basedOn w:val="DefaultParagraphFont"/>
+    <w:link w:val="Heading7"/>
+    <w:uiPriority w:val="9"/>
+    <w:semiHidden/>
+    <w:rsid w:val="00A10FD9"/>
+    <w:rPr>
+      <w:rFonts w:cstheme="majorBidi" w:eastAsiaTheme="majorEastAsia"/>
+      <w:color w:themeColor="text1" w:themeTint="A6" w:val="595959"/>
+    </w:rPr>
+  </w:style>
+  <w:style w:customStyle="1" w:styleId="Heading8Char" w:type="character">
+    <w:name w:val="Heading 8 Char"/>
+    <w:basedOn w:val="DefaultParagraphFont"/>
+    <w:link w:val="Heading8"/>
+    <w:uiPriority w:val="9"/>
+    <w:semiHidden/>
+    <w:rsid w:val="00A10FD9"/>
+    <w:rPr>
+      <w:rFonts w:cstheme="majorBidi" w:eastAsiaTheme="majorEastAsia"/>
+      <w:i/>
+      <w:iCs/>
+      <w:color w:themeColor="text1" w:themeTint="D8" w:val="272727"/>
+    </w:rPr>
+  </w:style>
+  <w:style w:customStyle="1" w:styleId="Heading9Char" w:type="character">
+    <w:name w:val="Heading 9 Char"/>
+    <w:basedOn w:val="DefaultParagraphFont"/>
+    <w:link w:val="Heading9"/>
+    <w:uiPriority w:val="9"/>
+    <w:semiHidden/>
+    <w:rsid w:val="00A10FD9"/>
+    <w:rPr>
+      <w:rFonts w:cstheme="majorBidi" w:eastAsiaTheme="majorEastAsia"/>
+      <w:color w:themeColor="text1" w:themeTint="D8" w:val="272727"/>
     </w:rPr>
   </w:style>
   <w:style w:styleId="BlockText" w:type="paragraph">
@@ -1855,8 +1973,8 @@
   </w:style>
   <w:style w:styleId="FootnoteBlockText" w:type="paragraph">
     <w:name w:val="Footnote Block Text"/>
-    <w:basedOn w:val="Footnote Text"/>
-    <w:next w:val="Footnote Text"/>
+    <w:basedOn w:val="FootnoteText"/>
+    <w:next w:val="FootnoteText"/>
     <w:uiPriority w:val="9"/>
     <w:unhideWhenUsed/>
     <w:qFormat/>
@@ -1886,13 +2004,6 @@
       </w:tblCellMar>
     </w:tblPr>
     <w:tblStylePr w:type="firstRow">
-      <w:tblPr>
-        <w:jc w:val="left"/>
-        <w:tblInd w:type="dxa" w:w="0"/>
-      </w:tblPr>
-      <w:trPr>
-        <w:jc w:val="left"/>
-      </w:trPr>
       <w:tcPr>
         <w:tcBorders>
           <w:bottom w:val="single"/>
@@ -2248,44 +2359,44 @@
         <a:sysClr val="window" lastClr="FFFFFF"/>
       </a:lt1>
       <a:dk2>
-        <a:srgbClr val="1F497D"/>
+        <a:srgbClr val="0E2841"/>
       </a:dk2>
       <a:lt2>
-        <a:srgbClr val="EEECE1"/>
+        <a:srgbClr val="E8E8E8"/>
       </a:lt2>
       <a:accent1>
-        <a:srgbClr val="4F81BD"/>
+        <a:srgbClr val="156082"/>
       </a:accent1>
       <a:accent2>
-        <a:srgbClr val="C0504D"/>
+        <a:srgbClr val="E97132"/>
       </a:accent2>
       <a:accent3>
-        <a:srgbClr val="9BBB59"/>
+        <a:srgbClr val="196B24"/>
       </a:accent3>
       <a:accent4>
-        <a:srgbClr val="8064A2"/>
+        <a:srgbClr val="0F9ED5"/>
       </a:accent4>
       <a:accent5>
-        <a:srgbClr val="4BACC6"/>
+        <a:srgbClr val="A02B93"/>
       </a:accent5>
       <a:accent6>
-        <a:srgbClr val="F79646"/>
+        <a:srgbClr val="4EA72E"/>
       </a:accent6>
       <a:hlink>
-        <a:srgbClr val="0000FF"/>
+        <a:srgbClr val="467886"/>
       </a:hlink>
       <a:folHlink>
-        <a:srgbClr val="800080"/>
+        <a:srgbClr val="96607D"/>
       </a:folHlink>
     </a:clrScheme>
     <a:fontScheme name="Office">
       <a:majorFont>
-        <a:latin typeface="Calibri"/>
+        <a:latin typeface="Aptos Display" panose="02110004020202020204"/>
         <a:ea typeface=""/>
         <a:cs typeface=""/>
-        <a:font script="Jpan" typeface="ＭＳ ゴシック"/>
+        <a:font script="Jpan" typeface="游ゴシック Light"/>
         <a:font script="Hang" typeface="맑은 고딕"/>
-        <a:font script="Hans" typeface="宋体"/>
+        <a:font script="Hans" typeface="等线 Light"/>
         <a:font script="Hant" typeface="新細明體"/>
         <a:font script="Arab" typeface="Times New Roman"/>
         <a:font script="Hebr" typeface="Times New Roman"/>
@@ -2312,14 +2423,32 @@
         <a:font script="Mong" typeface="Mongolian Baiti"/>
         <a:font script="Viet" typeface="Times New Roman"/>
         <a:font script="Uigh" typeface="Microsoft Uighur"/>
+        <a:font script="Geor" typeface="Sylfaen"/>
+        <a:font script="Armn" typeface="Arial"/>
+        <a:font script="Bugi" typeface="Leelawadee UI"/>
+        <a:font script="Bopo" typeface="Microsoft JhengHei"/>
+        <a:font script="Java" typeface="Javanese Text"/>
+        <a:font script="Lisu" typeface="Segoe UI"/>
+        <a:font script="Mymr" typeface="Myanmar Text"/>
+        <a:font script="Nkoo" typeface="Ebrima"/>
+        <a:font script="Olck" typeface="Nirmala UI"/>
+        <a:font script="Osma" typeface="Ebrima"/>
+        <a:font script="Phag" typeface="Phagspa"/>
+        <a:font script="Syrn" typeface="Estrangelo Edessa"/>
+        <a:font script="Syrj" typeface="Estrangelo Edessa"/>
+        <a:font script="Syre" typeface="Estrangelo Edessa"/>
+        <a:font script="Sora" typeface="Nirmala UI"/>
+        <a:font script="Tale" typeface="Microsoft Tai Le"/>
+        <a:font script="Talu" typeface="Microsoft New Tai Lue"/>
+        <a:font script="Tfng" typeface="Ebrima"/>
       </a:majorFont>
       <a:minorFont>
-        <a:latin typeface="Cambria"/>
+        <a:latin typeface="Aptos" panose="02110004020202020204"/>
         <a:ea typeface=""/>
         <a:cs typeface=""/>
-        <a:font script="Jpan" typeface="ＭＳ 明朝"/>
+        <a:font script="Jpan" typeface="游明朝"/>
         <a:font script="Hang" typeface="맑은 고딕"/>
-        <a:font script="Hans" typeface="宋体"/>
+        <a:font script="Hans" typeface="等线"/>
         <a:font script="Hant" typeface="新細明體"/>
         <a:font script="Arab" typeface="Arial"/>
         <a:font script="Hebr" typeface="Arial"/>
@@ -2346,6 +2475,24 @@
         <a:font script="Mong" typeface="Mongolian Baiti"/>
         <a:font script="Viet" typeface="Arial"/>
         <a:font script="Uigh" typeface="Microsoft Uighur"/>
+        <a:font script="Geor" typeface="Sylfaen"/>
+        <a:font script="Armn" typeface="Arial"/>
+        <a:font script="Bugi" typeface="Leelawadee UI"/>
+        <a:font script="Bopo" typeface="Microsoft JhengHei"/>
+        <a:font script="Java" typeface="Javanese Text"/>
+        <a:font script="Lisu" typeface="Segoe UI"/>
+        <a:font script="Mymr" typeface="Myanmar Text"/>
+        <a:font script="Nkoo" typeface="Ebrima"/>
+        <a:font script="Olck" typeface="Nirmala UI"/>
+        <a:font script="Osma" typeface="Ebrima"/>
+        <a:font script="Phag" typeface="Phagspa"/>
+        <a:font script="Syrn" typeface="Estrangelo Edessa"/>
+        <a:font script="Syrj" typeface="Estrangelo Edessa"/>
+        <a:font script="Syre" typeface="Estrangelo Edessa"/>
+        <a:font script="Sora" typeface="Nirmala UI"/>
+        <a:font script="Tale" typeface="Microsoft Tai Le"/>
+        <a:font script="Talu" typeface="Microsoft New Tai Lue"/>
+        <a:font script="Tfng" typeface="Ebrima"/>
       </a:minorFont>
     </a:fontScheme>
     <a:fmtScheme name="Office">
@@ -2357,200 +2504,141 @@
           <a:gsLst>
             <a:gs pos="0">
               <a:schemeClr val="phClr">
-                <a:tint val="50000"/>
-                <a:satMod val="300000"/>
+                <a:lumMod val="110000"/>
+                <a:satMod val="105000"/>
+                <a:tint val="67000"/>
               </a:schemeClr>
             </a:gs>
-            <a:gs pos="35000">
+            <a:gs pos="50000">
               <a:schemeClr val="phClr">
-                <a:tint val="37000"/>
-                <a:satMod val="300000"/>
+                <a:lumMod val="105000"/>
+                <a:satMod val="103000"/>
+                <a:tint val="73000"/>
               </a:schemeClr>
             </a:gs>
             <a:gs pos="100000">
               <a:schemeClr val="phClr">
-                <a:tint val="15000"/>
-                <a:satMod val="350000"/>
+                <a:lumMod val="105000"/>
+                <a:satMod val="109000"/>
+                <a:tint val="81000"/>
               </a:schemeClr>
             </a:gs>
           </a:gsLst>
-          <a:lin ang="16200000" scaled="1"/>
+          <a:lin ang="5400000" scaled="0"/>
         </a:gradFill>
         <a:gradFill rotWithShape="1">
           <a:gsLst>
             <a:gs pos="0">
               <a:schemeClr val="phClr">
-                <a:tint val="100000"/>
+                <a:satMod val="103000"/>
+                <a:lumMod val="102000"/>
+                <a:tint val="94000"/>
+              </a:schemeClr>
+            </a:gs>
+            <a:gs pos="50000">
+              <a:schemeClr val="phClr">
+                <a:satMod val="110000"/>
+                <a:lumMod val="100000"/>
                 <a:shade val="100000"/>
-                <a:satMod val="130000"/>
               </a:schemeClr>
             </a:gs>
             <a:gs pos="100000">
               <a:schemeClr val="phClr">
-                <a:tint val="50000"/>
-                <a:shade val="100000"/>
-                <a:satMod val="350000"/>
+                <a:lumMod val="99000"/>
+                <a:satMod val="120000"/>
+                <a:shade val="78000"/>
               </a:schemeClr>
             </a:gs>
           </a:gsLst>
-          <a:lin ang="16200000" scaled="0"/>
+          <a:lin ang="5400000" scaled="0"/>
         </a:gradFill>
       </a:fillStyleLst>
       <a:lnStyleLst>
-        <a:ln w="9525" cap="flat" cmpd="sng" algn="ctr">
-          <a:solidFill>
-            <a:schemeClr val="phClr">
-              <a:shade val="95000"/>
-              <a:satMod val="105000"/>
-            </a:schemeClr>
-          </a:solidFill>
-          <a:prstDash val="solid"/>
-        </a:ln>
-        <a:ln w="25400" cap="flat" cmpd="sng" algn="ctr">
+        <a:ln w="6350" cap="flat" cmpd="sng" algn="ctr">
           <a:solidFill>
             <a:schemeClr val="phClr"/>
           </a:solidFill>
           <a:prstDash val="solid"/>
+          <a:miter lim="800000"/>
         </a:ln>
-        <a:ln w="38100" cap="flat" cmpd="sng" algn="ctr">
+        <a:ln w="12700" cap="flat" cmpd="sng" algn="ctr">
           <a:solidFill>
             <a:schemeClr val="phClr"/>
           </a:solidFill>
           <a:prstDash val="solid"/>
+          <a:miter lim="800000"/>
+        </a:ln>
+        <a:ln w="19050" cap="flat" cmpd="sng" algn="ctr">
+          <a:solidFill>
+            <a:schemeClr val="phClr"/>
+          </a:solidFill>
+          <a:prstDash val="solid"/>
+          <a:miter lim="800000"/>
         </a:ln>
       </a:lnStyleLst>
       <a:effectStyleLst>
         <a:effectStyle>
+          <a:effectLst/>
+        </a:effectStyle>
+        <a:effectStyle>
+          <a:effectLst/>
+        </a:effectStyle>
+        <a:effectStyle>
           <a:effectLst>
-            <a:outerShdw blurRad="40000" dist="20000" dir="5400000" rotWithShape="0">
+            <a:outerShdw blurRad="57150" dist="19050" dir="5400000" algn="ctr" rotWithShape="0">
               <a:srgbClr val="000000">
-                <a:alpha val="38000"/>
+                <a:alpha val="63000"/>
               </a:srgbClr>
             </a:outerShdw>
           </a:effectLst>
-        </a:effectStyle>
-        <a:effectStyle>
-          <a:effectLst>
-            <a:outerShdw blurRad="40000" dist="23000" dir="5400000" rotWithShape="0">
-              <a:srgbClr val="000000">
-                <a:alpha val="35000"/>
-              </a:srgbClr>
-            </a:outerShdw>
-          </a:effectLst>
-        </a:effectStyle>
-        <a:effectStyle>
-          <a:effectLst>
-            <a:outerShdw blurRad="40000" dist="23000" dir="5400000" rotWithShape="0">
-              <a:srgbClr val="000000">
-                <a:alpha val="35000"/>
-              </a:srgbClr>
-            </a:outerShdw>
-          </a:effectLst>
-          <a:scene3d>
-            <a:camera prst="orthographicFront">
-              <a:rot lat="0" lon="0" rev="0"/>
-            </a:camera>
-            <a:lightRig rig="threePt" dir="t">
-              <a:rot lat="0" lon="0" rev="1200000"/>
-            </a:lightRig>
-          </a:scene3d>
-          <a:sp3d>
-            <a:bevelT w="63500" h="25400"/>
-          </a:sp3d>
         </a:effectStyle>
       </a:effectStyleLst>
       <a:bgFillStyleLst>
         <a:solidFill>
           <a:schemeClr val="phClr"/>
         </a:solidFill>
+        <a:solidFill>
+          <a:schemeClr val="phClr">
+            <a:tint val="95000"/>
+            <a:satMod val="170000"/>
+          </a:schemeClr>
+        </a:solidFill>
         <a:gradFill rotWithShape="1">
           <a:gsLst>
             <a:gs pos="0">
               <a:schemeClr val="phClr">
-                <a:tint val="40000"/>
-                <a:satMod val="350000"/>
+                <a:tint val="93000"/>
+                <a:satMod val="150000"/>
+                <a:shade val="98000"/>
+                <a:lumMod val="102000"/>
               </a:schemeClr>
             </a:gs>
-            <a:gs pos="40000">
+            <a:gs pos="50000">
               <a:schemeClr val="phClr">
-                <a:tint val="45000"/>
-                <a:shade val="99000"/>
-                <a:satMod val="350000"/>
+                <a:tint val="98000"/>
+                <a:satMod val="130000"/>
+                <a:shade val="90000"/>
+                <a:lumMod val="103000"/>
               </a:schemeClr>
             </a:gs>
             <a:gs pos="100000">
               <a:schemeClr val="phClr">
-                <a:shade val="20000"/>
-                <a:satMod val="255000"/>
+                <a:shade val="63000"/>
+                <a:satMod val="120000"/>
               </a:schemeClr>
             </a:gs>
           </a:gsLst>
-          <a:path path="circle">
-            <a:fillToRect l="50000" t="-80000" r="50000" b="180000"/>
-          </a:path>
-        </a:gradFill>
-        <a:gradFill rotWithShape="1">
-          <a:gsLst>
-            <a:gs pos="0">
-              <a:schemeClr val="phClr">
-                <a:tint val="80000"/>
-                <a:satMod val="300000"/>
-              </a:schemeClr>
-            </a:gs>
-            <a:gs pos="100000">
-              <a:schemeClr val="phClr">
-                <a:shade val="30000"/>
-                <a:satMod val="200000"/>
-              </a:schemeClr>
-            </a:gs>
-          </a:gsLst>
-          <a:path path="circle">
-            <a:fillToRect l="50000" t="50000" r="50000" b="50000"/>
-          </a:path>
+          <a:lin ang="5400000" scaled="0"/>
         </a:gradFill>
       </a:bgFillStyleLst>
     </a:fmtScheme>
   </a:themeElements>
-  <a:objectDefaults>
-    <a:spDef>
-      <a:spPr/>
-      <a:bodyPr/>
-      <a:lstStyle/>
-      <a:style>
-        <a:lnRef idx="1">
-          <a:schemeClr val="accent1"/>
-        </a:lnRef>
-        <a:fillRef idx="3">
-          <a:schemeClr val="accent1"/>
-        </a:fillRef>
-        <a:effectRef idx="2">
-          <a:schemeClr val="accent1"/>
-        </a:effectRef>
-        <a:fontRef idx="minor">
-          <a:schemeClr val="lt1"/>
-        </a:fontRef>
-      </a:style>
-    </a:spDef>
-    <a:lnDef>
-      <a:spPr/>
-      <a:bodyPr/>
-      <a:lstStyle/>
-      <a:style>
-        <a:lnRef idx="2">
-          <a:schemeClr val="accent1"/>
-        </a:lnRef>
-        <a:fillRef idx="0">
-          <a:schemeClr val="accent1"/>
-        </a:fillRef>
-        <a:effectRef idx="1">
-          <a:schemeClr val="accent1"/>
-        </a:effectRef>
-        <a:fontRef idx="minor">
-          <a:schemeClr val="tx1"/>
-        </a:fontRef>
-      </a:style>
-    </a:lnDef>
-  </a:objectDefaults>
+  <a:objectDefaults/>
   <a:extraClrSchemeLst/>
+  <a:extLst>
+    <a:ext uri="{05A4C25C-085E-4340-85A3-A5531E510DB2}">
+      <thm15:themeFamily xmlns:thm15="http://schemas.microsoft.com/office/thememl/2012/main" name="Office Theme" id="{2E142A2C-CD16-42D6-873A-C26D2A0506FA}" vid="{1BDDFF52-6CD6-40A5-AB3C-68EB2F1E4D0A}"/>
+    </a:ext>
+  </a:extLst>
 </a:theme>
 </file>
</xml_diff>